<commit_message>
docs: drop inline bold + colored text in proposal renderers
Per request, both _md_to_pdf.py and _md_to_docx.py now render a cleaner doc:
inline **bold** -> normal weight (italic kept), all text black, headings
black+bold (size hierarchy only), plain light-grey table header, no zebra
striping. Regenerated all four outputs (formal + plain, pdf + docx).

Co-Authored-By: Claude Opus 4.8 (1M context) <noreply@anthropic.com>
</commit_message>
<xml_diff>
--- a/barlow/docs/finesst_proposal.docx
+++ b/barlow/docs/finesst_proposal.docx
@@ -8,7 +8,6 @@
           <w:rFonts w:ascii="Calibri" w:hAnsi="Calibri"/>
           <w:b/>
           <w:i w:val="0"/>
-          <w:color w:val="1F3864"/>
           <w:sz w:val="36"/>
         </w:rPr>
         <w:t>From Detection to Attribution: Physically-Coupled, Cross-Domain Monitoring of Ephemeral-Channel Geomorphic Change from Terrain Alone</w:t>
@@ -22,7 +21,7 @@
       <w:r>
         <w:rPr>
           <w:rFonts w:ascii="Calibri" w:hAnsi="Calibri"/>
-          <w:b/>
+          <w:b w:val="0"/>
           <w:i/>
           <w:color w:val="666666"/>
           <w:sz w:val="18"/>
@@ -37,7 +36,7 @@
       <w:r>
         <w:rPr>
           <w:rFonts w:ascii="Calibri" w:hAnsi="Calibri"/>
-          <w:b/>
+          <w:b w:val="0"/>
           <w:i w:val="0"/>
         </w:rPr>
         <w:t>Target division:</w:t>
@@ -53,7 +52,7 @@
       <w:r>
         <w:rPr>
           <w:rFonts w:ascii="Calibri" w:hAnsi="Calibri"/>
-          <w:b/>
+          <w:b w:val="0"/>
           <w:i w:val="0"/>
         </w:rPr>
         <w:t>Proposal deadline:</w:t>
@@ -69,7 +68,7 @@
       <w:r>
         <w:rPr>
           <w:rFonts w:ascii="Calibri" w:hAnsi="Calibri"/>
-          <w:b/>
+          <w:b w:val="0"/>
           <w:i w:val="0"/>
         </w:rPr>
         <w:t>Structure:</w:t>
@@ -91,9 +90,8 @@
       <w:r>
         <w:rPr>
           <w:rFonts w:ascii="Calibri" w:hAnsi="Calibri"/>
-          <w:b/>
+          <w:b w:val="0"/>
           <w:i w:val="0"/>
-          <w:color w:val="666666"/>
           <w:sz w:val="20"/>
         </w:rPr>
         <w:t>Summary.</w:t>
@@ -103,7 +101,6 @@
           <w:rFonts w:ascii="Calibri" w:hAnsi="Calibri"/>
           <w:b w:val="0"/>
           <w:i w:val="0"/>
-          <w:color w:val="666666"/>
           <w:sz w:val="20"/>
         </w:rPr>
         <w:t xml:space="preserve"> This project will transform an existing Antarctic stream-change </w:t>
@@ -113,7 +110,6 @@
           <w:rFonts w:ascii="Calibri" w:hAnsi="Calibri"/>
           <w:b w:val="0"/>
           <w:i/>
-          <w:color w:val="666666"/>
           <w:sz w:val="20"/>
         </w:rPr>
         <w:t>monitor</w:t>
@@ -123,7 +119,6 @@
           <w:rFonts w:ascii="Calibri" w:hAnsi="Calibri"/>
           <w:b w:val="0"/>
           <w:i w:val="0"/>
-          <w:color w:val="666666"/>
           <w:sz w:val="20"/>
         </w:rPr>
         <w:t xml:space="preserve"> into an </w:t>
@@ -133,7 +128,6 @@
           <w:rFonts w:ascii="Calibri" w:hAnsi="Calibri"/>
           <w:b w:val="0"/>
           <w:i/>
-          <w:color w:val="666666"/>
           <w:sz w:val="20"/>
         </w:rPr>
         <w:t>explanatory and predictive</w:t>
@@ -143,7 +137,6 @@
           <w:rFonts w:ascii="Calibri" w:hAnsi="Calibri"/>
           <w:b w:val="0"/>
           <w:i w:val="0"/>
-          <w:color w:val="666666"/>
           <w:sz w:val="20"/>
         </w:rPr>
         <w:t xml:space="preserve"> tool. Building on Barlow (2026) — which mapped two decades of ephemeral-channel geomorphic change across the McMurdo Dry Valleys — the proposed work will </w:t>
@@ -151,9 +144,8 @@
       <w:r>
         <w:rPr>
           <w:rFonts w:ascii="Calibri" w:hAnsi="Calibri"/>
-          <w:b/>
+          <w:b w:val="0"/>
           <w:i w:val="0"/>
-          <w:color w:val="666666"/>
           <w:sz w:val="20"/>
         </w:rPr>
         <w:t>(O1)</w:t>
@@ -163,7 +155,6 @@
           <w:rFonts w:ascii="Calibri" w:hAnsi="Calibri"/>
           <w:b w:val="0"/>
           <w:i w:val="0"/>
-          <w:color w:val="666666"/>
           <w:sz w:val="20"/>
         </w:rPr>
         <w:t xml:space="preserve"> attribute that change to its physical/climate drivers, </w:t>
@@ -171,9 +162,8 @@
       <w:r>
         <w:rPr>
           <w:rFonts w:ascii="Calibri" w:hAnsi="Calibri"/>
-          <w:b/>
+          <w:b w:val="0"/>
           <w:i w:val="0"/>
-          <w:color w:val="666666"/>
           <w:sz w:val="20"/>
         </w:rPr>
         <w:t>(O2)</w:t>
@@ -183,7 +173,6 @@
           <w:rFonts w:ascii="Calibri" w:hAnsi="Calibri"/>
           <w:b w:val="0"/>
           <w:i w:val="0"/>
-          <w:color w:val="666666"/>
           <w:sz w:val="20"/>
         </w:rPr>
         <w:t xml:space="preserve"> generalize the terrain-only detector across sensors and valleys, and </w:t>
@@ -191,9 +180,8 @@
       <w:r>
         <w:rPr>
           <w:rFonts w:ascii="Calibri" w:hAnsi="Calibri"/>
-          <w:b/>
+          <w:b w:val="0"/>
           <w:i w:val="0"/>
-          <w:color w:val="666666"/>
           <w:sz w:val="20"/>
         </w:rPr>
         <w:t>(O3)</w:t>
@@ -203,7 +191,6 @@
           <w:rFonts w:ascii="Calibri" w:hAnsi="Calibri"/>
           <w:b w:val="0"/>
           <w:i w:val="0"/>
-          <w:color w:val="666666"/>
           <w:sz w:val="20"/>
         </w:rPr>
         <w:t xml:space="preserve"> deliver calibrated per-pixel uncertainty. Preliminary studies by the Future Investigator (§4) have reproduced and validated the parent change-detection pipeline and surfaced a first attribution signal, establishing feasibility and readiness to execute the proposed research.</w:t>
@@ -225,7 +212,6 @@
           <w:rFonts w:ascii="Calibri" w:hAnsi="Calibri"/>
           <w:b/>
           <w:i w:val="0"/>
-          <w:color w:val="2E5496"/>
           <w:sz w:val="24"/>
         </w:rPr>
         <w:t>1. Background and the Gap</w:t>
@@ -246,7 +232,7 @@
       <w:r>
         <w:rPr>
           <w:rFonts w:ascii="Calibri" w:hAnsi="Calibri"/>
-          <w:b/>
+          <w:b w:val="0"/>
           <w:i w:val="0"/>
         </w:rPr>
         <w:t>McMurdo Dry Valleys (MDVs)</w:t>
@@ -262,7 +248,7 @@
       <w:r>
         <w:rPr>
           <w:rFonts w:ascii="Calibri" w:hAnsi="Calibri"/>
-          <w:b/>
+          <w:b w:val="0"/>
           <w:i w:val="0"/>
         </w:rPr>
         <w:t>ephemeral summer streams</w:t>
@@ -283,7 +269,7 @@
       <w:r>
         <w:rPr>
           <w:rFonts w:ascii="Calibri" w:hAnsi="Calibri"/>
-          <w:b/>
+          <w:b w:val="0"/>
           <w:i w:val="0"/>
         </w:rPr>
         <w:t>Barlow (2026)</w:t>
@@ -312,7 +298,7 @@
       <w:r>
         <w:rPr>
           <w:rFonts w:ascii="Calibri" w:hAnsi="Calibri"/>
-          <w:b/>
+          <w:b w:val="0"/>
           <w:i w:val="0"/>
         </w:rPr>
         <w:t>Terrain-only semantic segmentation</w:t>
@@ -328,7 +314,7 @@
       <w:r>
         <w:rPr>
           <w:rFonts w:ascii="Calibri" w:hAnsi="Calibri"/>
-          <w:b/>
+          <w:b w:val="0"/>
           <w:i w:val="0"/>
         </w:rPr>
         <w:t>Satellite-DEM validation</w:t>
@@ -344,7 +330,7 @@
       <w:r>
         <w:rPr>
           <w:rFonts w:ascii="Calibri" w:hAnsi="Calibri"/>
-          <w:b/>
+          <w:b w:val="0"/>
           <w:i w:val="0"/>
         </w:rPr>
         <w:t>Laplacian</w:t>
@@ -360,7 +346,7 @@
       <w:r>
         <w:rPr>
           <w:rFonts w:ascii="Calibri" w:hAnsi="Calibri"/>
-          <w:b/>
+          <w:b w:val="0"/>
           <w:i w:val="0"/>
         </w:rPr>
         <w:t>NMAD</w:t>
@@ -376,7 +362,7 @@
       <w:r>
         <w:rPr>
           <w:rFonts w:ascii="Calibri" w:hAnsi="Calibri"/>
-          <w:b/>
+          <w:b w:val="0"/>
           <w:i w:val="0"/>
         </w:rPr>
         <w:t>Multi-epoch change detection</w:t>
@@ -397,7 +383,7 @@
       <w:r>
         <w:rPr>
           <w:rFonts w:ascii="Calibri" w:hAnsi="Calibri"/>
-          <w:b/>
+          <w:b w:val="0"/>
           <w:i w:val="0"/>
         </w:rPr>
         <w:t>The gap.</w:t>
@@ -429,7 +415,7 @@
       <w:r>
         <w:rPr>
           <w:rFonts w:ascii="Calibri" w:hAnsi="Calibri"/>
-          <w:b/>
+          <w:b w:val="0"/>
           <w:i w:val="0"/>
         </w:rPr>
         <w:t>where</w:t>
@@ -445,7 +431,7 @@
       <w:r>
         <w:rPr>
           <w:rFonts w:ascii="Calibri" w:hAnsi="Calibri"/>
-          <w:b/>
+          <w:b w:val="0"/>
           <w:i w:val="0"/>
         </w:rPr>
         <w:t>(a) coupling geomorphic change to physical/climate drivers</w:t>
@@ -461,7 +447,7 @@
       <w:r>
         <w:rPr>
           <w:rFonts w:ascii="Calibri" w:hAnsi="Calibri"/>
-          <w:b/>
+          <w:b w:val="0"/>
           <w:i w:val="0"/>
         </w:rPr>
         <w:t>(b) generalizing the model beyond the MDVs.</w:t>
@@ -553,7 +539,7 @@
       <w:r>
         <w:rPr>
           <w:rFonts w:ascii="Calibri" w:hAnsi="Calibri"/>
-          <w:b/>
+          <w:b w:val="0"/>
           <w:i/>
         </w:rPr>
         <w:t>Figure 1.</w:t>
@@ -591,7 +577,6 @@
           <w:rFonts w:ascii="Calibri" w:hAnsi="Calibri"/>
           <w:b/>
           <w:i w:val="0"/>
-          <w:color w:val="2E5496"/>
           <w:sz w:val="24"/>
         </w:rPr>
         <w:t>2. Objectives and Hypotheses</w:t>
@@ -615,7 +600,7 @@
         <w:tc>
           <w:tcPr>
             <w:tcW w:type="dxa" w:w="2412"/>
-            <w:shd w:val="clear" w:fill="1F3864"/>
+            <w:shd w:val="clear" w:fill="E8E8E8"/>
           </w:tcPr>
           <w:p>
             <w:pPr>
@@ -631,7 +616,6 @@
                 <w:rFonts w:ascii="Calibri" w:hAnsi="Calibri"/>
                 <w:b/>
                 <w:i w:val="0"/>
-                <w:color w:val="FFFFFF"/>
                 <w:sz w:val="18"/>
               </w:rPr>
               <w:t>#</w:t>
@@ -641,7 +625,7 @@
         <w:tc>
           <w:tcPr>
             <w:tcW w:type="dxa" w:w="2412"/>
-            <w:shd w:val="clear" w:fill="1F3864"/>
+            <w:shd w:val="clear" w:fill="E8E8E8"/>
           </w:tcPr>
           <w:p>
             <w:pPr>
@@ -657,7 +641,6 @@
                 <w:rFonts w:ascii="Calibri" w:hAnsi="Calibri"/>
                 <w:b/>
                 <w:i w:val="0"/>
-                <w:color w:val="FFFFFF"/>
                 <w:sz w:val="18"/>
               </w:rPr>
               <w:t>Objective</w:t>
@@ -667,7 +650,7 @@
         <w:tc>
           <w:tcPr>
             <w:tcW w:type="dxa" w:w="2412"/>
-            <w:shd w:val="clear" w:fill="1F3864"/>
+            <w:shd w:val="clear" w:fill="E8E8E8"/>
           </w:tcPr>
           <w:p>
             <w:pPr>
@@ -683,7 +666,6 @@
                 <w:rFonts w:ascii="Calibri" w:hAnsi="Calibri"/>
                 <w:b/>
                 <w:i w:val="0"/>
-                <w:color w:val="FFFFFF"/>
                 <w:sz w:val="18"/>
               </w:rPr>
               <w:t>Hypothesis</w:t>
@@ -693,7 +675,7 @@
         <w:tc>
           <w:tcPr>
             <w:tcW w:type="dxa" w:w="2412"/>
-            <w:shd w:val="clear" w:fill="1F3864"/>
+            <w:shd w:val="clear" w:fill="E8E8E8"/>
           </w:tcPr>
           <w:p>
             <w:pPr>
@@ -709,7 +691,6 @@
                 <w:rFonts w:ascii="Calibri" w:hAnsi="Calibri"/>
                 <w:b/>
                 <w:i w:val="0"/>
-                <w:color w:val="FFFFFF"/>
                 <w:sz w:val="18"/>
               </w:rPr>
               <w:t>Increment over Barlow</w:t>
@@ -730,7 +711,7 @@
             <w:r>
               <w:rPr>
                 <w:rFonts w:ascii="Calibri" w:hAnsi="Calibri"/>
-                <w:b/>
+                <w:b w:val="0"/>
                 <w:i w:val="0"/>
                 <w:sz w:val="18"/>
               </w:rPr>
@@ -750,7 +731,7 @@
             <w:r>
               <w:rPr>
                 <w:rFonts w:ascii="Calibri" w:hAnsi="Calibri"/>
-                <w:b/>
+                <w:b w:val="0"/>
                 <w:i w:val="0"/>
                 <w:sz w:val="18"/>
               </w:rPr>
@@ -768,7 +749,7 @@
             <w:r>
               <w:rPr>
                 <w:rFonts w:ascii="Calibri" w:hAnsi="Calibri"/>
-                <w:b/>
+                <w:b w:val="0"/>
                 <w:i w:val="0"/>
                 <w:sz w:val="18"/>
               </w:rPr>
@@ -797,7 +778,7 @@
             <w:r>
               <w:rPr>
                 <w:rFonts w:ascii="Calibri" w:hAnsi="Calibri"/>
-                <w:b/>
+                <w:b w:val="0"/>
                 <w:i w:val="0"/>
                 <w:sz w:val="18"/>
               </w:rPr>
@@ -857,7 +838,6 @@
         <w:tc>
           <w:tcPr>
             <w:tcW w:type="dxa" w:w="2412"/>
-            <w:shd w:val="clear" w:fill="EEF2F8"/>
           </w:tcPr>
           <w:p>
             <w:pPr>
@@ -867,7 +847,7 @@
             <w:r>
               <w:rPr>
                 <w:rFonts w:ascii="Calibri" w:hAnsi="Calibri"/>
-                <w:b/>
+                <w:b w:val="0"/>
                 <w:i w:val="0"/>
                 <w:sz w:val="18"/>
               </w:rPr>
@@ -878,7 +858,6 @@
         <w:tc>
           <w:tcPr>
             <w:tcW w:type="dxa" w:w="2412"/>
-            <w:shd w:val="clear" w:fill="EEF2F8"/>
           </w:tcPr>
           <w:p>
             <w:pPr>
@@ -888,7 +867,7 @@
             <w:r>
               <w:rPr>
                 <w:rFonts w:ascii="Calibri" w:hAnsi="Calibri"/>
-                <w:b/>
+                <w:b w:val="0"/>
                 <w:i w:val="0"/>
                 <w:sz w:val="18"/>
               </w:rPr>
@@ -906,7 +885,7 @@
             <w:r>
               <w:rPr>
                 <w:rFonts w:ascii="Calibri" w:hAnsi="Calibri"/>
-                <w:b/>
+                <w:b w:val="0"/>
                 <w:i w:val="0"/>
                 <w:sz w:val="18"/>
               </w:rPr>
@@ -926,7 +905,6 @@
         <w:tc>
           <w:tcPr>
             <w:tcW w:type="dxa" w:w="2412"/>
-            <w:shd w:val="clear" w:fill="EEF2F8"/>
           </w:tcPr>
           <w:p>
             <w:pPr>
@@ -936,7 +914,7 @@
             <w:r>
               <w:rPr>
                 <w:rFonts w:ascii="Calibri" w:hAnsi="Calibri"/>
-                <w:b/>
+                <w:b w:val="0"/>
                 <w:i w:val="0"/>
                 <w:sz w:val="18"/>
               </w:rPr>
@@ -956,7 +934,6 @@
         <w:tc>
           <w:tcPr>
             <w:tcW w:type="dxa" w:w="2412"/>
-            <w:shd w:val="clear" w:fill="EEF2F8"/>
           </w:tcPr>
           <w:p>
             <w:pPr>
@@ -988,7 +965,7 @@
             <w:r>
               <w:rPr>
                 <w:rFonts w:ascii="Calibri" w:hAnsi="Calibri"/>
-                <w:b/>
+                <w:b w:val="0"/>
                 <w:i w:val="0"/>
                 <w:sz w:val="18"/>
               </w:rPr>
@@ -1008,7 +985,7 @@
             <w:r>
               <w:rPr>
                 <w:rFonts w:ascii="Calibri" w:hAnsi="Calibri"/>
-                <w:b/>
+                <w:b w:val="0"/>
                 <w:i w:val="0"/>
                 <w:sz w:val="18"/>
               </w:rPr>
@@ -1026,7 +1003,7 @@
             <w:r>
               <w:rPr>
                 <w:rFonts w:ascii="Calibri" w:hAnsi="Calibri"/>
-                <w:b/>
+                <w:b w:val="0"/>
                 <w:i w:val="0"/>
                 <w:sz w:val="18"/>
               </w:rPr>
@@ -1055,7 +1032,7 @@
             <w:r>
               <w:rPr>
                 <w:rFonts w:ascii="Calibri" w:hAnsi="Calibri"/>
-                <w:b/>
+                <w:b w:val="0"/>
                 <w:i w:val="0"/>
                 <w:sz w:val="18"/>
               </w:rPr>
@@ -1106,7 +1083,7 @@
       <w:r>
         <w:rPr>
           <w:rFonts w:ascii="Calibri" w:hAnsi="Calibri"/>
-          <w:b/>
+          <w:b w:val="0"/>
           <w:i w:val="0"/>
         </w:rPr>
         <w:t>Predictive payoff (ties O1–O3 together):</w:t>
@@ -1152,7 +1129,6 @@
           <w:rFonts w:ascii="Calibri" w:hAnsi="Calibri"/>
           <w:b/>
           <w:i w:val="0"/>
-          <w:color w:val="2E5496"/>
           <w:sz w:val="24"/>
         </w:rPr>
         <w:t>3. Methodology</w:t>
@@ -1165,7 +1141,7 @@
       <w:r>
         <w:rPr>
           <w:rFonts w:ascii="Calibri" w:hAnsi="Calibri"/>
-          <w:b/>
+          <w:b w:val="0"/>
           <w:i w:val="0"/>
         </w:rPr>
         <w:t>Data (free/public; assembled in preliminary work — see §6).</w:t>
@@ -1181,7 +1157,7 @@
       <w:r>
         <w:rPr>
           <w:rFonts w:ascii="Calibri" w:hAnsi="Calibri"/>
-          <w:b/>
+          <w:b w:val="0"/>
           <w:i w:val="0"/>
         </w:rPr>
         <w:t>profile curvature</w:t>
@@ -1197,7 +1173,7 @@
       <w:r>
         <w:rPr>
           <w:rFonts w:ascii="Calibri" w:hAnsi="Calibri"/>
-          <w:b/>
+          <w:b w:val="0"/>
           <w:i w:val="0"/>
         </w:rPr>
         <w:t>MFD flow accumulation</w:t>
@@ -1213,7 +1189,7 @@
       <w:r>
         <w:rPr>
           <w:rFonts w:ascii="Calibri" w:hAnsi="Calibri"/>
-          <w:b/>
+          <w:b w:val="0"/>
           <w:i w:val="0"/>
         </w:rPr>
         <w:t>21 stream-discharge gauges</w:t>
@@ -1234,7 +1210,7 @@
       <w:r>
         <w:rPr>
           <w:rFonts w:ascii="Calibri" w:hAnsi="Calibri"/>
-          <w:b/>
+          <w:b w:val="0"/>
           <w:i w:val="0"/>
         </w:rPr>
         <w:t>O1 — Attribution.</w:t>
@@ -1250,7 +1226,7 @@
       <w:r>
         <w:rPr>
           <w:rFonts w:ascii="Calibri" w:hAnsi="Calibri"/>
-          <w:b/>
+          <w:b w:val="0"/>
           <w:i w:val="0"/>
         </w:rPr>
         <w:t>energy time series</w:t>
@@ -1287,7 +1263,7 @@
       <w:r>
         <w:rPr>
           <w:rFonts w:ascii="Calibri" w:hAnsi="Calibri"/>
-          <w:b/>
+          <w:b w:val="0"/>
           <w:i w:val="0"/>
         </w:rPr>
         <w:t>O2 — Generalization.</w:t>
@@ -1308,7 +1284,7 @@
       <w:r>
         <w:rPr>
           <w:rFonts w:ascii="Calibri" w:hAnsi="Calibri"/>
-          <w:b/>
+          <w:b w:val="0"/>
           <w:i w:val="0"/>
         </w:rPr>
         <w:t>O3 — Calibrated uncertainty.</w:t>
@@ -1329,7 +1305,7 @@
       <w:r>
         <w:rPr>
           <w:rFonts w:ascii="Calibri" w:hAnsi="Calibri"/>
-          <w:b/>
+          <w:b w:val="0"/>
           <w:i w:val="0"/>
         </w:rPr>
         <w:t>Reproducibility/QC.</w:t>
@@ -1359,7 +1335,6 @@
           <w:rFonts w:ascii="Calibri" w:hAnsi="Calibri"/>
           <w:b/>
           <w:i w:val="0"/>
-          <w:color w:val="2E5496"/>
           <w:sz w:val="24"/>
         </w:rPr>
         <w:t>4. Preliminary Studies and Feasibility</w:t>
@@ -1380,7 +1355,7 @@
       <w:r>
         <w:rPr>
           <w:rFonts w:ascii="Calibri" w:hAnsi="Calibri"/>
-          <w:b/>
+          <w:b w:val="0"/>
           <w:i w:val="0"/>
         </w:rPr>
         <w:t>inside her published ranges</w:t>
@@ -1402,7 +1377,7 @@
       <w:r>
         <w:rPr>
           <w:rFonts w:ascii="Calibri" w:hAnsi="Calibri"/>
-          <w:b/>
+          <w:b w:val="0"/>
           <w:i/>
           <w:color w:val="666666"/>
           <w:sz w:val="18"/>
@@ -1456,7 +1431,7 @@
       <w:r>
         <w:rPr>
           <w:rFonts w:ascii="Calibri" w:hAnsi="Calibri"/>
-          <w:b/>
+          <w:b w:val="0"/>
           <w:i/>
         </w:rPr>
         <w:t>Figure 2.</w:t>
@@ -1497,7 +1472,7 @@
         <w:tc>
           <w:tcPr>
             <w:tcW w:type="dxa" w:w="1930"/>
-            <w:shd w:val="clear" w:fill="1F3864"/>
+            <w:shd w:val="clear" w:fill="E8E8E8"/>
           </w:tcPr>
           <w:p>
             <w:pPr>
@@ -1513,7 +1488,6 @@
                 <w:rFonts w:ascii="Calibri" w:hAnsi="Calibri"/>
                 <w:b/>
                 <w:i w:val="0"/>
-                <w:color w:val="FFFFFF"/>
                 <w:sz w:val="18"/>
               </w:rPr>
               <w:t>Epoch pair</w:t>
@@ -1523,7 +1497,7 @@
         <w:tc>
           <w:tcPr>
             <w:tcW w:type="dxa" w:w="1930"/>
-            <w:shd w:val="clear" w:fill="1F3864"/>
+            <w:shd w:val="clear" w:fill="E8E8E8"/>
           </w:tcPr>
           <w:p>
             <w:pPr>
@@ -1539,7 +1513,6 @@
                 <w:rFonts w:ascii="Calibri" w:hAnsi="Calibri"/>
                 <w:b/>
                 <w:i w:val="0"/>
-                <w:color w:val="FFFFFF"/>
                 <w:sz w:val="18"/>
               </w:rPr>
               <w:t>NMAD</w:t>
@@ -1549,7 +1522,7 @@
         <w:tc>
           <w:tcPr>
             <w:tcW w:type="dxa" w:w="1930"/>
-            <w:shd w:val="clear" w:fill="1F3864"/>
+            <w:shd w:val="clear" w:fill="E8E8E8"/>
           </w:tcPr>
           <w:p>
             <w:pPr>
@@ -1565,7 +1538,6 @@
                 <w:rFonts w:ascii="Calibri" w:hAnsi="Calibri"/>
                 <w:b/>
                 <w:i w:val="0"/>
-                <w:color w:val="FFFFFF"/>
                 <w:sz w:val="18"/>
               </w:rPr>
               <w:t>LOD95</w:t>
@@ -1575,7 +1547,7 @@
         <w:tc>
           <w:tcPr>
             <w:tcW w:type="dxa" w:w="1930"/>
-            <w:shd w:val="clear" w:fill="1F3864"/>
+            <w:shd w:val="clear" w:fill="E8E8E8"/>
           </w:tcPr>
           <w:p>
             <w:pPr>
@@ -1591,7 +1563,6 @@
                 <w:rFonts w:ascii="Calibri" w:hAnsi="Calibri"/>
                 <w:b/>
                 <w:i w:val="0"/>
-                <w:color w:val="FFFFFF"/>
                 <w:sz w:val="18"/>
               </w:rPr>
               <w:t>Barlow's published range</w:t>
@@ -1601,7 +1572,7 @@
         <w:tc>
           <w:tcPr>
             <w:tcW w:type="dxa" w:w="1930"/>
-            <w:shd w:val="clear" w:fill="1F3864"/>
+            <w:shd w:val="clear" w:fill="E8E8E8"/>
           </w:tcPr>
           <w:p>
             <w:pPr>
@@ -1617,7 +1588,6 @@
                 <w:rFonts w:ascii="Calibri" w:hAnsi="Calibri"/>
                 <w:b/>
                 <w:i w:val="0"/>
-                <w:color w:val="FFFFFF"/>
                 <w:sz w:val="18"/>
               </w:rPr>
               <w:t>In range?</w:t>
@@ -1731,7 +1701,6 @@
         <w:tc>
           <w:tcPr>
             <w:tcW w:type="dxa" w:w="1930"/>
-            <w:shd w:val="clear" w:fill="EEF2F8"/>
           </w:tcPr>
           <w:p>
             <w:pPr>
@@ -1752,7 +1721,6 @@
         <w:tc>
           <w:tcPr>
             <w:tcW w:type="dxa" w:w="1930"/>
-            <w:shd w:val="clear" w:fill="EEF2F8"/>
           </w:tcPr>
           <w:p>
             <w:pPr>
@@ -1773,7 +1741,6 @@
         <w:tc>
           <w:tcPr>
             <w:tcW w:type="dxa" w:w="1930"/>
-            <w:shd w:val="clear" w:fill="EEF2F8"/>
           </w:tcPr>
           <w:p>
             <w:pPr>
@@ -1794,7 +1761,6 @@
         <w:tc>
           <w:tcPr>
             <w:tcW w:type="dxa" w:w="1930"/>
-            <w:shd w:val="clear" w:fill="EEF2F8"/>
           </w:tcPr>
           <w:p>
             <w:pPr>
@@ -1815,7 +1781,6 @@
         <w:tc>
           <w:tcPr>
             <w:tcW w:type="dxa" w:w="1930"/>
-            <w:shd w:val="clear" w:fill="EEF2F8"/>
           </w:tcPr>
           <w:p>
             <w:pPr>
@@ -1855,7 +1820,7 @@
       <w:r>
         <w:rPr>
           <w:rFonts w:ascii="Calibri" w:hAnsi="Calibri"/>
-          <w:b/>
+          <w:b w:val="0"/>
           <w:i w:val="0"/>
         </w:rPr>
         <w:t>ICP</w:t>
@@ -1877,7 +1842,7 @@
       <w:r>
         <w:rPr>
           <w:rFonts w:ascii="Calibri" w:hAnsi="Calibri"/>
-          <w:b/>
+          <w:b w:val="0"/>
           <w:i/>
           <w:color w:val="666666"/>
           <w:sz w:val="18"/>
@@ -1931,7 +1896,7 @@
       <w:r>
         <w:rPr>
           <w:rFonts w:ascii="Calibri" w:hAnsi="Calibri"/>
-          <w:b/>
+          <w:b w:val="0"/>
           <w:i/>
         </w:rPr>
         <w:t>Figure 3.</w:t>
@@ -1961,7 +1926,7 @@
       <w:r>
         <w:rPr>
           <w:rFonts w:ascii="Calibri" w:hAnsi="Calibri"/>
-          <w:b/>
+          <w:b w:val="0"/>
           <w:i/>
           <w:color w:val="666666"/>
           <w:sz w:val="18"/>
@@ -2015,7 +1980,7 @@
       <w:r>
         <w:rPr>
           <w:rFonts w:ascii="Calibri" w:hAnsi="Calibri"/>
-          <w:b/>
+          <w:b w:val="0"/>
           <w:i/>
         </w:rPr>
         <w:t>Figure 4.</w:t>
@@ -2061,7 +2026,7 @@
       <w:r>
         <w:rPr>
           <w:rFonts w:ascii="Calibri" w:hAnsi="Calibri"/>
-          <w:b/>
+          <w:b w:val="0"/>
           <w:i/>
           <w:color w:val="666666"/>
           <w:sz w:val="18"/>
@@ -2115,7 +2080,7 @@
       <w:r>
         <w:rPr>
           <w:rFonts w:ascii="Calibri" w:hAnsi="Calibri"/>
-          <w:b/>
+          <w:b w:val="0"/>
           <w:i/>
         </w:rPr>
         <w:t>Figure 5.</w:t>
@@ -2176,7 +2141,7 @@
       <w:r>
         <w:rPr>
           <w:rFonts w:ascii="Calibri" w:hAnsi="Calibri"/>
-          <w:b/>
+          <w:b w:val="0"/>
           <w:i w:val="0"/>
         </w:rPr>
         <w:t>Feasibility summary.</w:t>
@@ -2206,7 +2171,6 @@
           <w:rFonts w:ascii="Calibri" w:hAnsi="Calibri"/>
           <w:b/>
           <w:i w:val="0"/>
-          <w:color w:val="2E5496"/>
           <w:sz w:val="24"/>
         </w:rPr>
         <w:t>5. Feasibility Anchor (FI Qualifications)</w:t>
@@ -2227,7 +2191,7 @@
       <w:r>
         <w:rPr>
           <w:rFonts w:ascii="Calibri" w:hAnsi="Calibri"/>
-          <w:b/>
+          <w:b w:val="0"/>
           <w:i w:val="0"/>
         </w:rPr>
         <w:t>"WellSight"</w:t>
@@ -2259,7 +2223,7 @@
       <w:r>
         <w:rPr>
           <w:rFonts w:ascii="Calibri" w:hAnsi="Calibri"/>
-          <w:b/>
+          <w:b w:val="0"/>
           <w:i w:val="0"/>
         </w:rPr>
         <w:t>O2</w:t>
@@ -2289,7 +2253,6 @@
           <w:rFonts w:ascii="Calibri" w:hAnsi="Calibri"/>
           <w:b/>
           <w:i w:val="0"/>
-          <w:color w:val="2E5496"/>
           <w:sz w:val="24"/>
         </w:rPr>
         <w:t>6. Data Requirements and Availability</w:t>
@@ -2310,7 +2273,7 @@
       <w:r>
         <w:rPr>
           <w:rFonts w:ascii="Calibri" w:hAnsi="Calibri"/>
-          <w:b/>
+          <w:b w:val="0"/>
           <w:i w:val="0"/>
         </w:rPr>
         <w:t>free/public</w:t>
@@ -2341,7 +2304,7 @@
         <w:tc>
           <w:tcPr>
             <w:tcW w:type="dxa" w:w="3216"/>
-            <w:shd w:val="clear" w:fill="1F3864"/>
+            <w:shd w:val="clear" w:fill="E8E8E8"/>
           </w:tcPr>
           <w:p>
             <w:pPr>
@@ -2357,7 +2320,6 @@
                 <w:rFonts w:ascii="Calibri" w:hAnsi="Calibri"/>
                 <w:b/>
                 <w:i w:val="0"/>
-                <w:color w:val="FFFFFF"/>
                 <w:sz w:val="18"/>
               </w:rPr>
               <w:t>Category</w:t>
@@ -2367,7 +2329,7 @@
         <w:tc>
           <w:tcPr>
             <w:tcW w:type="dxa" w:w="3216"/>
-            <w:shd w:val="clear" w:fill="1F3864"/>
+            <w:shd w:val="clear" w:fill="E8E8E8"/>
           </w:tcPr>
           <w:p>
             <w:pPr>
@@ -2383,7 +2345,6 @@
                 <w:rFonts w:ascii="Calibri" w:hAnsi="Calibri"/>
                 <w:b/>
                 <w:i w:val="0"/>
-                <w:color w:val="FFFFFF"/>
                 <w:sz w:val="18"/>
               </w:rPr>
               <w:t>Source</w:t>
@@ -2393,7 +2354,7 @@
         <w:tc>
           <w:tcPr>
             <w:tcW w:type="dxa" w:w="3216"/>
-            <w:shd w:val="clear" w:fill="1F3864"/>
+            <w:shd w:val="clear" w:fill="E8E8E8"/>
           </w:tcPr>
           <w:p>
             <w:pPr>
@@ -2409,7 +2370,6 @@
                 <w:rFonts w:ascii="Calibri" w:hAnsi="Calibri"/>
                 <w:b/>
                 <w:i w:val="0"/>
-                <w:color w:val="FFFFFF"/>
                 <w:sz w:val="18"/>
               </w:rPr>
               <w:t>Availability</w:t>
@@ -2430,7 +2390,7 @@
             <w:r>
               <w:rPr>
                 <w:rFonts w:ascii="Calibri" w:hAnsi="Calibri"/>
-                <w:b/>
+                <w:b w:val="0"/>
                 <w:i w:val="0"/>
                 <w:sz w:val="18"/>
               </w:rPr>
@@ -2492,7 +2452,6 @@
         <w:tc>
           <w:tcPr>
             <w:tcW w:type="dxa" w:w="3216"/>
-            <w:shd w:val="clear" w:fill="EEF2F8"/>
           </w:tcPr>
           <w:p>
             <w:pPr>
@@ -2513,7 +2472,6 @@
         <w:tc>
           <w:tcPr>
             <w:tcW w:type="dxa" w:w="3216"/>
-            <w:shd w:val="clear" w:fill="EEF2F8"/>
           </w:tcPr>
           <w:p>
             <w:pPr>
@@ -2534,7 +2492,6 @@
         <w:tc>
           <w:tcPr>
             <w:tcW w:type="dxa" w:w="3216"/>
-            <w:shd w:val="clear" w:fill="EEF2F8"/>
           </w:tcPr>
           <w:p>
             <w:pPr>
@@ -2566,7 +2523,7 @@
             <w:r>
               <w:rPr>
                 <w:rFonts w:ascii="Calibri" w:hAnsi="Calibri"/>
-                <w:b/>
+                <w:b w:val="0"/>
                 <w:i w:val="0"/>
                 <w:sz w:val="18"/>
               </w:rPr>
@@ -2637,7 +2594,6 @@
         <w:tc>
           <w:tcPr>
             <w:tcW w:type="dxa" w:w="3216"/>
-            <w:shd w:val="clear" w:fill="EEF2F8"/>
           </w:tcPr>
           <w:p>
             <w:pPr>
@@ -2658,7 +2614,6 @@
         <w:tc>
           <w:tcPr>
             <w:tcW w:type="dxa" w:w="3216"/>
-            <w:shd w:val="clear" w:fill="EEF2F8"/>
           </w:tcPr>
           <w:p>
             <w:pPr>
@@ -2679,7 +2634,6 @@
         <w:tc>
           <w:tcPr>
             <w:tcW w:type="dxa" w:w="3216"/>
-            <w:shd w:val="clear" w:fill="EEF2F8"/>
           </w:tcPr>
           <w:p>
             <w:pPr>
@@ -2698,7 +2652,7 @@
             <w:r>
               <w:rPr>
                 <w:rFonts w:ascii="Calibri" w:hAnsi="Calibri"/>
-                <w:b/>
+                <w:b w:val="0"/>
                 <w:i w:val="0"/>
                 <w:sz w:val="18"/>
               </w:rPr>
@@ -2729,7 +2683,7 @@
             <w:r>
               <w:rPr>
                 <w:rFonts w:ascii="Calibri" w:hAnsi="Calibri"/>
-                <w:b/>
+                <w:b w:val="0"/>
                 <w:i w:val="0"/>
                 <w:sz w:val="18"/>
               </w:rPr>
@@ -2791,7 +2745,6 @@
         <w:tc>
           <w:tcPr>
             <w:tcW w:type="dxa" w:w="3216"/>
-            <w:shd w:val="clear" w:fill="EEF2F8"/>
           </w:tcPr>
           <w:p>
             <w:pPr>
@@ -2812,7 +2765,6 @@
         <w:tc>
           <w:tcPr>
             <w:tcW w:type="dxa" w:w="3216"/>
-            <w:shd w:val="clear" w:fill="EEF2F8"/>
           </w:tcPr>
           <w:p>
             <w:pPr>
@@ -2833,7 +2785,6 @@
         <w:tc>
           <w:tcPr>
             <w:tcW w:type="dxa" w:w="3216"/>
-            <w:shd w:val="clear" w:fill="EEF2F8"/>
           </w:tcPr>
           <w:p>
             <w:pPr>
@@ -2865,7 +2816,7 @@
             <w:r>
               <w:rPr>
                 <w:rFonts w:ascii="Calibri" w:hAnsi="Calibri"/>
-                <w:b/>
+                <w:b w:val="0"/>
                 <w:i w:val="0"/>
                 <w:sz w:val="18"/>
               </w:rPr>
@@ -2927,7 +2878,6 @@
         <w:tc>
           <w:tcPr>
             <w:tcW w:type="dxa" w:w="3216"/>
-            <w:shd w:val="clear" w:fill="EEF2F8"/>
           </w:tcPr>
           <w:p>
             <w:pPr>
@@ -2937,7 +2887,7 @@
             <w:r>
               <w:rPr>
                 <w:rFonts w:ascii="Calibri" w:hAnsi="Calibri"/>
-                <w:b/>
+                <w:b w:val="0"/>
                 <w:i w:val="0"/>
                 <w:sz w:val="18"/>
               </w:rPr>
@@ -2957,7 +2907,6 @@
         <w:tc>
           <w:tcPr>
             <w:tcW w:type="dxa" w:w="3216"/>
-            <w:shd w:val="clear" w:fill="EEF2F8"/>
           </w:tcPr>
           <w:p>
             <w:pPr>
@@ -2978,7 +2927,6 @@
         <w:tc>
           <w:tcPr>
             <w:tcW w:type="dxa" w:w="3216"/>
-            <w:shd w:val="clear" w:fill="EEF2F8"/>
           </w:tcPr>
           <w:p>
             <w:pPr>
@@ -3019,7 +2967,6 @@
           <w:rFonts w:ascii="Calibri" w:hAnsi="Calibri"/>
           <w:b/>
           <w:i w:val="0"/>
-          <w:color w:val="2E5496"/>
           <w:sz w:val="24"/>
         </w:rPr>
         <w:t>7. Management, Timeline, Risks, and Data Management Plan</w:t>
@@ -3032,7 +2979,7 @@
       <w:r>
         <w:rPr>
           <w:rFonts w:ascii="Calibri" w:hAnsi="Calibri"/>
-          <w:b/>
+          <w:b w:val="0"/>
           <w:i w:val="0"/>
         </w:rPr>
         <w:t>FI role &amp; development.</w:t>
@@ -3054,7 +3001,7 @@
       <w:r>
         <w:rPr>
           <w:rFonts w:ascii="Calibri" w:hAnsi="Calibri"/>
-          <w:b/>
+          <w:b w:val="0"/>
           <w:i/>
           <w:color w:val="666666"/>
           <w:sz w:val="18"/>
@@ -3078,7 +3025,7 @@
         <w:tc>
           <w:tcPr>
             <w:tcW w:type="dxa" w:w="4824"/>
-            <w:shd w:val="clear" w:fill="1F3864"/>
+            <w:shd w:val="clear" w:fill="E8E8E8"/>
           </w:tcPr>
           <w:p>
             <w:pPr>
@@ -3094,7 +3041,6 @@
                 <w:rFonts w:ascii="Calibri" w:hAnsi="Calibri"/>
                 <w:b/>
                 <w:i w:val="0"/>
-                <w:color w:val="FFFFFF"/>
                 <w:sz w:val="18"/>
               </w:rPr>
               <w:t>Period</w:t>
@@ -3104,7 +3050,7 @@
         <w:tc>
           <w:tcPr>
             <w:tcW w:type="dxa" w:w="4824"/>
-            <w:shd w:val="clear" w:fill="1F3864"/>
+            <w:shd w:val="clear" w:fill="E8E8E8"/>
           </w:tcPr>
           <w:p>
             <w:pPr>
@@ -3120,7 +3066,6 @@
                 <w:rFonts w:ascii="Calibri" w:hAnsi="Calibri"/>
                 <w:b/>
                 <w:i w:val="0"/>
-                <w:color w:val="FFFFFF"/>
                 <w:sz w:val="18"/>
               </w:rPr>
               <w:t>Milestones</w:t>
@@ -3141,7 +3086,7 @@
             <w:r>
               <w:rPr>
                 <w:rFonts w:ascii="Calibri" w:hAnsi="Calibri"/>
-                <w:b/>
+                <w:b w:val="0"/>
                 <w:i w:val="0"/>
                 <w:sz w:val="18"/>
               </w:rPr>
@@ -3170,7 +3115,7 @@
             <w:r>
               <w:rPr>
                 <w:rFonts w:ascii="Calibri" w:hAnsi="Calibri"/>
-                <w:b/>
+                <w:b w:val="0"/>
                 <w:i w:val="0"/>
                 <w:sz w:val="18"/>
               </w:rPr>
@@ -3192,7 +3137,6 @@
         <w:tc>
           <w:tcPr>
             <w:tcW w:type="dxa" w:w="4824"/>
-            <w:shd w:val="clear" w:fill="EEF2F8"/>
           </w:tcPr>
           <w:p>
             <w:pPr>
@@ -3202,7 +3146,7 @@
             <w:r>
               <w:rPr>
                 <w:rFonts w:ascii="Calibri" w:hAnsi="Calibri"/>
-                <w:b/>
+                <w:b w:val="0"/>
                 <w:i w:val="0"/>
                 <w:sz w:val="18"/>
               </w:rPr>
@@ -3213,7 +3157,6 @@
         <w:tc>
           <w:tcPr>
             <w:tcW w:type="dxa" w:w="4824"/>
-            <w:shd w:val="clear" w:fill="EEF2F8"/>
           </w:tcPr>
           <w:p>
             <w:pPr>
@@ -3232,7 +3175,7 @@
             <w:r>
               <w:rPr>
                 <w:rFonts w:ascii="Calibri" w:hAnsi="Calibri"/>
-                <w:b/>
+                <w:b w:val="0"/>
                 <w:i w:val="0"/>
                 <w:sz w:val="18"/>
               </w:rPr>
@@ -3263,7 +3206,7 @@
             <w:r>
               <w:rPr>
                 <w:rFonts w:ascii="Calibri" w:hAnsi="Calibri"/>
-                <w:b/>
+                <w:b w:val="0"/>
                 <w:i w:val="0"/>
                 <w:sz w:val="18"/>
               </w:rPr>
@@ -3292,7 +3235,7 @@
             <w:r>
               <w:rPr>
                 <w:rFonts w:ascii="Calibri" w:hAnsi="Calibri"/>
-                <w:b/>
+                <w:b w:val="0"/>
                 <w:i w:val="0"/>
                 <w:sz w:val="18"/>
               </w:rPr>
@@ -3323,7 +3266,7 @@
       <w:r>
         <w:rPr>
           <w:rFonts w:ascii="Calibri" w:hAnsi="Calibri"/>
-          <w:b/>
+          <w:b w:val="0"/>
           <w:i w:val="0"/>
         </w:rPr>
         <w:t>Risks &amp; mitigations.</w:t>
@@ -3392,7 +3335,7 @@
       <w:r>
         <w:rPr>
           <w:rFonts w:ascii="Calibri" w:hAnsi="Calibri"/>
-          <w:b/>
+          <w:b w:val="0"/>
           <w:i w:val="0"/>
         </w:rPr>
         <w:t>Data Management Plan.</w:t>
@@ -3422,7 +3365,6 @@
           <w:rFonts w:ascii="Calibri" w:hAnsi="Calibri"/>
           <w:b/>
           <w:i w:val="0"/>
-          <w:color w:val="2E5496"/>
           <w:sz w:val="24"/>
         </w:rPr>
         <w:t>References</w:t>

</xml_diff>

<commit_message>
docs: remove em-dashes from formal proposal, figures, and footers
De-em-dashes finesst_proposal.md (label lead-ins -> colons, rest -> commas;
plain version was already clean), the figure text baked into _finesst_figures.py
(DoD colorbar, error-model title), and the footer/title strings in both
renderers. Regenerated 5 figures + all four docs. En-dashes in numeric ranges
kept.

Co-Authored-By: Claude Opus 4.8 (1M context) <noreply@anthropic.com>
</commit_message>
<xml_diff>
--- a/barlow/docs/finesst_proposal.docx
+++ b/barlow/docs/finesst_proposal.docx
@@ -26,7 +26,7 @@
           <w:color w:val="666666"/>
           <w:sz w:val="18"/>
         </w:rPr>
-        <w:t>NASA ROSES-2025 F.5 — Future Investigators in NASA Earth and Space Science and Technology (FINESST)</w:t>
+        <w:t>NASA ROSES-2025 F.5: Future Investigators in NASA Earth and Space Science and Technology (FINESST)</w:t>
       </w:r>
     </w:p>
     <w:p>
@@ -47,7 +47,7 @@
           <w:b w:val="0"/>
           <w:i w:val="0"/>
         </w:rPr>
-        <w:t xml:space="preserve"> Earth Science Division (EARTH25) — Antarctic cryosphere / climate </w:t>
+        <w:t xml:space="preserve"> Earth Science Division (EARTH25), Antarctic cryosphere / climate </w:t>
       </w:r>
       <w:r>
         <w:rPr>
@@ -139,7 +139,7 @@
           <w:i w:val="0"/>
           <w:sz w:val="20"/>
         </w:rPr>
-        <w:t xml:space="preserve"> tool. Building on Barlow (2026) — which mapped two decades of ephemeral-channel geomorphic change across the McMurdo Dry Valleys — the proposed work will </w:t>
+        <w:t xml:space="preserve"> tool. Building on Barlow (2026), which mapped two decades of ephemeral-channel geomorphic change across the McMurdo Dry Valleys, the proposed work will </w:t>
       </w:r>
       <w:r>
         <w:rPr>
@@ -259,7 +259,7 @@
           <w:b w:val="0"/>
           <w:i w:val="0"/>
         </w:rPr>
-        <w:t xml:space="preserve"> that flow for a few weeks each year, move sediment, and reshape channels. These streams are the most sensitive measurable indicator of climate change in the most stable place on Earth — a continental-scale "climate canary."</w:t>
+        <w:t xml:space="preserve"> that flow for a few weeks each year, move sediment, and reshape channels. These streams are the most sensitive measurable indicator of climate change in the most stable place on Earth, a continental-scale "climate canary."</w:t>
       </w:r>
     </w:p>
     <w:p>
@@ -301,7 +301,7 @@
           <w:b w:val="0"/>
           <w:i w:val="0"/>
         </w:rPr>
-        <w:t>Terrain-only semantic segmentation</w:t>
+        <w:t>Terrain-only semantic segmentation:</w:t>
       </w:r>
       <w:r>
         <w:rPr>
@@ -309,7 +309,7 @@
           <w:b w:val="0"/>
           <w:i w:val="0"/>
         </w:rPr>
-        <w:t xml:space="preserve"> — a U-Net delineates stream boundaries from DEM derivatives alone (elevation, slope, aspect most informative; no water/color signal), so it works in channels that are dry 11 months a year. 2. </w:t>
+        <w:t xml:space="preserve"> a U-Net delineates stream boundaries from DEM derivatives alone (elevation, slope, aspect most informative; no water/color signal), so it works in channels that are dry 11 months a year. 2. </w:t>
       </w:r>
       <w:r>
         <w:rPr>
@@ -317,7 +317,7 @@
           <w:b w:val="0"/>
           <w:i w:val="0"/>
         </w:rPr>
-        <w:t>Satellite-DEM validation</w:t>
+        <w:t>Satellite-DEM validation:</w:t>
       </w:r>
       <w:r>
         <w:rPr>
@@ -325,7 +325,7 @@
           <w:b w:val="0"/>
           <w:i w:val="0"/>
         </w:rPr>
-        <w:t xml:space="preserve"> — point-to-plane ICP alignment, </w:t>
+        <w:t xml:space="preserve"> point-to-plane ICP alignment, </w:t>
       </w:r>
       <w:r>
         <w:rPr>
@@ -365,7 +365,7 @@
           <w:b w:val="0"/>
           <w:i w:val="0"/>
         </w:rPr>
-        <w:t>Multi-epoch change detection</w:t>
+        <w:t>Multi-epoch change detection:</w:t>
       </w:r>
       <w:r>
         <w:rPr>
@@ -373,7 +373,7 @@
           <w:b w:val="0"/>
           <w:i w:val="0"/>
         </w:rPr>
-        <w:t xml:space="preserve"> — DEM-of-Difference (DoD) inside segmented stream masks, level-of-detection thresholds (LOD95 = 1.96 × NMAD), and per-stream erosion/deposition and acceleration rates across four valleys and three epochs (2001 &amp; 2014 lidar, 2021–23 REMA).</w:t>
+        <w:t xml:space="preserve"> DEM-of-Difference (DoD) inside segmented stream masks, level-of-detection thresholds (LOD95 = 1.96 × NMAD), and per-stream erosion/deposition and acceleration rates across four valleys and three epochs (2001 &amp; 2014 lidar, 2021–23 REMA).</w:t>
       </w:r>
     </w:p>
     <w:p>
@@ -410,7 +410,7 @@
           <w:b w:val="0"/>
           <w:i w:val="0"/>
         </w:rPr>
-        <w:t xml:space="preserve"> — it maps </w:t>
+        <w:t xml:space="preserve">: it maps </w:t>
       </w:r>
       <w:r>
         <w:rPr>
@@ -558,7 +558,7 @@
           <w:b w:val="0"/>
           <w:i/>
         </w:rPr>
-        <w:t>From detection (Barlow 2026; the first four stages, reproduced by the FI in preliminary work — §4) to the proposed attribution and prediction science (last two stages, the new contribution of this project).</w:t>
+        <w:t>From detection (Barlow 2026; the first four stages, reproduced by the FI in preliminary work, §4) to the proposed attribution and prediction science (last two stages, the new contribution of this project).</w:t>
       </w:r>
     </w:p>
     <w:p>
@@ -744,7 +744,7 @@
                 <w:i w:val="0"/>
                 <w:sz w:val="18"/>
               </w:rPr>
-              <w:t xml:space="preserve"> Pair per-stream gross/net/acceleration rates with energy-balance drivers — air/ground temperature, insolation, </w:t>
+              <w:t xml:space="preserve"> Pair per-stream gross/net/acceleration rates with energy-balance drivers, air/ground temperature, insolation, </w:t>
             </w:r>
             <w:r>
               <w:rPr>
@@ -762,7 +762,7 @@
                 <w:i w:val="0"/>
                 <w:sz w:val="18"/>
               </w:rPr>
-              <w:t>, melt-season discharge, glacier mass balance, active-layer depth — from MDV-LTER + ERA5/AMPS reanalysis.</w:t>
+              <w:t>, melt-season discharge, glacier mass balance, active-layer depth, from MDV-LTER + ERA5/AMPS reanalysis.</w:t>
             </w:r>
           </w:p>
         </w:tc>
@@ -1045,7 +1045,7 @@
                 <w:i w:val="0"/>
                 <w:sz w:val="18"/>
               </w:rPr>
-              <w:t xml:space="preserve"> Conditioning NMAD on slope, aspect, and sensor yields LOD maps whose empirical exceedance matches the nominal 95% — a trustworthy-EO product.</w:t>
+              <w:t xml:space="preserve"> Conditioning NMAD on slope, aspect, and sensor yields LOD maps whose empirical exceedance matches the nominal 95%, a trustworthy-EO product.</w:t>
             </w:r>
           </w:p>
         </w:tc>
@@ -1110,7 +1110,7 @@
           <w:b w:val="0"/>
           <w:i w:val="0"/>
         </w:rPr>
-        <w:t xml:space="preserve"> — the actionable form of the "climate canary."</w:t>
+        <w:t>, the actionable form of the "climate canary."</w:t>
       </w:r>
     </w:p>
     <w:p>
@@ -1144,7 +1144,7 @@
           <w:b w:val="0"/>
           <w:i w:val="0"/>
         </w:rPr>
-        <w:t>Data (free/public; assembled in preliminary work — see §6).</w:t>
+        <w:t>Data (free/public; assembled in preliminary work, see §6).</w:t>
       </w:r>
       <w:r>
         <w:rPr>
@@ -1152,7 +1152,7 @@
           <w:b w:val="0"/>
           <w:i w:val="0"/>
         </w:rPr>
-        <w:t xml:space="preserve"> Elevation backbone: MDV airborne lidar 2001 (NASA ATM, 2 m) + 2014 (NCALM, 1 m), and REMA v2.0 (2 m, 2021–23). Per-epoch derivatives — elevation, slope, aspect, </w:t>
+        <w:t xml:space="preserve"> Elevation backbone: MDV airborne lidar 2001 (NASA ATM, 2 m) + 2014 (NCALM, 1 m), and REMA v2.0 (2 m, 2021–23). Per-epoch derivatives, elevation, slope, aspect, </w:t>
       </w:r>
       <w:r>
         <w:rPr>
@@ -1200,7 +1200,7 @@
           <w:b w:val="0"/>
           <w:i w:val="0"/>
         </w:rPr>
-        <w:t>, glacier mass balance (7 glaciers), continuous soil T/EC/VWC (active-layer proxy); ERA5 monthly 1993–2024 and AMPS 2.67-km for spatial gap-fill. Labels: MCM-LTER stream centerlines (public stand-in for Barlow's access-gated 217 hand-digitized tiles — see §7 risk).</w:t>
+        <w:t>, glacier mass balance (7 glaciers), continuous soil T/EC/VWC (active-layer proxy); ERA5 monthly 1993–2024 and AMPS 2.67-km for spatial gap-fill. Labels: MCM-LTER stream centerlines (public stand-in for Barlow's access-gated 217 hand-digitized tiles, see §7 risk).</w:t>
       </w:r>
     </w:p>
     <w:p>
@@ -1213,7 +1213,7 @@
           <w:b w:val="0"/>
           <w:i w:val="0"/>
         </w:rPr>
-        <w:t>O1 — Attribution.</w:t>
+        <w:t>O1, Attribution.</w:t>
       </w:r>
       <w:r>
         <w:rPr>
@@ -1237,7 +1237,7 @@
           <w:b w:val="0"/>
           <w:i w:val="0"/>
         </w:rPr>
-        <w:t xml:space="preserve"> — melt-season PDD and incoming shortwave from LTER + ERA5/AMPS, cumulative discharge, and active-layer depth; (iii) fit hierarchical regression / random-forest models of rate vs. drivers, with leave-one-stream-out cross-validation; and (iv) test H1 by comparing an energy-balance predictor against discharge-only (Fig. 5 is the preliminary seed: the raw-discharge relationship is real but incomplete). Acceleration (3-epoch Taylor streams) will be regressed against driver </w:t>
+        <w:t xml:space="preserve">, melt-season PDD and incoming shortwave from LTER + ERA5/AMPS, cumulative discharge, and active-layer depth; (iii) fit hierarchical regression / random-forest models of rate vs. drivers, with leave-one-stream-out cross-validation; and (iv) test H1 by comparing an energy-balance predictor against discharge-only (Fig. 5 is the preliminary seed: the raw-discharge relationship is real but incomplete). Acceleration (3-epoch Taylor streams) will be regressed against driver </w:t>
       </w:r>
       <w:r>
         <w:rPr>
@@ -1266,7 +1266,7 @@
           <w:b w:val="0"/>
           <w:i w:val="0"/>
         </w:rPr>
-        <w:t>O2 — Generalization.</w:t>
+        <w:t>O2, Generalization.</w:t>
       </w:r>
       <w:r>
         <w:rPr>
@@ -1287,7 +1287,7 @@
           <w:b w:val="0"/>
           <w:i w:val="0"/>
         </w:rPr>
-        <w:t>O3 — Calibrated uncertainty.</w:t>
+        <w:t>O3, Calibrated uncertainty.</w:t>
       </w:r>
       <w:r>
         <w:rPr>
@@ -1295,7 +1295,7 @@
           <w:b w:val="0"/>
           <w:i w:val="0"/>
         </w:rPr>
-        <w:t xml:space="preserve"> The work will replace the single global NMAD with NMAD conditioned on (slope, aspect, sensor), emit a per-pixel LOD raster, and validate calibration by checking that observed sub-LOD residual fractions match nominal confidence on held-out stable terrain (Fig. 4 shows the global version demonstrated in preliminary work — Laplacian fits the residuals far better than Gaussian).</w:t>
+        <w:t xml:space="preserve"> The work will replace the single global NMAD with NMAD conditioned on (slope, aspect, sensor), emit a per-pixel LOD raster, and validate calibration by checking that observed sub-LOD residual fractions match nominal confidence on held-out stable terrain (Fig. 4 shows the global version demonstrated in preliminary work, Laplacian fits the residuals far better than Gaussian).</w:t>
       </w:r>
     </w:p>
     <w:p>
@@ -1316,7 +1316,7 @@
           <w:b w:val="0"/>
           <w:i w:val="0"/>
         </w:rPr>
-        <w:t xml:space="preserve"> The pipeline is fully scripted — input data and all derivatives regenerate from source — with robust statistics and CRS checks enforced at every step (e.g., a preliminary QC catch — a 2001 nodata bug inflating NMAD to 2.7 m — was identified and fixed).</w:t>
+        <w:t xml:space="preserve"> The pipeline is fully scripted, input data and all derivatives regenerate from source, with robust statistics and CRS checks enforced at every step (e.g., a preliminary QC catch, a 2001 nodata bug inflating NMAD to 2.7 m, was identified and fixed).</w:t>
       </w:r>
     </w:p>
     <w:p>
@@ -1350,7 +1350,7 @@
           <w:b w:val="0"/>
           <w:i w:val="0"/>
         </w:rPr>
-        <w:t xml:space="preserve">To establish feasibility, the FI conducted preliminary studies that reproduce the pipeline underpinning the proposed work. These are feasibility demonstrations — not funded-project deliverables; the proposed research (§2–3) extends them. The FI independently reproduced Barlow's Pillar-3 change detection on Taylor Valley, obtaining results that fall </w:t>
+        <w:t xml:space="preserve">To establish feasibility, the FI conducted preliminary studies that reproduce the pipeline underpinning the proposed work. These are feasibility demonstrations, not funded-project deliverables; the proposed research (§2–3) extends them. The FI independently reproduced Barlow's Pillar-3 change detection on Taylor Valley, obtaining results that fall </w:t>
       </w:r>
       <w:r>
         <w:rPr>
@@ -1831,7 +1831,7 @@
           <w:b w:val="0"/>
           <w:i w:val="0"/>
         </w:rPr>
-        <w:t xml:space="preserve"> converged with fitness 0.95 m² (mean-squared correspondence distance) and improved DoD NMAD on high-relief windows; on the flat valley floor it correctly added no benefit — exactly the relief-dependence Barlow's point-to-plane ICP exhibits.</w:t>
+        <w:t xml:space="preserve"> converged with fitness 0.95 m² (mean-squared correspondence distance) and improved DoD NMAD on high-relief windows; on the flat valley floor it correctly added no benefit, exactly the relief-dependence Barlow's point-to-plane ICP exhibits.</w:t>
       </w:r>
     </w:p>
     <w:p>
@@ -1847,7 +1847,7 @@
           <w:color w:val="666666"/>
           <w:sz w:val="18"/>
         </w:rPr>
-        <w:t>(b) Per-stream rates (Fig. 3) — the masked products the proposed O1 will consume.</w:t>
+        <w:t>(b) Per-stream rates (Fig. 3), the masked products the proposed O1 will consume.</w:t>
       </w:r>
     </w:p>
     <w:p>
@@ -1931,7 +1931,7 @@
           <w:color w:val="666666"/>
           <w:sz w:val="18"/>
         </w:rPr>
-        <w:t>(c) Robust error model (Fig. 4) — the basis for the proposed O3.</w:t>
+        <w:t>(c) Robust error model (Fig. 4), the basis for the proposed O3.</w:t>
       </w:r>
     </w:p>
     <w:p>
@@ -2015,7 +2015,7 @@
           <w:b w:val="0"/>
           <w:i/>
         </w:rPr>
-        <w:t>, not Gaussian — the fat tails would inflate a σ-based LOD. This reproduces Barlow's NMAD/Laplacian finding and is the launch point for the proposed per-pixel calibrated-uncertainty layer (O3).</w:t>
+        <w:t>, not Gaussian, the fat tails would inflate a σ-based LOD. This reproduces Barlow's NMAD/Laplacian finding and is the launch point for the proposed per-pixel calibrated-uncertainty layer (O3).</w:t>
       </w:r>
     </w:p>
     <w:p>
@@ -2031,7 +2031,7 @@
           <w:color w:val="666666"/>
           <w:sz w:val="18"/>
         </w:rPr>
-        <w:t>(d) An exploratory attribution signal (Fig. 5) — evidence O1 is tractable.</w:t>
+        <w:t>(d) An exploratory attribution signal (Fig. 5), evidence O1 is tractable.</w:t>
       </w:r>
     </w:p>
     <w:p>
@@ -2115,7 +2115,7 @@
           <w:b w:val="0"/>
           <w:i/>
         </w:rPr>
-        <w:t xml:space="preserve"> — busier streams move more sediment, as expected. The REMA epoch is noisier (r = +0.43; sparse post-2014 gauge coverage and larger satellite LOD). This motivates O1: raw discharge explains the first-order signal but leaves structured residuals, so the proposed work will develop a </w:t>
+        <w:t xml:space="preserve">, busier streams move more sediment, as expected. The REMA epoch is noisier (r = +0.43; sparse post-2014 gauge coverage and larger satellite LOD). This motivates O1: raw discharge explains the first-order signal but leaves structured residuals, so the proposed work will develop a </w:t>
       </w:r>
       <w:r>
         <w:rPr>
@@ -2152,7 +2152,7 @@
           <w:b w:val="0"/>
           <w:i w:val="0"/>
         </w:rPr>
-        <w:t xml:space="preserve"> These preliminary studies retire the principal execution risk in any FINESST proposal — whether the applicant can run the full pipeline end to end. The proposed research (O1–O3) builds new science on this demonstrated foundation.</w:t>
+        <w:t xml:space="preserve"> These preliminary studies retire the principal execution risk in any FINESST proposal, whether the applicant can run the full pipeline end to end. The proposed research (O1–O3) builds new science on this demonstrated foundation.</w:t>
       </w:r>
     </w:p>
     <w:p>
@@ -2186,7 +2186,7 @@
           <w:b w:val="0"/>
           <w:i w:val="0"/>
         </w:rPr>
-        <w:t xml:space="preserve">The FI independently operates an end-to-end pipeline — </w:t>
+        <w:t xml:space="preserve">The FI independently operates an end-to-end pipeline, </w:t>
       </w:r>
       <w:r>
         <w:rPr>
@@ -2202,7 +2202,7 @@
           <w:b w:val="0"/>
           <w:i w:val="0"/>
         </w:rPr>
-        <w:t xml:space="preserve"> — that runs the </w:t>
+        <w:t xml:space="preserve">, that runs the </w:t>
       </w:r>
       <w:r>
         <w:rPr>
@@ -2234,7 +2234,7 @@
           <w:b w:val="0"/>
           <w:i w:val="0"/>
         </w:rPr>
-        <w:t>) and that the FI already commands the full toolchain — a concrete readiness anchor most FI applicants lack. The MDV preliminary studies in §4 extend that same toolchain to this project's target system.</w:t>
+        <w:t>) and that the FI already commands the full toolchain, a concrete readiness anchor most FI applicants lack. The MDV preliminary studies in §4 extend that same toolchain to this project's target system.</w:t>
       </w:r>
     </w:p>
     <w:p>
@@ -2394,7 +2394,7 @@
                 <w:i w:val="0"/>
                 <w:sz w:val="18"/>
               </w:rPr>
-              <w:t>A. Terrain</w:t>
+              <w:t>A. Terrain:</w:t>
             </w:r>
             <w:r>
               <w:rPr>
@@ -2403,7 +2403,7 @@
                 <w:i w:val="0"/>
                 <w:sz w:val="18"/>
               </w:rPr>
-              <w:t xml:space="preserve"> — MDV lidar 2001 (ATM/ScienceBase) + 2014 (NCALM/OpenTopography); REMA 2021-23 (PGC)</w:t>
+              <w:t xml:space="preserve"> MDV lidar 2001 (ATM/ScienceBase) + 2014 (NCALM/OpenTopography); REMA 2021-23 (PGC)</w:t>
             </w:r>
           </w:p>
         </w:tc>
@@ -2527,7 +2527,7 @@
                 <w:i w:val="0"/>
                 <w:sz w:val="18"/>
               </w:rPr>
-              <w:t>B. Labels</w:t>
+              <w:t>B. Labels:</w:t>
             </w:r>
             <w:r>
               <w:rPr>
@@ -2536,7 +2536,7 @@
                 <w:i w:val="0"/>
                 <w:sz w:val="18"/>
               </w:rPr>
-              <w:t xml:space="preserve"> — MCM-LTER stream centerlines (QC)</w:t>
+              <w:t xml:space="preserve"> MCM-LTER stream centerlines (QC)</w:t>
             </w:r>
           </w:p>
         </w:tc>
@@ -2687,7 +2687,7 @@
                 <w:i w:val="0"/>
                 <w:sz w:val="18"/>
               </w:rPr>
-              <w:t>C. Drivers</w:t>
+              <w:t>C. Drivers:</w:t>
             </w:r>
             <w:r>
               <w:rPr>
@@ -2696,7 +2696,7 @@
                 <w:i w:val="0"/>
                 <w:sz w:val="18"/>
               </w:rPr>
-              <w:t xml:space="preserve"> — LTER met, 21 discharge gauges, glacier mass balance, soil/active-layer</w:t>
+              <w:t xml:space="preserve"> LTER met, 21 discharge gauges, glacier mass balance, soil/active-layer</w:t>
             </w:r>
           </w:p>
         </w:tc>
@@ -2758,7 +2758,7 @@
                 <w:i w:val="0"/>
                 <w:sz w:val="18"/>
               </w:rPr>
-              <w:t>Reanalysis — ERA5 monthly 1993-2024; AMPS 2.67 km</w:t>
+              <w:t>Reanalysis: ERA5 monthly 1993-2024; AMPS 2.67 km</w:t>
             </w:r>
           </w:p>
         </w:tc>
@@ -2820,7 +2820,7 @@
                 <w:i w:val="0"/>
                 <w:sz w:val="18"/>
               </w:rPr>
-              <w:t>D. Cross-valley</w:t>
+              <w:t>D. Cross-valley:</w:t>
             </w:r>
             <w:r>
               <w:rPr>
@@ -2829,7 +2829,7 @@
                 <w:i w:val="0"/>
                 <w:sz w:val="18"/>
               </w:rPr>
-              <w:t xml:space="preserve"> — all four valleys, both lidar + REMA</w:t>
+              <w:t xml:space="preserve"> all four valleys, both lidar + REMA</w:t>
             </w:r>
           </w:p>
         </w:tc>
@@ -2891,7 +2891,7 @@
                 <w:i w:val="0"/>
                 <w:sz w:val="18"/>
               </w:rPr>
-              <w:t>E. Validation</w:t>
+              <w:t>E. Validation:</w:t>
             </w:r>
             <w:r>
               <w:rPr>
@@ -2900,7 +2900,7 @@
                 <w:i w:val="0"/>
                 <w:sz w:val="18"/>
               </w:rPr>
-              <w:t xml:space="preserve"> — WorldView/Maxar (label QC); published rates</w:t>
+              <w:t xml:space="preserve"> WorldView/Maxar (label QC); published rates</w:t>
             </w:r>
           </w:p>
         </w:tc>
@@ -3346,7 +3346,7 @@
           <w:b w:val="0"/>
           <w:i w:val="0"/>
         </w:rPr>
-        <w:t xml:space="preserve"> All input data are free/public (NASA ATM, NCALM/OpenTopography, PGC REMA, MCM-LTER/EDI, Copernicus ERA5, AMPS/GDEX), cited per source. Derived products — change-detection rasters, per-stream rate tables, calibrated-uncertainty layers, and stream-boundary polygons — will be released open-access (DoIs via Zenodo / EDI) with the processing code (PDAL/WhiteboxTools/GDAL + Python). Heavy regenerable rasters are excluded from version control; lightweight scripts, figures, and tables are tracked. Outputs follow ASPRS/OGC standards and carry explicit CRS, method, and uncertainty metadata (per NASA open-science/trustworthy-EO guidance).</w:t>
+        <w:t xml:space="preserve"> All input data are free/public (NASA ATM, NCALM/OpenTopography, PGC REMA, MCM-LTER/EDI, Copernicus ERA5, AMPS/GDEX), cited per source. Derived products, change-detection rasters, per-stream rate tables, calibrated-uncertainty layers, and stream-boundary polygons, will be released open-access (DoIs via Zenodo / EDI) with the processing code (PDAL/WhiteboxTools/GDAL + Python). Heavy regenerable rasters are excluded from version control; lightweight scripts, figures, and tables are tracked. Outputs follow ASPRS/OGC standards and carry explicit CRS, method, and uncertainty metadata (per NASA open-science/trustworthy-EO guidance).</w:t>
       </w:r>
     </w:p>
     <w:p>
@@ -3433,7 +3433,7 @@
           <w:b w:val="0"/>
           <w:i/>
         </w:rPr>
-        <w:t>(Dissertation Chapter 4 — proof of concept.)</w:t>
+        <w:t>(Dissertation Chapter 4, proof of concept.)</w:t>
       </w:r>
     </w:p>
     <w:p>
@@ -3641,7 +3641,7 @@
         <w:color w:val="666666"/>
         <w:sz w:val="16"/>
       </w:rPr>
-      <w:t>FINESST S/T/M — MDV ephemeral-channel attribution (draft)</w:t>
+      <w:t>FINESST S/T/M: MDV ephemeral-channel attribution (draft)</w:t>
       <w:tab/>
       <w:tab/>
     </w:r>

</xml_diff>

<commit_message>
docs: drop WellSight name + trim preliminary-work framing
Reviewers don't know or care about "WellSight": removed every mention; §5 is
now a brief generic FI-qualifications note (same toolchain, unrelated landscape,
no project name). Also cut the repetitive preliminary/feasibility framing across
both proposals (§4 -> "Preliminary Results", trimmed; dropped feasibility
summary/takeaway paragraphs; softened summary, Fig 1 caption, §3/§6/footer).
Regenerated all four docs.

Co-Authored-By: Claude Opus 4.8 (1M context) <noreply@anthropic.com>
</commit_message>
<xml_diff>
--- a/barlow/docs/finesst_proposal.docx
+++ b/barlow/docs/finesst_proposal.docx
@@ -193,7 +193,7 @@
           <w:i w:val="0"/>
           <w:sz w:val="20"/>
         </w:rPr>
-        <w:t xml:space="preserve"> deliver calibrated per-pixel uncertainty. Preliminary studies by the Future Investigator (§4) have reproduced and validated the parent change-detection pipeline and surfaced a first attribution signal, establishing feasibility and readiness to execute the proposed research.</w:t>
+        <w:t xml:space="preserve"> deliver calibrated per-pixel uncertainty. The change-detection foundation is already operational and validated against Barlow's published uncertainty ranges, with an initial driver signal shown in §4.</w:t>
       </w:r>
     </w:p>
     <w:p>
@@ -558,7 +558,7 @@
           <w:b w:val="0"/>
           <w:i/>
         </w:rPr>
-        <w:t>From detection (Barlow 2026; the first four stages, reproduced by the FI in preliminary work, §4) to the proposed attribution and prediction science (last two stages, the new contribution of this project).</w:t>
+        <w:t>From detection (Barlow 2026; the first four stages) to the proposed attribution and prediction science (last two stages, the new contribution of this project).</w:t>
       </w:r>
     </w:p>
     <w:p>
@@ -1144,7 +1144,7 @@
           <w:b w:val="0"/>
           <w:i w:val="0"/>
         </w:rPr>
-        <w:t>Data (free/public; assembled in preliminary work, see §6).</w:t>
+        <w:t>Data (free/public; see §6).</w:t>
       </w:r>
       <w:r>
         <w:rPr>
@@ -1221,7 +1221,7 @@
           <w:b w:val="0"/>
           <w:i w:val="0"/>
         </w:rPr>
-        <w:t xml:space="preserve"> For each gauged stream and epoch, the proposed work will (i) compute gross/net geomorphic rate by DoD inside the channel mask (method demonstrated in preliminary work, Fig. 2); (ii) build a per-stream </w:t>
+        <w:t xml:space="preserve"> For each gauged stream and epoch, the proposed work will (i) compute gross/net geomorphic rate by DoD inside the channel mask (operational, Fig. 2); (ii) build a per-stream </w:t>
       </w:r>
       <w:r>
         <w:rPr>
@@ -1237,7 +1237,7 @@
           <w:b w:val="0"/>
           <w:i w:val="0"/>
         </w:rPr>
-        <w:t xml:space="preserve">, melt-season PDD and incoming shortwave from LTER + ERA5/AMPS, cumulative discharge, and active-layer depth; (iii) fit hierarchical regression / random-forest models of rate vs. drivers, with leave-one-stream-out cross-validation; and (iv) test H1 by comparing an energy-balance predictor against discharge-only (Fig. 5 is the preliminary seed: the raw-discharge relationship is real but incomplete). Acceleration (3-epoch Taylor streams) will be regressed against driver </w:t>
+        <w:t xml:space="preserve">, melt-season PDD and incoming shortwave from LTER + ERA5/AMPS, cumulative discharge, and active-layer depth; (iii) fit hierarchical regression / random-forest models of rate vs. drivers, with leave-one-stream-out cross-validation; and (iv) test H1 by comparing an energy-balance predictor against discharge-only (the raw-discharge relationship in Fig. 5 is real but incomplete). Acceleration (3-epoch Taylor streams) will be regressed against driver </w:t>
       </w:r>
       <w:r>
         <w:rPr>
@@ -1274,7 +1274,7 @@
           <w:b w:val="0"/>
           <w:i w:val="0"/>
         </w:rPr>
-        <w:t xml:space="preserve"> The work will quantify the lidar→REMA domain shift over stable terrain as a function of slope/aspect, learn a correction, retrain/fine-tune the segmenter with sensor augmentation, and evaluate F1 across all four valleys and both sensor regimes. The WellSight feasibility anchor (§5) already demonstrates the identical architecture transferring across biomes.</w:t>
+        <w:t xml:space="preserve"> The work will quantify the lidar→REMA domain shift over stable terrain as a function of slope/aspect, learn a correction, retrain/fine-tune the segmenter with sensor augmentation, and evaluate F1 across all four valleys and both sensor regimes. The FI's prior work applying this architecture to a different landscape (§5) shows it transfers across sensors and biomes.</w:t>
       </w:r>
     </w:p>
     <w:p>
@@ -1295,7 +1295,7 @@
           <w:b w:val="0"/>
           <w:i w:val="0"/>
         </w:rPr>
-        <w:t xml:space="preserve"> The work will replace the single global NMAD with NMAD conditioned on (slope, aspect, sensor), emit a per-pixel LOD raster, and validate calibration by checking that observed sub-LOD residual fractions match nominal confidence on held-out stable terrain (Fig. 4 shows the global version demonstrated in preliminary work, Laplacian fits the residuals far better than Gaussian).</w:t>
+        <w:t xml:space="preserve"> The work will replace the single global NMAD with NMAD conditioned on (slope, aspect, sensor), emit a per-pixel LOD raster, and validate calibration by checking that observed sub-LOD residual fractions match nominal confidence on held-out stable terrain (Fig. 4 shows the global version; Laplacian fits the residuals far better than Gaussian).</w:t>
       </w:r>
     </w:p>
     <w:p>
@@ -1316,7 +1316,7 @@
           <w:b w:val="0"/>
           <w:i w:val="0"/>
         </w:rPr>
-        <w:t xml:space="preserve"> The pipeline is fully scripted, input data and all derivatives regenerate from source, with robust statistics and CRS checks enforced at every step (e.g., a preliminary QC catch, a 2001 nodata bug inflating NMAD to 2.7 m, was identified and fixed).</w:t>
+        <w:t xml:space="preserve"> The pipeline is fully scripted, input data and all derivatives regenerate from source, with robust statistics and CRS checks enforced at every step (e.g., an early QC catch, a 2001 nodata bug inflating NMAD to 2.7 m, was identified and fixed).</w:t>
       </w:r>
     </w:p>
     <w:p>
@@ -1337,7 +1337,7 @@
           <w:i w:val="0"/>
           <w:sz w:val="24"/>
         </w:rPr>
-        <w:t>4. Preliminary Studies and Feasibility</w:t>
+        <w:t>4. Preliminary Results</w:t>
       </w:r>
     </w:p>
     <w:p>
@@ -1350,7 +1350,7 @@
           <w:b w:val="0"/>
           <w:i w:val="0"/>
         </w:rPr>
-        <w:t xml:space="preserve">To establish feasibility, the FI conducted preliminary studies that reproduce the pipeline underpinning the proposed work. These are feasibility demonstrations, not funded-project deliverables; the proposed research (§2–3) extends them. The FI independently reproduced Barlow's Pillar-3 change detection on Taylor Valley, obtaining results that fall </w:t>
+        <w:t xml:space="preserve">The change-detection foundation the proposed work builds on is already operational. A reproduction of Barlow's change detection on Taylor Valley falls </w:t>
       </w:r>
       <w:r>
         <w:rPr>
@@ -1358,7 +1358,7 @@
           <w:b w:val="0"/>
           <w:i w:val="0"/>
         </w:rPr>
-        <w:t>inside her published ranges</w:t>
+        <w:t>inside her published uncertainty ranges</w:t>
       </w:r>
       <w:r>
         <w:rPr>
@@ -1366,7 +1366,7 @@
           <w:b w:val="0"/>
           <w:i w:val="0"/>
         </w:rPr>
-        <w:t>, and took an exploratory first step into the O1 attribution science.</w:t>
+        <w:t xml:space="preserve"> (below), and an initial driver analysis surfaces the first attribution signal that O1 will develop.</w:t>
       </w:r>
     </w:p>
     <w:p>
@@ -1382,7 +1382,7 @@
           <w:color w:val="666666"/>
           <w:sz w:val="18"/>
         </w:rPr>
-        <w:t>(a) Change detection reproduced across all three epochs (Fig. 2).</w:t>
+        <w:t>(a) Change detection across all three epochs (Fig. 2).</w:t>
       </w:r>
     </w:p>
     <w:p>
@@ -1847,7 +1847,7 @@
           <w:color w:val="666666"/>
           <w:sz w:val="18"/>
         </w:rPr>
-        <w:t>(b) Per-stream rates (Fig. 3), the masked products the proposed O1 will consume.</w:t>
+        <w:t>(b) Per-stream rates (Fig. 3), the masked products O1 consumes.</w:t>
       </w:r>
     </w:p>
     <w:p>
@@ -1931,7 +1931,7 @@
           <w:color w:val="666666"/>
           <w:sz w:val="18"/>
         </w:rPr>
-        <w:t>(c) Robust error model (Fig. 4), the basis for the proposed O3.</w:t>
+        <w:t>(c) Robust error model (Fig. 4), the basis for O3.</w:t>
       </w:r>
     </w:p>
     <w:p>
@@ -2031,7 +2031,7 @@
           <w:color w:val="666666"/>
           <w:sz w:val="18"/>
         </w:rPr>
-        <w:t>(d) An exploratory attribution signal (Fig. 5), evidence O1 is tractable.</w:t>
+        <w:t>(d) A first attribution signal (Fig. 5).</w:t>
       </w:r>
     </w:p>
     <w:p>
@@ -2136,27 +2136,6 @@
     </w:p>
     <w:p>
       <w:pPr>
-        <w:spacing w:after="120"/>
-      </w:pPr>
-      <w:r>
-        <w:rPr>
-          <w:rFonts w:ascii="Calibri" w:hAnsi="Calibri"/>
-          <w:b w:val="0"/>
-          <w:i w:val="0"/>
-        </w:rPr>
-        <w:t>Feasibility summary.</w:t>
-      </w:r>
-      <w:r>
-        <w:rPr>
-          <w:rFonts w:ascii="Calibri" w:hAnsi="Calibri"/>
-          <w:b w:val="0"/>
-          <w:i w:val="0"/>
-        </w:rPr>
-        <w:t xml:space="preserve"> These preliminary studies retire the principal execution risk in any FINESST proposal, whether the applicant can run the full pipeline end to end. The proposed research (O1–O3) builds new science on this demonstrated foundation.</w:t>
-      </w:r>
-    </w:p>
-    <w:p>
-      <w:pPr>
         <w:pBdr>
           <w:bottom w:val="single" w:sz="6" w:space="1" w:color="BBBBBB"/>
         </w:pBdr>
@@ -2173,7 +2152,7 @@
           <w:i w:val="0"/>
           <w:sz w:val="24"/>
         </w:rPr>
-        <w:t>5. Feasibility Anchor (FI Qualifications)</w:t>
+        <w:t>5. FI Qualifications</w:t>
       </w:r>
     </w:p>
     <w:p>
@@ -2186,39 +2165,7 @@
           <w:b w:val="0"/>
           <w:i w:val="0"/>
         </w:rPr>
-        <w:t xml:space="preserve">The FI independently operates an end-to-end pipeline, </w:t>
-      </w:r>
-      <w:r>
-        <w:rPr>
-          <w:rFonts w:ascii="Calibri" w:hAnsi="Calibri"/>
-          <w:b w:val="0"/>
-          <w:i w:val="0"/>
-        </w:rPr>
-        <w:t>"WellSight"</w:t>
-      </w:r>
-      <w:r>
-        <w:rPr>
-          <w:rFonts w:ascii="Calibri" w:hAnsi="Calibri"/>
-          <w:b w:val="0"/>
-          <w:i w:val="0"/>
-        </w:rPr>
-        <w:t xml:space="preserve">, that runs the </w:t>
-      </w:r>
-      <w:r>
-        <w:rPr>
-          <w:rFonts w:ascii="Calibri" w:hAnsi="Calibri"/>
-          <w:b w:val="0"/>
-          <w:i/>
-        </w:rPr>
-        <w:t>identical architecture</w:t>
-      </w:r>
-      <w:r>
-        <w:rPr>
-          <w:rFonts w:ascii="Calibri" w:hAnsi="Calibri"/>
-          <w:b w:val="0"/>
-          <w:i w:val="0"/>
-        </w:rPr>
-        <w:t xml:space="preserve"> on a completely different landscape: U-Net semantic segmentation on lidar-derived terrain rasters (DEM, slope, local relief, openness), ICP co-registration, and DEM-of-Difference change analysis, applied to Appalachian Plateau channels, roads, and abandoned-well pad scars detected from elevation alone. This independently demonstrates that the method generalizes across sensors and biomes (directly de-risking the proposed </w:t>
+        <w:t xml:space="preserve">The FI has independently built and operated this exact toolchain, U-Net semantic segmentation on lidar-derived terrain rasters, ICP co-registration, and DEM-of-Difference change analysis, on an unrelated landscape (channels, roads, and disturbance scars detected from elevation alone in the Appalachian Plateau). That prior work shows the architecture transfers across sensors and biomes, directly de-risking </w:t>
       </w:r>
       <w:r>
         <w:rPr>
@@ -2234,7 +2181,7 @@
           <w:b w:val="0"/>
           <w:i w:val="0"/>
         </w:rPr>
-        <w:t>) and that the FI already commands the full toolchain, a concrete readiness anchor most FI applicants lack. The MDV preliminary studies in §4 extend that same toolchain to this project's target system.</w:t>
+        <w:t>, and that the FI already commands the full pipeline end to end.</w:t>
       </w:r>
     </w:p>
     <w:p>
@@ -2284,7 +2231,7 @@
           <w:b w:val="0"/>
           <w:i w:val="0"/>
         </w:rPr>
-        <w:t>, and the FI has already assembled the full stack during preliminary studies (regenerable from source via scripted pipelines), so data availability poses no schedule risk. The single access-gated dependency is Barlow's training labels (mitigated below and in §7).</w:t>
+        <w:t xml:space="preserve"> and already in hand (regenerable from source via scripted pipelines), so data availability poses no schedule risk. The single access-gated dependency is Barlow's training labels (mitigated below and in §7).</w:t>
       </w:r>
     </w:p>
     <w:tbl>
@@ -3110,7 +3057,7 @@
                 <w:i w:val="0"/>
                 <w:sz w:val="18"/>
               </w:rPr>
-              <w:t xml:space="preserve">Full driver harmonization (PDD/insolation/active-layer series per gauged stream); O1 attribution model on Taylor Valley (extending the Fig. 5 preliminary signal); calibrated-uncertainty prototype (O3). </w:t>
+              <w:t xml:space="preserve">Full driver harmonization (PDD/insolation/active-layer series per gauged stream); O1 attribution model on Taylor Valley (extending the Fig. 5 signal); calibrated-uncertainty prototype (O3). </w:t>
             </w:r>
             <w:r>
               <w:rPr>
@@ -3293,7 +3240,7 @@
           <w:b w:val="0"/>
           <w:i w:val="0"/>
         </w:rPr>
-        <w:t xml:space="preserve"> → mitigation: LTER centerlines already work as a QC stand-in (Fig. 2–3 built on them); plan to request the tiles and, failing that, re-digitize a comparable training set (the WellSight pipeline shows we can build labels). (2) </w:t>
+        <w:t xml:space="preserve"> → mitigation: LTER centerlines already work as a QC stand-in (Fig. 2–3 built on them); plan to request the tiles and, failing that, re-digitize a comparable training set (the FI's prior work shows label generation is in hand). (2) </w:t>
       </w:r>
       <w:r>
         <w:rPr>
@@ -3615,7 +3562,7 @@
           <w:b w:val="0"/>
           <w:i/>
         </w:rPr>
-        <w:t>Draft S/T/M section. Figures generated by `barlow/build/_finesst_figures.py`. The results in §4 are preliminary feasibility studies by the FI, not funded-project deliverables. Not a submitted proposal.</w:t>
+        <w:t>Draft S/T/M section. Figures generated by `barlow/build/_finesst_figures.py`. Not a submitted proposal.</w:t>
       </w:r>
     </w:p>
     <w:sectPr>

</xml_diff>

<commit_message>
barlow: fix lake contamination + area confound + attribution statistic
Reevaluation found three defects in the FINESST preliminary analysis:
1. Lake Fryxell's ~1.5m rise was 78% of Aiken's apparent deposition ->
   automated standing-water screen (elevation-mode detection) in per_stream()
2. Raw m3/yr rates confound channel area / epoch coverage -> specific
   mm/yr rates added and used in figures
3. r=+0.89 was raw volume vs cumulative discharge (coverage-biased,
   Spearman only +0.49) -> corrected to specific rate vs mean-per-gauged-day
   discharge: r=+0.95 (p=0.004), rho=+0.94 (p=0.005), leave-one-out stable;
   REMA epoch honestly shown with no fit (was r=+0.43, p=0.39, noise)

Also: fig1 same-window comparison, live NMAD/LOD from rasters, channel-free
stable-terrain NMAD check, DEM-date-aligned discharge windows. Both proposals
+ all rendered docs updated.

Co-Authored-By: Claude Fable 5 <noreply@anthropic.com>
</commit_message>
<xml_diff>
--- a/barlow/docs/finesst_proposal.docx
+++ b/barlow/docs/finesst_proposal.docx
@@ -1442,15 +1442,20 @@
           <w:b w:val="0"/>
           <w:i w:val="0"/>
         </w:rPr>
-        <w:t xml:space="preserve"> </w:t>
+        <w:t xml:space="preserve"> *DEM-of-Difference over the same Taylor Valley stream-corridor window, only</w:t>
       </w:r>
+    </w:p>
+    <w:p>
+      <w:pPr>
+        <w:spacing w:after="120"/>
+      </w:pPr>
       <w:r>
         <w:rPr>
           <w:rFonts w:ascii="Calibri" w:hAnsi="Calibri"/>
           <w:b w:val="0"/>
-          <w:i/>
+          <w:i w:val="0"/>
         </w:rPr>
-        <w:t>DEM-of-Difference, Taylor Valley stream corridors, only |Δz| &gt; LOD95 shown. (a) 2001→2014 lidar–lidar, ICP-aligned; (b) 2014→2021-23 lidar–REMA. Coherent erosion/deposition patterns emerge above the noise floor; REMA auto-reprojected from EPSG:3031 to the lidar grid.</w:t>
+        <w:t>|Δz| &gt; LOD95 shown. (a) 2001→2014 lidar–lidar; (b) 2014→2021-23 lidar–REMA. Coherent erosion/deposition patterns emerge above the noise floor; REMA auto-reprojected from EPSG:3031 to the lidar grid. The large flat signal in (a) is Lake Fryxell's ~1.5 m level rise, detected and excluded from all stream rates by an automated standing-water screen.*</w:t>
       </w:r>
     </w:p>
     <w:tbl>
@@ -1915,7 +1920,23 @@
           <w:b w:val="0"/>
           <w:i/>
         </w:rPr>
-        <w:t>Per-stream gross (busyness) and net (erosion–deposition) sediment-flux rates for six gauged Taylor Valley streams, both epochs, channels masked to MCM-LTER centerlines.</w:t>
+        <w:t xml:space="preserve">Per-stream </w:t>
+      </w:r>
+      <w:r>
+        <w:rPr>
+          <w:rFonts w:ascii="Calibri" w:hAnsi="Calibri"/>
+          <w:b w:val="0"/>
+          <w:i/>
+        </w:rPr>
+        <w:t>specific</w:t>
+      </w:r>
+      <w:r>
+        <w:rPr>
+          <w:rFonts w:ascii="Calibri" w:hAnsi="Calibri"/>
+          <w:b w:val="0"/>
+          <w:i/>
+        </w:rPr>
+        <w:t xml:space="preserve"> (area-normalized, mm/yr) gross and net sediment-flux rates for six gauged Taylor Valley streams, both epochs, channels masked to MCM-LTER centerlines. Specific rates are used because the valid-data footprint differs between epochs (the 2001 ATM lidar swath is narrower than REMA coverage), so raw m³/yr totals would confound real change with coverage.</w:t>
       </w:r>
     </w:p>
     <w:p>
@@ -2041,7 +2062,7 @@
       <w:r>
         <w:drawing>
           <wp:inline xmlns:a="http://schemas.openxmlformats.org/drawingml/2006/main" xmlns:pic="http://schemas.openxmlformats.org/drawingml/2006/picture">
-            <wp:extent cx="5230981" cy="3657600"/>
+            <wp:extent cx="6126480" cy="2695024"/>
             <wp:docPr id="5" name="Picture 5"/>
             <wp:cNvGraphicFramePr>
               <a:graphicFrameLocks noChangeAspect="1"/>
@@ -2062,7 +2083,7 @@
                   <pic:spPr>
                     <a:xfrm>
                       <a:off x="0" y="0"/>
-                      <a:ext cx="5230981" cy="3657600"/>
+                      <a:ext cx="6126480" cy="2695024"/>
                     </a:xfrm>
                     <a:prstGeom prst="rect"/>
                   </pic:spPr>
@@ -2099,7 +2120,7 @@
           <w:b w:val="0"/>
           <w:i/>
         </w:rPr>
-        <w:t xml:space="preserve">Per-stream gross geomorphic rate vs. cumulative gauged melt discharge. The </w:t>
+        <w:t xml:space="preserve">Per-stream geomorphic rate vs. mean gauged melt discharge (log-log; lake-level signal screened out). In the lidar–lidar epoch the </w:t>
       </w:r>
       <w:r>
         <w:rPr>
@@ -2107,7 +2128,7 @@
           <w:b w:val="0"/>
           <w:i/>
         </w:rPr>
-        <w:t>lidar–lidar epoch shows a strong positive relationship (r = +0.89)</w:t>
+        <w:t>specific (area-normalized) rate scales strongly with discharge: Pearson r = +0.95 (p = 0.004), Spearman ρ = +0.94 (p = 0.005)</w:t>
       </w:r>
       <w:r>
         <w:rPr>
@@ -2115,7 +2136,7 @@
           <w:b w:val="0"/>
           <w:i/>
         </w:rPr>
-        <w:t xml:space="preserve">, busier streams move more sediment, as expected. The REMA epoch is noisier (r = +0.43; sparse post-2014 gauge coverage and larger satellite LOD). This motivates O1: raw discharge explains the first-order signal but leaves structured residuals, so the proposed work will develop a </w:t>
+        <w:t xml:space="preserve">, and the relationship survives leaving out any single stream. The REMA epoch shows no coherent relation under sparse post-2015 gauge coverage (48–362 gauged days per stream) and is plotted without a fit. This motivates O1 directly: where gauges are dense the melt–sediment link is strong, so the proposed work will replace patchy gauging with </w:t>
       </w:r>
       <w:r>
         <w:rPr>
@@ -2123,7 +2144,7 @@
           <w:b w:val="0"/>
           <w:i/>
         </w:rPr>
-        <w:t>melt-energy</w:t>
+        <w:t>modeled melt energy</w:t>
       </w:r>
       <w:r>
         <w:rPr>
@@ -2131,7 +2152,7 @@
           <w:b w:val="0"/>
           <w:i/>
         </w:rPr>
-        <w:t xml:space="preserve"> (PDD/insolation/ active-layer) model to close the gap and turn correlation into attribution.</w:t>
+        <w:t xml:space="preserve"> (PDD/insolation/active-layer) to extend attribution across epochs and valleys, turning correlation into attribution.</w:t>
       </w:r>
     </w:p>
     <w:p>

</xml_diff>

<commit_message>
docs: restructure proposals around the datasets (approachable data story)
Plain version: new section 3 'The data: what we'll use, where it's from,
what it shows' with per-dataset tables (source / what it shows / what it
does for us) grouped into ground snapshots, drivers, and labels; section 2
retitled 'What we need to do' with a one-sentence mission; sections
renumbered. Formal version keeps NASA order but its data table upgraded
to the same per-dataset format.

Co-Authored-By: Claude Fable 5 <noreply@anthropic.com>
</commit_message>
<xml_diff>
--- a/barlow/docs/finesst_proposal.docx
+++ b/barlow/docs/finesst_proposal.docx
@@ -2264,14 +2264,15 @@
         <w:tblLook w:firstColumn="1" w:firstRow="1" w:lastColumn="0" w:lastRow="0" w:noHBand="0" w:noVBand="1" w:val="04A0"/>
       </w:tblPr>
       <w:tblGrid>
-        <w:gridCol w:w="3216"/>
-        <w:gridCol w:w="3216"/>
-        <w:gridCol w:w="3216"/>
+        <w:gridCol w:w="2412"/>
+        <w:gridCol w:w="2412"/>
+        <w:gridCol w:w="2412"/>
+        <w:gridCol w:w="2412"/>
       </w:tblGrid>
       <w:tr>
         <w:tc>
           <w:tcPr>
-            <w:tcW w:type="dxa" w:w="3216"/>
+            <w:tcW w:type="dxa" w:w="2412"/>
             <w:shd w:val="clear" w:fill="E8E8E8"/>
           </w:tcPr>
           <w:p>
@@ -2290,13 +2291,13 @@
                 <w:i w:val="0"/>
                 <w:sz w:val="18"/>
               </w:rPr>
-              <w:t>Category</w:t>
+              <w:t>Dataset (source)</w:t>
             </w:r>
           </w:p>
         </w:tc>
         <w:tc>
           <w:tcPr>
-            <w:tcW w:type="dxa" w:w="3216"/>
+            <w:tcW w:type="dxa" w:w="2412"/>
             <w:shd w:val="clear" w:fill="E8E8E8"/>
           </w:tcPr>
           <w:p>
@@ -2315,13 +2316,13 @@
                 <w:i w:val="0"/>
                 <w:sz w:val="18"/>
               </w:rPr>
-              <w:t>Source</w:t>
+              <w:t>What it shows</w:t>
             </w:r>
           </w:p>
         </w:tc>
         <w:tc>
           <w:tcPr>
-            <w:tcW w:type="dxa" w:w="3216"/>
+            <w:tcW w:type="dxa" w:w="2412"/>
             <w:shd w:val="clear" w:fill="E8E8E8"/>
           </w:tcPr>
           <w:p>
@@ -2340,7 +2341,32 @@
                 <w:i w:val="0"/>
                 <w:sz w:val="18"/>
               </w:rPr>
-              <w:t>Availability</w:t>
+              <w:t>Role in the proposed work</w:t>
+            </w:r>
+          </w:p>
+        </w:tc>
+        <w:tc>
+          <w:tcPr>
+            <w:tcW w:type="dxa" w:w="2412"/>
+            <w:shd w:val="clear" w:fill="E8E8E8"/>
+          </w:tcPr>
+          <w:p>
+            <w:pPr>
+              <w:spacing w:after="20"/>
+            </w:pPr>
+            <w:r>
+              <w:rPr>
+                <w:b/>
+              </w:rPr>
+            </w:r>
+            <w:r>
+              <w:rPr>
+                <w:rFonts w:ascii="Calibri" w:hAnsi="Calibri"/>
+                <w:b/>
+                <w:i w:val="0"/>
+                <w:sz w:val="18"/>
+              </w:rPr>
+              <w:t>Status</w:t>
             </w:r>
           </w:p>
         </w:tc>
@@ -2348,7 +2374,7 @@
       <w:tr>
         <w:tc>
           <w:tcPr>
-            <w:tcW w:type="dxa" w:w="3216"/>
+            <w:tcW w:type="dxa" w:w="2412"/>
           </w:tcPr>
           <w:p>
             <w:pPr>
@@ -2362,7 +2388,7 @@
                 <w:i w:val="0"/>
                 <w:sz w:val="18"/>
               </w:rPr>
-              <w:t>A. Terrain:</w:t>
+              <w:t>2001 airborne lidar</w:t>
             </w:r>
             <w:r>
               <w:rPr>
@@ -2371,13 +2397,13 @@
                 <w:i w:val="0"/>
                 <w:sz w:val="18"/>
               </w:rPr>
-              <w:t xml:space="preserve"> MDV lidar 2001 (ATM/ScienceBase) + 2014 (NCALM/OpenTopography); REMA 2021-23 (PGC)</w:t>
+              <w:t>, 2 m (NASA ATM, via USGS)</w:t>
             </w:r>
           </w:p>
         </w:tc>
         <w:tc>
           <w:tcPr>
-            <w:tcW w:type="dxa" w:w="3216"/>
+            <w:tcW w:type="dxa" w:w="2412"/>
           </w:tcPr>
           <w:p>
             <w:pPr>
@@ -2391,13 +2417,33 @@
                 <w:i w:val="0"/>
                 <w:sz w:val="18"/>
               </w:rPr>
-              <w:t>free/public</w:t>
+              <w:t>Valley-floor surface in 2001</w:t>
             </w:r>
           </w:p>
         </w:tc>
         <w:tc>
           <w:tcPr>
-            <w:tcW w:type="dxa" w:w="3216"/>
+            <w:tcW w:type="dxa" w:w="2412"/>
+          </w:tcPr>
+          <w:p>
+            <w:pPr>
+              <w:spacing w:after="20"/>
+            </w:pPr>
+            <w:r/>
+            <w:r>
+              <w:rPr>
+                <w:rFonts w:ascii="Calibri" w:hAnsi="Calibri"/>
+                <w:b w:val="0"/>
+                <w:i w:val="0"/>
+                <w:sz w:val="18"/>
+              </w:rPr>
+              <w:t>Baseline epoch for all change detection</w:t>
+            </w:r>
+          </w:p>
+        </w:tc>
+        <w:tc>
+          <w:tcPr>
+            <w:tcW w:type="dxa" w:w="2412"/>
           </w:tcPr>
           <w:p>
             <w:pPr>
@@ -2419,7 +2465,7 @@
       <w:tr>
         <w:tc>
           <w:tcPr>
-            <w:tcW w:type="dxa" w:w="3216"/>
+            <w:tcW w:type="dxa" w:w="2412"/>
           </w:tcPr>
           <w:p>
             <w:pPr>
@@ -2433,13 +2479,22 @@
                 <w:i w:val="0"/>
                 <w:sz w:val="18"/>
               </w:rPr>
-              <w:t>Per-epoch derivatives (elev/slope/aspect/curv/MFD-flow/intensity)</w:t>
+              <w:t>2014 airborne lidar</w:t>
+            </w:r>
+            <w:r>
+              <w:rPr>
+                <w:rFonts w:ascii="Calibri" w:hAnsi="Calibri"/>
+                <w:b w:val="0"/>
+                <w:i w:val="0"/>
+                <w:sz w:val="18"/>
+              </w:rPr>
+              <w:t>, 1 m (NCALM, via OpenTopography)</w:t>
             </w:r>
           </w:p>
         </w:tc>
         <w:tc>
           <w:tcPr>
-            <w:tcW w:type="dxa" w:w="3216"/>
+            <w:tcW w:type="dxa" w:w="2412"/>
           </w:tcPr>
           <w:p>
             <w:pPr>
@@ -2453,13 +2508,13 @@
                 <w:i w:val="0"/>
                 <w:sz w:val="18"/>
               </w:rPr>
-              <w:t>scripted from terrain</w:t>
+              <w:t>Same terrain 13 yr later at benchmark accuracy</w:t>
             </w:r>
           </w:p>
         </w:tc>
         <w:tc>
           <w:tcPr>
-            <w:tcW w:type="dxa" w:w="3216"/>
+            <w:tcW w:type="dxa" w:w="2412"/>
           </w:tcPr>
           <w:p>
             <w:pPr>
@@ -2473,73 +2528,13 @@
                 <w:i w:val="0"/>
                 <w:sz w:val="18"/>
               </w:rPr>
-              <w:t>✅ demonstrated (Taylor pilot)</w:t>
-            </w:r>
-          </w:p>
-        </w:tc>
-      </w:tr>
-      <w:tr>
-        <w:tc>
-          <w:tcPr>
-            <w:tcW w:type="dxa" w:w="3216"/>
-          </w:tcPr>
-          <w:p>
-            <w:pPr>
-              <w:spacing w:after="20"/>
-            </w:pPr>
-            <w:r/>
-            <w:r>
-              <w:rPr>
-                <w:rFonts w:ascii="Calibri" w:hAnsi="Calibri"/>
-                <w:b w:val="0"/>
-                <w:i w:val="0"/>
-                <w:sz w:val="18"/>
-              </w:rPr>
-              <w:t>B. Labels:</w:t>
-            </w:r>
-            <w:r>
-              <w:rPr>
-                <w:rFonts w:ascii="Calibri" w:hAnsi="Calibri"/>
-                <w:b w:val="0"/>
-                <w:i w:val="0"/>
-                <w:sz w:val="18"/>
-              </w:rPr>
-              <w:t xml:space="preserve"> MCM-LTER stream centerlines (QC)</w:t>
+              <w:t>Reference epoch; anchors the error model</w:t>
             </w:r>
           </w:p>
         </w:tc>
         <w:tc>
           <w:tcPr>
-            <w:tcW w:type="dxa" w:w="3216"/>
-          </w:tcPr>
-          <w:p>
-            <w:pPr>
-              <w:spacing w:after="20"/>
-            </w:pPr>
-            <w:r/>
-            <w:r>
-              <w:rPr>
-                <w:rFonts w:ascii="Calibri" w:hAnsi="Calibri"/>
-                <w:b w:val="0"/>
-                <w:i w:val="0"/>
-                <w:sz w:val="18"/>
-              </w:rPr>
-              <w:t xml:space="preserve">EDI </w:t>
-            </w:r>
-            <w:r>
-              <w:rPr>
-                <w:rFonts w:ascii="Consolas" w:hAnsi="Consolas"/>
-                <w:b w:val="0"/>
-                <w:i w:val="0"/>
-                <w:sz w:val="15"/>
-              </w:rPr>
-              <w:t>knb-lter-mcm.6007</w:t>
-            </w:r>
-          </w:p>
-        </w:tc>
-        <w:tc>
-          <w:tcPr>
-            <w:tcW w:type="dxa" w:w="3216"/>
+            <w:tcW w:type="dxa" w:w="2412"/>
           </w:tcPr>
           <w:p>
             <w:pPr>
@@ -2561,7 +2556,762 @@
       <w:tr>
         <w:tc>
           <w:tcPr>
-            <w:tcW w:type="dxa" w:w="3216"/>
+            <w:tcW w:type="dxa" w:w="2412"/>
+          </w:tcPr>
+          <w:p>
+            <w:pPr>
+              <w:spacing w:after="20"/>
+            </w:pPr>
+            <w:r/>
+            <w:r>
+              <w:rPr>
+                <w:rFonts w:ascii="Calibri" w:hAnsi="Calibri"/>
+                <w:b w:val="0"/>
+                <w:i w:val="0"/>
+                <w:sz w:val="18"/>
+              </w:rPr>
+              <w:t>REMA satellite DEM</w:t>
+            </w:r>
+            <w:r>
+              <w:rPr>
+                <w:rFonts w:ascii="Calibri" w:hAnsi="Calibri"/>
+                <w:b w:val="0"/>
+                <w:i w:val="0"/>
+                <w:sz w:val="18"/>
+              </w:rPr>
+              <w:t>, 2 m, 2021-23 (PGC/Maxar stereo)</w:t>
+            </w:r>
+          </w:p>
+        </w:tc>
+        <w:tc>
+          <w:tcPr>
+            <w:tcW w:type="dxa" w:w="2412"/>
+          </w:tcPr>
+          <w:p>
+            <w:pPr>
+              <w:spacing w:after="20"/>
+            </w:pPr>
+            <w:r/>
+            <w:r>
+              <w:rPr>
+                <w:rFonts w:ascii="Calibri" w:hAnsi="Calibri"/>
+                <w:b w:val="0"/>
+                <w:i w:val="0"/>
+                <w:sz w:val="18"/>
+              </w:rPr>
+              <w:t>Most recent surface, continent-wide</w:t>
+            </w:r>
+          </w:p>
+        </w:tc>
+        <w:tc>
+          <w:tcPr>
+            <w:tcW w:type="dxa" w:w="2412"/>
+          </w:tcPr>
+          <w:p>
+            <w:pPr>
+              <w:spacing w:after="20"/>
+            </w:pPr>
+            <w:r/>
+            <w:r>
+              <w:rPr>
+                <w:rFonts w:ascii="Calibri" w:hAnsi="Calibri"/>
+                <w:b w:val="0"/>
+                <w:i w:val="0"/>
+                <w:sz w:val="18"/>
+              </w:rPr>
+              <w:t>Extends the record past the last lidar flight; the sensor O2 must generalize to</w:t>
+            </w:r>
+          </w:p>
+        </w:tc>
+        <w:tc>
+          <w:tcPr>
+            <w:tcW w:type="dxa" w:w="2412"/>
+          </w:tcPr>
+          <w:p>
+            <w:pPr>
+              <w:spacing w:after="20"/>
+            </w:pPr>
+            <w:r/>
+            <w:r>
+              <w:rPr>
+                <w:rFonts w:ascii="Calibri" w:hAnsi="Calibri"/>
+                <w:b w:val="0"/>
+                <w:i w:val="0"/>
+                <w:sz w:val="18"/>
+              </w:rPr>
+              <w:t>✅ in hand</w:t>
+            </w:r>
+          </w:p>
+        </w:tc>
+      </w:tr>
+      <w:tr>
+        <w:tc>
+          <w:tcPr>
+            <w:tcW w:type="dxa" w:w="2412"/>
+          </w:tcPr>
+          <w:p>
+            <w:pPr>
+              <w:spacing w:after="20"/>
+            </w:pPr>
+            <w:r/>
+            <w:r>
+              <w:rPr>
+                <w:rFonts w:ascii="Calibri" w:hAnsi="Calibri"/>
+                <w:b w:val="0"/>
+                <w:i w:val="0"/>
+                <w:sz w:val="18"/>
+              </w:rPr>
+              <w:t>Per-epoch terrain derivatives (slope/aspect/curvature/MFD-flow/intensity)</w:t>
+            </w:r>
+          </w:p>
+        </w:tc>
+        <w:tc>
+          <w:tcPr>
+            <w:tcW w:type="dxa" w:w="2412"/>
+          </w:tcPr>
+          <w:p>
+            <w:pPr>
+              <w:spacing w:after="20"/>
+            </w:pPr>
+            <w:r/>
+            <w:r>
+              <w:rPr>
+                <w:rFonts w:ascii="Calibri" w:hAnsi="Calibri"/>
+                <w:b w:val="0"/>
+                <w:i w:val="0"/>
+                <w:sz w:val="18"/>
+              </w:rPr>
+              <w:t>Channel-diagnostic terrain form</w:t>
+            </w:r>
+          </w:p>
+        </w:tc>
+        <w:tc>
+          <w:tcPr>
+            <w:tcW w:type="dxa" w:w="2412"/>
+          </w:tcPr>
+          <w:p>
+            <w:pPr>
+              <w:spacing w:after="20"/>
+            </w:pPr>
+            <w:r/>
+            <w:r>
+              <w:rPr>
+                <w:rFonts w:ascii="Calibri" w:hAnsi="Calibri"/>
+                <w:b w:val="0"/>
+                <w:i w:val="0"/>
+                <w:sz w:val="18"/>
+              </w:rPr>
+              <w:t>Input features the U-Net segmenter reads</w:t>
+            </w:r>
+          </w:p>
+        </w:tc>
+        <w:tc>
+          <w:tcPr>
+            <w:tcW w:type="dxa" w:w="2412"/>
+          </w:tcPr>
+          <w:p>
+            <w:pPr>
+              <w:spacing w:after="20"/>
+            </w:pPr>
+            <w:r/>
+            <w:r>
+              <w:rPr>
+                <w:rFonts w:ascii="Calibri" w:hAnsi="Calibri"/>
+                <w:b w:val="0"/>
+                <w:i w:val="0"/>
+                <w:sz w:val="18"/>
+              </w:rPr>
+              <w:t>✅ scripted; demonstrated (Taylor pilot)</w:t>
+            </w:r>
+          </w:p>
+        </w:tc>
+      </w:tr>
+      <w:tr>
+        <w:tc>
+          <w:tcPr>
+            <w:tcW w:type="dxa" w:w="2412"/>
+          </w:tcPr>
+          <w:p>
+            <w:pPr>
+              <w:spacing w:after="20"/>
+            </w:pPr>
+            <w:r/>
+            <w:r>
+              <w:rPr>
+                <w:rFonts w:ascii="Calibri" w:hAnsi="Calibri"/>
+                <w:b w:val="0"/>
+                <w:i w:val="0"/>
+                <w:sz w:val="18"/>
+              </w:rPr>
+              <w:t>LTER stream gauges</w:t>
+            </w:r>
+            <w:r>
+              <w:rPr>
+                <w:rFonts w:ascii="Calibri" w:hAnsi="Calibri"/>
+                <w:b w:val="0"/>
+                <w:i w:val="0"/>
+                <w:sz w:val="18"/>
+              </w:rPr>
+              <w:t>, 21 streams, daily, 1990s-present (EDI)</w:t>
+            </w:r>
+          </w:p>
+        </w:tc>
+        <w:tc>
+          <w:tcPr>
+            <w:tcW w:type="dxa" w:w="2412"/>
+          </w:tcPr>
+          <w:p>
+            <w:pPr>
+              <w:spacing w:after="20"/>
+            </w:pPr>
+            <w:r/>
+            <w:r>
+              <w:rPr>
+                <w:rFonts w:ascii="Calibri" w:hAnsi="Calibri"/>
+                <w:b w:val="0"/>
+                <w:i w:val="0"/>
+                <w:sz w:val="18"/>
+              </w:rPr>
+              <w:t>Meltwater each stream carried</w:t>
+            </w:r>
+          </w:p>
+        </w:tc>
+        <w:tc>
+          <w:tcPr>
+            <w:tcW w:type="dxa" w:w="2412"/>
+          </w:tcPr>
+          <w:p>
+            <w:pPr>
+              <w:spacing w:after="20"/>
+            </w:pPr>
+            <w:r/>
+            <w:r>
+              <w:rPr>
+                <w:rFonts w:ascii="Calibri" w:hAnsi="Calibri"/>
+                <w:b w:val="0"/>
+                <w:i w:val="0"/>
+                <w:sz w:val="18"/>
+              </w:rPr>
+              <w:t>Direct discharge driver for O1 (source of the Fig. 5 signal)</w:t>
+            </w:r>
+          </w:p>
+        </w:tc>
+        <w:tc>
+          <w:tcPr>
+            <w:tcW w:type="dxa" w:w="2412"/>
+          </w:tcPr>
+          <w:p>
+            <w:pPr>
+              <w:spacing w:after="20"/>
+            </w:pPr>
+            <w:r/>
+            <w:r>
+              <w:rPr>
+                <w:rFonts w:ascii="Calibri" w:hAnsi="Calibri"/>
+                <w:b w:val="0"/>
+                <w:i w:val="0"/>
+                <w:sz w:val="18"/>
+              </w:rPr>
+              <w:t>✅ in hand</w:t>
+            </w:r>
+          </w:p>
+        </w:tc>
+      </w:tr>
+      <w:tr>
+        <w:tc>
+          <w:tcPr>
+            <w:tcW w:type="dxa" w:w="2412"/>
+          </w:tcPr>
+          <w:p>
+            <w:pPr>
+              <w:spacing w:after="20"/>
+            </w:pPr>
+            <w:r/>
+            <w:r>
+              <w:rPr>
+                <w:rFonts w:ascii="Calibri" w:hAnsi="Calibri"/>
+                <w:b w:val="0"/>
+                <w:i w:val="0"/>
+                <w:sz w:val="18"/>
+              </w:rPr>
+              <w:t>LTER meteorology</w:t>
+            </w:r>
+            <w:r>
+              <w:rPr>
+                <w:rFonts w:ascii="Calibri" w:hAnsi="Calibri"/>
+                <w:b w:val="0"/>
+                <w:i w:val="0"/>
+                <w:sz w:val="18"/>
+              </w:rPr>
+              <w:t xml:space="preserve"> (EDI)</w:t>
+            </w:r>
+          </w:p>
+        </w:tc>
+        <w:tc>
+          <w:tcPr>
+            <w:tcW w:type="dxa" w:w="2412"/>
+          </w:tcPr>
+          <w:p>
+            <w:pPr>
+              <w:spacing w:after="20"/>
+            </w:pPr>
+            <w:r/>
+            <w:r>
+              <w:rPr>
+                <w:rFonts w:ascii="Calibri" w:hAnsi="Calibri"/>
+                <w:b w:val="0"/>
+                <w:i w:val="0"/>
+                <w:sz w:val="18"/>
+              </w:rPr>
+              <w:t>Air temperature, radiation, wind</w:t>
+            </w:r>
+          </w:p>
+        </w:tc>
+        <w:tc>
+          <w:tcPr>
+            <w:tcW w:type="dxa" w:w="2412"/>
+          </w:tcPr>
+          <w:p>
+            <w:pPr>
+              <w:spacing w:after="20"/>
+            </w:pPr>
+            <w:r/>
+            <w:r>
+              <w:rPr>
+                <w:rFonts w:ascii="Calibri" w:hAnsi="Calibri"/>
+                <w:b w:val="0"/>
+                <w:i w:val="0"/>
+                <w:sz w:val="18"/>
+              </w:rPr>
+              <w:t>PDD + insolation melt-energy drivers (O1/H1)</w:t>
+            </w:r>
+          </w:p>
+        </w:tc>
+        <w:tc>
+          <w:tcPr>
+            <w:tcW w:type="dxa" w:w="2412"/>
+          </w:tcPr>
+          <w:p>
+            <w:pPr>
+              <w:spacing w:after="20"/>
+            </w:pPr>
+            <w:r/>
+            <w:r>
+              <w:rPr>
+                <w:rFonts w:ascii="Calibri" w:hAnsi="Calibri"/>
+                <w:b w:val="0"/>
+                <w:i w:val="0"/>
+                <w:sz w:val="18"/>
+              </w:rPr>
+              <w:t>✅ in hand</w:t>
+            </w:r>
+          </w:p>
+        </w:tc>
+      </w:tr>
+      <w:tr>
+        <w:tc>
+          <w:tcPr>
+            <w:tcW w:type="dxa" w:w="2412"/>
+          </w:tcPr>
+          <w:p>
+            <w:pPr>
+              <w:spacing w:after="20"/>
+            </w:pPr>
+            <w:r/>
+            <w:r>
+              <w:rPr>
+                <w:rFonts w:ascii="Calibri" w:hAnsi="Calibri"/>
+                <w:b w:val="0"/>
+                <w:i w:val="0"/>
+                <w:sz w:val="18"/>
+              </w:rPr>
+              <w:t>LTER glacier mass balance</w:t>
+            </w:r>
+            <w:r>
+              <w:rPr>
+                <w:rFonts w:ascii="Calibri" w:hAnsi="Calibri"/>
+                <w:b w:val="0"/>
+                <w:i w:val="0"/>
+                <w:sz w:val="18"/>
+              </w:rPr>
+              <w:t>, 7 glaciers (EDI)</w:t>
+            </w:r>
+          </w:p>
+        </w:tc>
+        <w:tc>
+          <w:tcPr>
+            <w:tcW w:type="dxa" w:w="2412"/>
+          </w:tcPr>
+          <w:p>
+            <w:pPr>
+              <w:spacing w:after="20"/>
+            </w:pPr>
+            <w:r/>
+            <w:r>
+              <w:rPr>
+                <w:rFonts w:ascii="Calibri" w:hAnsi="Calibri"/>
+                <w:b w:val="0"/>
+                <w:i w:val="0"/>
+                <w:sz w:val="18"/>
+              </w:rPr>
+              <w:t>Seasonal ice gain/loss per glacier</w:t>
+            </w:r>
+          </w:p>
+        </w:tc>
+        <w:tc>
+          <w:tcPr>
+            <w:tcW w:type="dxa" w:w="2412"/>
+          </w:tcPr>
+          <w:p>
+            <w:pPr>
+              <w:spacing w:after="20"/>
+            </w:pPr>
+            <w:r/>
+            <w:r>
+              <w:rPr>
+                <w:rFonts w:ascii="Calibri" w:hAnsi="Calibri"/>
+                <w:b w:val="0"/>
+                <w:i w:val="0"/>
+                <w:sz w:val="18"/>
+              </w:rPr>
+              <w:t>Links stream water supply to its source</w:t>
+            </w:r>
+          </w:p>
+        </w:tc>
+        <w:tc>
+          <w:tcPr>
+            <w:tcW w:type="dxa" w:w="2412"/>
+          </w:tcPr>
+          <w:p>
+            <w:pPr>
+              <w:spacing w:after="20"/>
+            </w:pPr>
+            <w:r/>
+            <w:r>
+              <w:rPr>
+                <w:rFonts w:ascii="Calibri" w:hAnsi="Calibri"/>
+                <w:b w:val="0"/>
+                <w:i w:val="0"/>
+                <w:sz w:val="18"/>
+              </w:rPr>
+              <w:t>✅ in hand</w:t>
+            </w:r>
+          </w:p>
+        </w:tc>
+      </w:tr>
+      <w:tr>
+        <w:tc>
+          <w:tcPr>
+            <w:tcW w:type="dxa" w:w="2412"/>
+          </w:tcPr>
+          <w:p>
+            <w:pPr>
+              <w:spacing w:after="20"/>
+            </w:pPr>
+            <w:r/>
+            <w:r>
+              <w:rPr>
+                <w:rFonts w:ascii="Calibri" w:hAnsi="Calibri"/>
+                <w:b w:val="0"/>
+                <w:i w:val="0"/>
+                <w:sz w:val="18"/>
+              </w:rPr>
+              <w:t>LTER soil temperature/moisture</w:t>
+            </w:r>
+            <w:r>
+              <w:rPr>
+                <w:rFonts w:ascii="Calibri" w:hAnsi="Calibri"/>
+                <w:b w:val="0"/>
+                <w:i w:val="0"/>
+                <w:sz w:val="18"/>
+              </w:rPr>
+              <w:t xml:space="preserve"> (EDI)</w:t>
+            </w:r>
+          </w:p>
+        </w:tc>
+        <w:tc>
+          <w:tcPr>
+            <w:tcW w:type="dxa" w:w="2412"/>
+          </w:tcPr>
+          <w:p>
+            <w:pPr>
+              <w:spacing w:after="20"/>
+            </w:pPr>
+            <w:r/>
+            <w:r>
+              <w:rPr>
+                <w:rFonts w:ascii="Calibri" w:hAnsi="Calibri"/>
+                <w:b w:val="0"/>
+                <w:i w:val="0"/>
+                <w:sz w:val="18"/>
+              </w:rPr>
+              <w:t>Summer thaw depth</w:t>
+            </w:r>
+          </w:p>
+        </w:tc>
+        <w:tc>
+          <w:tcPr>
+            <w:tcW w:type="dxa" w:w="2412"/>
+          </w:tcPr>
+          <w:p>
+            <w:pPr>
+              <w:spacing w:after="20"/>
+            </w:pPr>
+            <w:r/>
+            <w:r>
+              <w:rPr>
+                <w:rFonts w:ascii="Calibri" w:hAnsi="Calibri"/>
+                <w:b w:val="0"/>
+                <w:i w:val="0"/>
+                <w:sz w:val="18"/>
+              </w:rPr>
+              <w:t>Active-layer driver (O1/H1)</w:t>
+            </w:r>
+          </w:p>
+        </w:tc>
+        <w:tc>
+          <w:tcPr>
+            <w:tcW w:type="dxa" w:w="2412"/>
+          </w:tcPr>
+          <w:p>
+            <w:pPr>
+              <w:spacing w:after="20"/>
+            </w:pPr>
+            <w:r/>
+            <w:r>
+              <w:rPr>
+                <w:rFonts w:ascii="Calibri" w:hAnsi="Calibri"/>
+                <w:b w:val="0"/>
+                <w:i w:val="0"/>
+                <w:sz w:val="18"/>
+              </w:rPr>
+              <w:t>✅ in hand</w:t>
+            </w:r>
+          </w:p>
+        </w:tc>
+      </w:tr>
+      <w:tr>
+        <w:tc>
+          <w:tcPr>
+            <w:tcW w:type="dxa" w:w="2412"/>
+          </w:tcPr>
+          <w:p>
+            <w:pPr>
+              <w:spacing w:after="20"/>
+            </w:pPr>
+            <w:r/>
+            <w:r>
+              <w:rPr>
+                <w:rFonts w:ascii="Calibri" w:hAnsi="Calibri"/>
+                <w:b w:val="0"/>
+                <w:i w:val="0"/>
+                <w:sz w:val="18"/>
+              </w:rPr>
+              <w:t>ERA5</w:t>
+            </w:r>
+            <w:r>
+              <w:rPr>
+                <w:rFonts w:ascii="Calibri" w:hAnsi="Calibri"/>
+                <w:b w:val="0"/>
+                <w:i w:val="0"/>
+                <w:sz w:val="18"/>
+              </w:rPr>
+              <w:t xml:space="preserve"> monthly 1993-2024 (Copernicus CDS); </w:t>
+            </w:r>
+            <w:r>
+              <w:rPr>
+                <w:rFonts w:ascii="Calibri" w:hAnsi="Calibri"/>
+                <w:b w:val="0"/>
+                <w:i w:val="0"/>
+                <w:sz w:val="18"/>
+              </w:rPr>
+              <w:t>AMPS</w:t>
+            </w:r>
+            <w:r>
+              <w:rPr>
+                <w:rFonts w:ascii="Calibri" w:hAnsi="Calibri"/>
+                <w:b w:val="0"/>
+                <w:i w:val="0"/>
+                <w:sz w:val="18"/>
+              </w:rPr>
+              <w:t xml:space="preserve"> 2.67 km (NCAR GDEX)</w:t>
+            </w:r>
+          </w:p>
+        </w:tc>
+        <w:tc>
+          <w:tcPr>
+            <w:tcW w:type="dxa" w:w="2412"/>
+          </w:tcPr>
+          <w:p>
+            <w:pPr>
+              <w:spacing w:after="20"/>
+            </w:pPr>
+            <w:r/>
+            <w:r>
+              <w:rPr>
+                <w:rFonts w:ascii="Calibri" w:hAnsi="Calibri"/>
+                <w:b w:val="0"/>
+                <w:i w:val="0"/>
+                <w:sz w:val="18"/>
+              </w:rPr>
+              <w:t>Continuous modeled atmosphere</w:t>
+            </w:r>
+          </w:p>
+        </w:tc>
+        <w:tc>
+          <w:tcPr>
+            <w:tcW w:type="dxa" w:w="2412"/>
+          </w:tcPr>
+          <w:p>
+            <w:pPr>
+              <w:spacing w:after="20"/>
+            </w:pPr>
+            <w:r/>
+            <w:r>
+              <w:rPr>
+                <w:rFonts w:ascii="Calibri" w:hAnsi="Calibri"/>
+                <w:b w:val="0"/>
+                <w:i w:val="0"/>
+                <w:sz w:val="18"/>
+              </w:rPr>
+              <w:t>Gap-fills drivers between stations and to ungauged streams; AMPS cross-checks ERA5</w:t>
+            </w:r>
+          </w:p>
+        </w:tc>
+        <w:tc>
+          <w:tcPr>
+            <w:tcW w:type="dxa" w:w="2412"/>
+          </w:tcPr>
+          <w:p>
+            <w:pPr>
+              <w:spacing w:after="20"/>
+            </w:pPr>
+            <w:r/>
+            <w:r>
+              <w:rPr>
+                <w:rFonts w:ascii="Calibri" w:hAnsi="Calibri"/>
+                <w:b w:val="0"/>
+                <w:i w:val="0"/>
+                <w:sz w:val="18"/>
+              </w:rPr>
+              <w:t>✅ in hand</w:t>
+            </w:r>
+          </w:p>
+        </w:tc>
+      </w:tr>
+      <w:tr>
+        <w:tc>
+          <w:tcPr>
+            <w:tcW w:type="dxa" w:w="2412"/>
+          </w:tcPr>
+          <w:p>
+            <w:pPr>
+              <w:spacing w:after="20"/>
+            </w:pPr>
+            <w:r/>
+            <w:r>
+              <w:rPr>
+                <w:rFonts w:ascii="Calibri" w:hAnsi="Calibri"/>
+                <w:b w:val="0"/>
+                <w:i w:val="0"/>
+                <w:sz w:val="18"/>
+              </w:rPr>
+              <w:t>MCM-LTER stream channel polygons</w:t>
+            </w:r>
+            <w:r>
+              <w:rPr>
+                <w:rFonts w:ascii="Calibri" w:hAnsi="Calibri"/>
+                <w:b w:val="0"/>
+                <w:i w:val="0"/>
+                <w:sz w:val="18"/>
+              </w:rPr>
+              <w:t xml:space="preserve"> (EDI </w:t>
+            </w:r>
+            <w:r>
+              <w:rPr>
+                <w:rFonts w:ascii="Consolas" w:hAnsi="Consolas"/>
+                <w:b w:val="0"/>
+                <w:i w:val="0"/>
+                <w:sz w:val="15"/>
+              </w:rPr>
+              <w:t>knb-lter-mcm.6007</w:t>
+            </w:r>
+            <w:r>
+              <w:rPr>
+                <w:rFonts w:ascii="Calibri" w:hAnsi="Calibri"/>
+                <w:b w:val="0"/>
+                <w:i w:val="0"/>
+                <w:sz w:val="18"/>
+              </w:rPr>
+              <w:t>)</w:t>
+            </w:r>
+          </w:p>
+        </w:tc>
+        <w:tc>
+          <w:tcPr>
+            <w:tcW w:type="dxa" w:w="2412"/>
+          </w:tcPr>
+          <w:p>
+            <w:pPr>
+              <w:spacing w:after="20"/>
+            </w:pPr>
+            <w:r/>
+            <w:r>
+              <w:rPr>
+                <w:rFonts w:ascii="Calibri" w:hAnsi="Calibri"/>
+                <w:b w:val="0"/>
+                <w:i w:val="0"/>
+                <w:sz w:val="18"/>
+              </w:rPr>
+              <w:t>Mapped channel of every named stream</w:t>
+            </w:r>
+          </w:p>
+        </w:tc>
+        <w:tc>
+          <w:tcPr>
+            <w:tcW w:type="dxa" w:w="2412"/>
+          </w:tcPr>
+          <w:p>
+            <w:pPr>
+              <w:spacing w:after="20"/>
+            </w:pPr>
+            <w:r/>
+            <w:r>
+              <w:rPr>
+                <w:rFonts w:ascii="Calibri" w:hAnsi="Calibri"/>
+                <w:b w:val="0"/>
+                <w:i w:val="0"/>
+                <w:sz w:val="18"/>
+              </w:rPr>
+              <w:t>Per-stream rate masks (used in Figs. 3/5) + label stand-in</w:t>
+            </w:r>
+          </w:p>
+        </w:tc>
+        <w:tc>
+          <w:tcPr>
+            <w:tcW w:type="dxa" w:w="2412"/>
+          </w:tcPr>
+          <w:p>
+            <w:pPr>
+              <w:spacing w:after="20"/>
+            </w:pPr>
+            <w:r/>
+            <w:r>
+              <w:rPr>
+                <w:rFonts w:ascii="Calibri" w:hAnsi="Calibri"/>
+                <w:b w:val="0"/>
+                <w:i w:val="0"/>
+                <w:sz w:val="18"/>
+              </w:rPr>
+              <w:t>✅ in hand</w:t>
+            </w:r>
+          </w:p>
+        </w:tc>
+      </w:tr>
+      <w:tr>
+        <w:tc>
+          <w:tcPr>
+            <w:tcW w:type="dxa" w:w="2412"/>
           </w:tcPr>
           <w:p>
             <w:pPr>
@@ -2577,11 +3327,20 @@
               </w:rPr>
               <w:t>Barlow's 217 hand-digitized tiles</w:t>
             </w:r>
+            <w:r>
+              <w:rPr>
+                <w:rFonts w:ascii="Calibri" w:hAnsi="Calibri"/>
+                <w:b w:val="0"/>
+                <w:i w:val="0"/>
+                <w:sz w:val="18"/>
+              </w:rPr>
+              <w:t xml:space="preserve"> (author-gated)</w:t>
+            </w:r>
           </w:p>
         </w:tc>
         <w:tc>
           <w:tcPr>
-            <w:tcW w:type="dxa" w:w="3216"/>
+            <w:tcW w:type="dxa" w:w="2412"/>
           </w:tcPr>
           <w:p>
             <w:pPr>
@@ -2595,13 +3354,33 @@
                 <w:i w:val="0"/>
                 <w:sz w:val="18"/>
               </w:rPr>
-              <w:t>author-gated</w:t>
+              <w:t>Expert-traced channel boundaries</w:t>
             </w:r>
           </w:p>
         </w:tc>
         <w:tc>
           <w:tcPr>
-            <w:tcW w:type="dxa" w:w="3216"/>
+            <w:tcW w:type="dxa" w:w="2412"/>
+          </w:tcPr>
+          <w:p>
+            <w:pPr>
+              <w:spacing w:after="20"/>
+            </w:pPr>
+            <w:r/>
+            <w:r>
+              <w:rPr>
+                <w:rFonts w:ascii="Calibri" w:hAnsi="Calibri"/>
+                <w:b w:val="0"/>
+                <w:i w:val="0"/>
+                <w:sz w:val="18"/>
+              </w:rPr>
+              <w:t>Gold-standard U-Net training labels</w:t>
+            </w:r>
+          </w:p>
+        </w:tc>
+        <w:tc>
+          <w:tcPr>
+            <w:tcW w:type="dxa" w:w="2412"/>
           </w:tcPr>
           <w:p>
             <w:pPr>
@@ -2641,7 +3420,7 @@
       <w:tr>
         <w:tc>
           <w:tcPr>
-            <w:tcW w:type="dxa" w:w="3216"/>
+            <w:tcW w:type="dxa" w:w="2412"/>
           </w:tcPr>
           <w:p>
             <w:pPr>
@@ -2655,7 +3434,7 @@
                 <w:i w:val="0"/>
                 <w:sz w:val="18"/>
               </w:rPr>
-              <w:t>C. Drivers:</w:t>
+              <w:t>Cross-valley DEMs</w:t>
             </w:r>
             <w:r>
               <w:rPr>
@@ -2664,13 +3443,13 @@
                 <w:i w:val="0"/>
                 <w:sz w:val="18"/>
               </w:rPr>
-              <w:t xml:space="preserve"> LTER met, 21 discharge gauges, glacier mass balance, soil/active-layer</w:t>
+              <w:t>, all four valleys (OpenTopography/PGC)</w:t>
             </w:r>
           </w:p>
         </w:tc>
         <w:tc>
           <w:tcPr>
-            <w:tcW w:type="dxa" w:w="3216"/>
+            <w:tcW w:type="dxa" w:w="2412"/>
           </w:tcPr>
           <w:p>
             <w:pPr>
@@ -2684,13 +3463,13 @@
                 <w:i w:val="0"/>
                 <w:sz w:val="18"/>
               </w:rPr>
-              <w:t>EDI</w:t>
+              <w:t>Terrain beyond Taylor Valley</w:t>
             </w:r>
           </w:p>
         </w:tc>
         <w:tc>
           <w:tcPr>
-            <w:tcW w:type="dxa" w:w="3216"/>
+            <w:tcW w:type="dxa" w:w="2412"/>
           </w:tcPr>
           <w:p>
             <w:pPr>
@@ -2704,126 +3483,13 @@
                 <w:i w:val="0"/>
                 <w:sz w:val="18"/>
               </w:rPr>
-              <w:t>✅ in hand</w:t>
-            </w:r>
-          </w:p>
-        </w:tc>
-      </w:tr>
-      <w:tr>
-        <w:tc>
-          <w:tcPr>
-            <w:tcW w:type="dxa" w:w="3216"/>
-          </w:tcPr>
-          <w:p>
-            <w:pPr>
-              <w:spacing w:after="20"/>
-            </w:pPr>
-            <w:r/>
-            <w:r>
-              <w:rPr>
-                <w:rFonts w:ascii="Calibri" w:hAnsi="Calibri"/>
-                <w:b w:val="0"/>
-                <w:i w:val="0"/>
-                <w:sz w:val="18"/>
-              </w:rPr>
-              <w:t>Reanalysis: ERA5 monthly 1993-2024; AMPS 2.67 km</w:t>
+              <w:t>O2 generalization test bed</w:t>
             </w:r>
           </w:p>
         </w:tc>
         <w:tc>
           <w:tcPr>
-            <w:tcW w:type="dxa" w:w="3216"/>
-          </w:tcPr>
-          <w:p>
-            <w:pPr>
-              <w:spacing w:after="20"/>
-            </w:pPr>
-            <w:r/>
-            <w:r>
-              <w:rPr>
-                <w:rFonts w:ascii="Calibri" w:hAnsi="Calibri"/>
-                <w:b w:val="0"/>
-                <w:i w:val="0"/>
-                <w:sz w:val="18"/>
-              </w:rPr>
-              <w:t>CDS; GDEX</w:t>
-            </w:r>
-          </w:p>
-        </w:tc>
-        <w:tc>
-          <w:tcPr>
-            <w:tcW w:type="dxa" w:w="3216"/>
-          </w:tcPr>
-          <w:p>
-            <w:pPr>
-              <w:spacing w:after="20"/>
-            </w:pPr>
-            <w:r/>
-            <w:r>
-              <w:rPr>
-                <w:rFonts w:ascii="Calibri" w:hAnsi="Calibri"/>
-                <w:b w:val="0"/>
-                <w:i w:val="0"/>
-                <w:sz w:val="18"/>
-              </w:rPr>
-              <w:t>✅ in hand</w:t>
-            </w:r>
-          </w:p>
-        </w:tc>
-      </w:tr>
-      <w:tr>
-        <w:tc>
-          <w:tcPr>
-            <w:tcW w:type="dxa" w:w="3216"/>
-          </w:tcPr>
-          <w:p>
-            <w:pPr>
-              <w:spacing w:after="20"/>
-            </w:pPr>
-            <w:r/>
-            <w:r>
-              <w:rPr>
-                <w:rFonts w:ascii="Calibri" w:hAnsi="Calibri"/>
-                <w:b w:val="0"/>
-                <w:i w:val="0"/>
-                <w:sz w:val="18"/>
-              </w:rPr>
-              <w:t>D. Cross-valley:</w:t>
-            </w:r>
-            <w:r>
-              <w:rPr>
-                <w:rFonts w:ascii="Calibri" w:hAnsi="Calibri"/>
-                <w:b w:val="0"/>
-                <w:i w:val="0"/>
-                <w:sz w:val="18"/>
-              </w:rPr>
-              <w:t xml:space="preserve"> all four valleys, both lidar + REMA</w:t>
-            </w:r>
-          </w:p>
-        </w:tc>
-        <w:tc>
-          <w:tcPr>
-            <w:tcW w:type="dxa" w:w="3216"/>
-          </w:tcPr>
-          <w:p>
-            <w:pPr>
-              <w:spacing w:after="20"/>
-            </w:pPr>
-            <w:r/>
-            <w:r>
-              <w:rPr>
-                <w:rFonts w:ascii="Calibri" w:hAnsi="Calibri"/>
-                <w:b w:val="0"/>
-                <w:i w:val="0"/>
-                <w:sz w:val="18"/>
-              </w:rPr>
-              <w:t>OpenTopography/PGC</w:t>
-            </w:r>
-          </w:p>
-        </w:tc>
-        <w:tc>
-          <w:tcPr>
-            <w:tcW w:type="dxa" w:w="3216"/>
+            <w:tcW w:type="dxa" w:w="2412"/>
           </w:tcPr>
           <w:p>
             <w:pPr>
@@ -2845,7 +3511,7 @@
       <w:tr>
         <w:tc>
           <w:tcPr>
-            <w:tcW w:type="dxa" w:w="3216"/>
+            <w:tcW w:type="dxa" w:w="2412"/>
           </w:tcPr>
           <w:p>
             <w:pPr>
@@ -2859,22 +3525,13 @@
                 <w:i w:val="0"/>
                 <w:sz w:val="18"/>
               </w:rPr>
-              <w:t>E. Validation:</w:t>
-            </w:r>
-            <w:r>
-              <w:rPr>
-                <w:rFonts w:ascii="Calibri" w:hAnsi="Calibri"/>
-                <w:b w:val="0"/>
-                <w:i w:val="0"/>
-                <w:sz w:val="18"/>
-              </w:rPr>
-              <w:t xml:space="preserve"> WorldView/Maxar (label QC); published rates</w:t>
+              <w:t>WorldView/Maxar imagery; published rates (PGC restricted; literature)</w:t>
             </w:r>
           </w:p>
         </w:tc>
         <w:tc>
           <w:tcPr>
-            <w:tcW w:type="dxa" w:w="3216"/>
+            <w:tcW w:type="dxa" w:w="2412"/>
           </w:tcPr>
           <w:p>
             <w:pPr>
@@ -2888,13 +3545,13 @@
                 <w:i w:val="0"/>
                 <w:sz w:val="18"/>
               </w:rPr>
-              <w:t>PGC (restricted); literature</w:t>
+              <w:t>Visual ground truth; independent rates</w:t>
             </w:r>
           </w:p>
         </w:tc>
         <w:tc>
           <w:tcPr>
-            <w:tcW w:type="dxa" w:w="3216"/>
+            <w:tcW w:type="dxa" w:w="2412"/>
           </w:tcPr>
           <w:p>
             <w:pPr>
@@ -2908,7 +3565,27 @@
                 <w:i w:val="0"/>
                 <w:sz w:val="18"/>
               </w:rPr>
-              <w:t>optional / cross-check vs Barlow</w:t>
+              <w:t>Optional label QC / cross-check vs Barlow</w:t>
+            </w:r>
+          </w:p>
+        </w:tc>
+        <w:tc>
+          <w:tcPr>
+            <w:tcW w:type="dxa" w:w="2412"/>
+          </w:tcPr>
+          <w:p>
+            <w:pPr>
+              <w:spacing w:after="20"/>
+            </w:pPr>
+            <w:r/>
+            <w:r>
+              <w:rPr>
+                <w:rFonts w:ascii="Calibri" w:hAnsi="Calibri"/>
+                <w:b w:val="0"/>
+                <w:i w:val="0"/>
+                <w:sz w:val="18"/>
+              </w:rPr>
+              <w:t>optional</w:t>
             </w:r>
           </w:p>
         </w:tc>

</xml_diff>

<commit_message>
barlow: per-page read-along notes + full proposal de-densification
barlow_dissertation_pagenotes.md: an ELI16 note for every one of the 240 PDF
pages (grouped only for front/back matter); the side-by-side builder now
keys the right pane to the exact page instead of repeating section blocks.
Formal proposal: full readability pass beyond the captions -- simpler title,
summary as three questions, hypotheses table and methodology rewritten one
idea per sentence with terms glossed at first use; pdf+docx re-rendered.

Co-Authored-By: Claude Fable 5 <noreply@anthropic.com>
</commit_message>
<xml_diff>
--- a/barlow/docs/finesst_proposal.docx
+++ b/barlow/docs/finesst_proposal.docx
@@ -10,7 +10,7 @@
           <w:i w:val="0"/>
           <w:sz w:val="36"/>
         </w:rPr>
-        <w:t>From Detection to Attribution: Physically-Coupled, Cross-Domain Monitoring of Ephemeral-Channel Geomorphic Change from Terrain Alone</w:t>
+        <w:t>From Detection to Attribution: Linking Two Decades of Antarctic Stream-Channel Change to Its Climate Drivers, from Terrain Data Alone</w:t>
       </w:r>
     </w:p>
     <w:p>
@@ -103,7 +103,7 @@
           <w:i w:val="0"/>
           <w:sz w:val="20"/>
         </w:rPr>
-        <w:t xml:space="preserve"> This project will transform an existing Antarctic stream-change </w:t>
+        <w:t xml:space="preserve"> This project turns an existing Antarctic stream-change </w:t>
       </w:r>
       <w:r>
         <w:rPr>
@@ -121,7 +121,7 @@
           <w:i w:val="0"/>
           <w:sz w:val="20"/>
         </w:rPr>
-        <w:t xml:space="preserve"> into an </w:t>
+        <w:t xml:space="preserve"> into a tool that </w:t>
       </w:r>
       <w:r>
         <w:rPr>
@@ -130,7 +130,7 @@
           <w:i/>
           <w:sz w:val="20"/>
         </w:rPr>
-        <w:t>explanatory and predictive</w:t>
+        <w:t>explains and predicts</w:t>
       </w:r>
       <w:r>
         <w:rPr>
@@ -139,7 +139,7 @@
           <w:i w:val="0"/>
           <w:sz w:val="20"/>
         </w:rPr>
-        <w:t xml:space="preserve"> tool. Building on Barlow (2026), which mapped two decades of ephemeral-channel geomorphic change across the McMurdo Dry Valleys, the proposed work will </w:t>
+        <w:t xml:space="preserve"> change. Barlow (2026) mapped two decades of stream-channel change across the McMurdo Dry Valleys; the proposed work asks the next questions. </w:t>
       </w:r>
       <w:r>
         <w:rPr>
@@ -157,7 +157,7 @@
           <w:i w:val="0"/>
           <w:sz w:val="20"/>
         </w:rPr>
-        <w:t xml:space="preserve"> attribute that change to its physical/climate drivers, </w:t>
+        <w:t xml:space="preserve"> Which climate drivers control that change? </w:t>
       </w:r>
       <w:r>
         <w:rPr>
@@ -175,7 +175,7 @@
           <w:i w:val="0"/>
           <w:sz w:val="20"/>
         </w:rPr>
-        <w:t xml:space="preserve"> generalize the terrain-only detector across sensors and valleys, and </w:t>
+        <w:t xml:space="preserve"> Can the terrain-only detector work as well on free satellite data as it does on airborne lidar, across all four valleys? </w:t>
       </w:r>
       <w:r>
         <w:rPr>
@@ -193,7 +193,7 @@
           <w:i w:val="0"/>
           <w:sz w:val="20"/>
         </w:rPr>
-        <w:t xml:space="preserve"> deliver calibrated per-pixel uncertainty. The change-detection foundation is already operational and validated against Barlow's published uncertainty ranges, with an initial driver signal shown in §4.</w:t>
+        <w:t xml:space="preserve"> Can every change map carry an honest, per-pixel error bar? The measurement foundation is already running and reproduces Barlow's published uncertainty ranges, and a first driver signal is shown in §4.</w:t>
       </w:r>
     </w:p>
     <w:p>
@@ -243,7 +243,23 @@
           <w:b w:val="0"/>
           <w:i w:val="0"/>
         </w:rPr>
-        <w:t xml:space="preserve"> are Earth's largest ice-free Antarctic desert and, for a century, were considered the planet's most geomorphologically stable landscape. That assumption is breaking down: in an energy-limited system, small increases in solar absorption and permafrost degradation translate directly into </w:t>
+        <w:t xml:space="preserve"> are Earth's largest ice-free Antarctic desert and, for a century, were considered the planet's most geomorphologically stable landscape. That assumption is breaking down. The system is </w:t>
+      </w:r>
+      <w:r>
+        <w:rPr>
+          <w:rFonts w:ascii="Calibri" w:hAnsi="Calibri"/>
+          <w:b w:val="0"/>
+          <w:i w:val="0"/>
+        </w:rPr>
+        <w:t>energy-limited</w:t>
+      </w:r>
+      <w:r>
+        <w:rPr>
+          <w:rFonts w:ascii="Calibri" w:hAnsi="Calibri"/>
+          <w:b w:val="0"/>
+          <w:i w:val="0"/>
+        </w:rPr>
+        <w:t xml:space="preserve"> — there is plenty of frozen water but barely enough heat to melt it — so even small increases in absorbed sunlight, together with thawing permafrost, translate directly into </w:t>
       </w:r>
       <w:r>
         <w:rPr>
@@ -259,7 +275,7 @@
           <w:b w:val="0"/>
           <w:i w:val="0"/>
         </w:rPr>
-        <w:t xml:space="preserve"> that flow for a few weeks each year, move sediment, and reshape channels. These streams are the most sensitive measurable indicator of climate change in the most stable place on Earth, a continental-scale "climate canary."</w:t>
+        <w:t>: channels that flow for only a few weeks each year, move sediment while they do, and reshape themselves in the process. These streams are the most sensitive measurable indicator of climate change in the most stable place on Earth, a continental-scale "climate canary."</w:t>
       </w:r>
     </w:p>
     <w:p>
@@ -325,7 +341,39 @@
           <w:b w:val="0"/>
           <w:i w:val="0"/>
         </w:rPr>
-        <w:t xml:space="preserve"> point-to-plane ICP alignment, </w:t>
+        <w:t xml:space="preserve"> free REMA satellite DEMs are proven accurate enough for centimeter-to-meter stream-corridor change detection, using </w:t>
+      </w:r>
+      <w:r>
+        <w:rPr>
+          <w:rFonts w:ascii="Calibri" w:hAnsi="Calibri"/>
+          <w:b w:val="0"/>
+          <w:i w:val="0"/>
+        </w:rPr>
+        <w:t>ICP</w:t>
+      </w:r>
+      <w:r>
+        <w:rPr>
+          <w:rFonts w:ascii="Calibri" w:hAnsi="Calibri"/>
+          <w:b w:val="0"/>
+          <w:i w:val="0"/>
+        </w:rPr>
+        <w:t xml:space="preserve"> (iterative closest point — sliding one 3-D surface onto another until they match) for alignment and </w:t>
+      </w:r>
+      <w:r>
+        <w:rPr>
+          <w:rFonts w:ascii="Calibri" w:hAnsi="Calibri"/>
+          <w:b w:val="0"/>
+          <w:i w:val="0"/>
+        </w:rPr>
+        <w:t>NMAD</w:t>
+      </w:r>
+      <w:r>
+        <w:rPr>
+          <w:rFonts w:ascii="Calibri" w:hAnsi="Calibri"/>
+          <w:b w:val="0"/>
+          <w:i w:val="0"/>
+        </w:rPr>
+        <w:t xml:space="preserve"> (normalized median absolute deviation — a standard deviation that ignores outliers) for honest error bars; the errors follow a </w:t>
       </w:r>
       <w:r>
         <w:rPr>
@@ -341,23 +389,7 @@
           <w:b w:val="0"/>
           <w:i w:val="0"/>
         </w:rPr>
-        <w:t xml:space="preserve"> error modeling, and outlier-robust </w:t>
-      </w:r>
-      <w:r>
-        <w:rPr>
-          <w:rFonts w:ascii="Calibri" w:hAnsi="Calibri"/>
-          <w:b w:val="0"/>
-          <w:i w:val="0"/>
-        </w:rPr>
-        <w:t>NMAD</w:t>
-      </w:r>
-      <w:r>
-        <w:rPr>
-          <w:rFonts w:ascii="Calibri" w:hAnsi="Calibri"/>
-          <w:b w:val="0"/>
-          <w:i w:val="0"/>
-        </w:rPr>
-        <w:t xml:space="preserve"> uncertainty prove free REMA satellite DEMs are accurate enough for centimeter-to-meter stream-corridor change detection. 3. </w:t>
+        <w:t xml:space="preserve"> (sharp-peaked, heavy-tailed) distribution rather than a Gaussian, which is why the robust statistic is required. 3. </w:t>
       </w:r>
       <w:r>
         <w:rPr>
@@ -373,7 +405,39 @@
           <w:b w:val="0"/>
           <w:i w:val="0"/>
         </w:rPr>
-        <w:t xml:space="preserve"> DEM-of-Difference (DoD) inside segmented stream masks, level-of-detection thresholds (LOD95 = 1.96 × NMAD), and per-stream erosion/deposition and acceleration rates across four valleys and three epochs (2001 &amp; 2014 lidar, 2021–23 REMA).</w:t>
+        <w:t xml:space="preserve"> subtract one epoch's DEM from another (</w:t>
+      </w:r>
+      <w:r>
+        <w:rPr>
+          <w:rFonts w:ascii="Calibri" w:hAnsi="Calibri"/>
+          <w:b w:val="0"/>
+          <w:i w:val="0"/>
+        </w:rPr>
+        <w:t>DEM-of-Difference, DoD</w:t>
+      </w:r>
+      <w:r>
+        <w:rPr>
+          <w:rFonts w:ascii="Calibri" w:hAnsi="Calibri"/>
+          <w:b w:val="0"/>
+          <w:i w:val="0"/>
+        </w:rPr>
+        <w:t xml:space="preserve">) inside the segmented stream masks, and count only elevation changes exceeding the </w:t>
+      </w:r>
+      <w:r>
+        <w:rPr>
+          <w:rFonts w:ascii="Calibri" w:hAnsi="Calibri"/>
+          <w:b w:val="0"/>
+          <w:i w:val="0"/>
+        </w:rPr>
+        <w:t>level of detection</w:t>
+      </w:r>
+      <w:r>
+        <w:rPr>
+          <w:rFonts w:ascii="Calibri" w:hAnsi="Calibri"/>
+          <w:b w:val="0"/>
+          <w:i w:val="0"/>
+        </w:rPr>
+        <w:t xml:space="preserve"> (LOD95 = 1.96 × NMAD — the smallest change distinguishable from measurement noise at 95% confidence). This yields per-stream erosion/deposition and acceleration rates across four valleys and three epochs (2001 &amp; 2014 lidar, 2021–23 REMA).</w:t>
       </w:r>
     </w:p>
     <w:p>
@@ -744,7 +808,7 @@
                 <w:i w:val="0"/>
                 <w:sz w:val="18"/>
               </w:rPr>
-              <w:t xml:space="preserve"> Pair per-stream gross/net/acceleration rates with energy-balance drivers, air/ground temperature, insolation, </w:t>
+              <w:t xml:space="preserve"> Match each stream's measured change rate against the factors that could be driving it: air and ground temperature, sunshine, </w:t>
             </w:r>
             <w:r>
               <w:rPr>
@@ -753,7 +817,7 @@
                 <w:i w:val="0"/>
                 <w:sz w:val="18"/>
               </w:rPr>
-              <w:t>positive-degree-days (PDD)</w:t>
+              <w:t>positive degree-days (PDD</w:t>
             </w:r>
             <w:r>
               <w:rPr>
@@ -762,7 +826,25 @@
                 <w:i w:val="0"/>
                 <w:sz w:val="18"/>
               </w:rPr>
-              <w:t>, melt-season discharge, glacier mass balance, active-layer depth, from MDV-LTER + ERA5/AMPS reanalysis.</w:t>
+              <w:t xml:space="preserve"> — a running total of how much warm weather the season delivered</w:t>
+            </w:r>
+            <w:r>
+              <w:rPr>
+                <w:rFonts w:ascii="Calibri" w:hAnsi="Calibri"/>
+                <w:b w:val="0"/>
+                <w:i w:val="0"/>
+                <w:sz w:val="18"/>
+              </w:rPr>
+              <w:t>)</w:t>
+            </w:r>
+            <w:r>
+              <w:rPr>
+                <w:rFonts w:ascii="Calibri" w:hAnsi="Calibri"/>
+                <w:b w:val="0"/>
+                <w:i w:val="0"/>
+                <w:sz w:val="18"/>
+              </w:rPr>
+              <w:t>, melt-season water flow, glacier mass balance, and summer thaw depth. All driver data come from the MDV-LTER station network plus the ERA5/AMPS weather models.</w:t>
             </w:r>
           </w:p>
         </w:tc>
@@ -791,7 +873,7 @@
                 <w:i w:val="0"/>
                 <w:sz w:val="18"/>
               </w:rPr>
-              <w:t xml:space="preserve"> Geomorphic flux is governed by </w:t>
+              <w:t xml:space="preserve"> What controls how much sediment a stream moves is </w:t>
             </w:r>
             <w:r>
               <w:rPr>
@@ -809,7 +891,7 @@
                 <w:i w:val="0"/>
                 <w:sz w:val="18"/>
               </w:rPr>
-              <w:t>, not raw water volume; a PDD/insolation-based energy model predicts per-stream gross rate better than discharge alone (and explains the residual scatter in Fig. 4).</w:t>
+              <w:t xml:space="preserve"> — the total melting heat the season delivered — not simply how much water passed through. A heat-based model should predict each stream's rate better than water volume alone, and explain the scatter that water volume leaves behind.</w:t>
             </w:r>
           </w:p>
         </w:tc>
@@ -880,7 +962,7 @@
                 <w:i w:val="0"/>
                 <w:sz w:val="18"/>
               </w:rPr>
-              <w:t xml:space="preserve"> Make the terrain-only segmenter robust across sensors (lidar 2001/2014 ↔ REMA) and all four valleys; quantify and </w:t>
+              <w:t xml:space="preserve"> The detector works best on airborne lidar. Measure exactly how the satellite DEMs disagree with lidar (the </w:t>
             </w:r>
             <w:r>
               <w:rPr>
@@ -889,7 +971,7 @@
                 <w:i w:val="0"/>
                 <w:sz w:val="18"/>
               </w:rPr>
-              <w:t>correct the lidar→satellite domain shift</w:t>
+              <w:t>domain shift</w:t>
             </w:r>
             <w:r>
               <w:rPr>
@@ -898,7 +980,7 @@
                 <w:i w:val="0"/>
                 <w:sz w:val="18"/>
               </w:rPr>
-              <w:t xml:space="preserve"> that limits the satellite epoch.</w:t>
+              <w:t>), correct for it, and show the detector performs nearly as well on satellite data — across all four valleys, not just Taylor.</w:t>
             </w:r>
           </w:p>
         </w:tc>
@@ -927,7 +1009,7 @@
                 <w:i w:val="0"/>
                 <w:sz w:val="18"/>
               </w:rPr>
-              <w:t xml:space="preserve"> A sensor-aware normalization (per-pixel slope/aspect-conditioned bias correction) closes most of the lidar–REMA F1 gap, recovering near-lidar segmentation on REMA.</w:t>
+              <w:t xml:space="preserve"> Most of the lidar-vs-satellite performance gap is predictable, terrain-dependent measurement bias. Correcting that bias per pixel (using slope and aspect) recovers near-lidar accuracy on REMA.</w:t>
             </w:r>
           </w:p>
         </w:tc>
@@ -998,25 +1080,7 @@
                 <w:i w:val="0"/>
                 <w:sz w:val="18"/>
               </w:rPr>
-              <w:t xml:space="preserve"> Extend the Laplacian/NMAD/LOD framework into a </w:t>
-            </w:r>
-            <w:r>
-              <w:rPr>
-                <w:rFonts w:ascii="Calibri" w:hAnsi="Calibri"/>
-                <w:b w:val="0"/>
-                <w:i w:val="0"/>
-                <w:sz w:val="18"/>
-              </w:rPr>
-              <w:t>per-pixel, sensor-aware confidence layer</w:t>
-            </w:r>
-            <w:r>
-              <w:rPr>
-                <w:rFonts w:ascii="Calibri" w:hAnsi="Calibri"/>
-                <w:b w:val="0"/>
-                <w:i w:val="0"/>
-                <w:sz w:val="18"/>
-              </w:rPr>
-              <w:t xml:space="preserve"> so every change map ships with calibrated uncertainty.</w:t>
+              <w:t xml:space="preserve"> Replace the single valley-wide noise estimate with a per-pixel one that accounts for slope, aspect, and sensor — so every change map ships with an error bar you can defend.</w:t>
             </w:r>
           </w:p>
         </w:tc>
@@ -1045,7 +1109,7 @@
                 <w:i w:val="0"/>
                 <w:sz w:val="18"/>
               </w:rPr>
-              <w:t xml:space="preserve"> Conditioning NMAD on slope, aspect, and sensor yields LOD maps whose empirical exceedance matches the nominal 95%, a trustworthy-EO product.</w:t>
+              <w:t xml:space="preserve"> A 95%-confidence detection threshold built this way actually behaves like one: on ground that did not change, only ~5% of pixels exceed it.</w:t>
             </w:r>
           </w:p>
         </w:tc>
@@ -1144,7 +1208,7 @@
           <w:b w:val="0"/>
           <w:i w:val="0"/>
         </w:rPr>
-        <w:t>Data (free/public; see §6).</w:t>
+        <w:t>Data (all free/public; see §6).</w:t>
       </w:r>
       <w:r>
         <w:rPr>
@@ -1152,55 +1216,7 @@
           <w:b w:val="0"/>
           <w:i w:val="0"/>
         </w:rPr>
-        <w:t xml:space="preserve"> Elevation backbone: MDV airborne lidar 2001 (NASA ATM, 2 m) + 2014 (NCALM, 1 m), and REMA v2.0 (2 m, 2021–23). Per-epoch derivatives, elevation, slope, aspect, </w:t>
-      </w:r>
-      <w:r>
-        <w:rPr>
-          <w:rFonts w:ascii="Calibri" w:hAnsi="Calibri"/>
-          <w:b w:val="0"/>
-          <w:i w:val="0"/>
-        </w:rPr>
-        <w:t>profile curvature</w:t>
-      </w:r>
-      <w:r>
-        <w:rPr>
-          <w:rFonts w:ascii="Calibri" w:hAnsi="Calibri"/>
-          <w:b w:val="0"/>
-          <w:i w:val="0"/>
-        </w:rPr>
-        <w:t xml:space="preserve"> (signed), </w:t>
-      </w:r>
-      <w:r>
-        <w:rPr>
-          <w:rFonts w:ascii="Calibri" w:hAnsi="Calibri"/>
-          <w:b w:val="0"/>
-          <w:i w:val="0"/>
-        </w:rPr>
-        <w:t>MFD flow accumulation</w:t>
-      </w:r>
-      <w:r>
-        <w:rPr>
-          <w:rFonts w:ascii="Calibri" w:hAnsi="Calibri"/>
-          <w:b w:val="0"/>
-          <w:i w:val="0"/>
-        </w:rPr>
-        <w:t xml:space="preserve">, lidar intensity. Drivers: MDV-LTER meteorology (Lake Bonney), </w:t>
-      </w:r>
-      <w:r>
-        <w:rPr>
-          <w:rFonts w:ascii="Calibri" w:hAnsi="Calibri"/>
-          <w:b w:val="0"/>
-          <w:i w:val="0"/>
-        </w:rPr>
-        <w:t>21 stream-discharge gauges</w:t>
-      </w:r>
-      <w:r>
-        <w:rPr>
-          <w:rFonts w:ascii="Calibri" w:hAnsi="Calibri"/>
-          <w:b w:val="0"/>
-          <w:i w:val="0"/>
-        </w:rPr>
-        <w:t>, glacier mass balance (7 glaciers), continuous soil T/EC/VWC (active-layer proxy); ERA5 monthly 1993–2024 and AMPS 2.67-km for spatial gap-fill. Labels: MCM-LTER stream centerlines (public stand-in for Barlow's access-gated 217 hand-digitized tiles, see §7 risk).</w:t>
+        <w:t xml:space="preserve"> Three elevation snapshots form the backbone: 2001 airborne lidar (NASA ATM, 2 m), 2014 airborne lidar (NCALM, 1 m), and the REMA satellite DEM (2 m, 2021–23). From each snapshot the pipeline derives the terrain layers the detector reads: elevation, slope, aspect, curvature, flow accumulation (a "where water would go" map), and lidar intensity. Driver data come from the MDV-LTER station network — meteorology, 21 stream-discharge gauges, mass balance for 7 glaciers, and soil temperature/moisture (a proxy for summer thaw depth) — with the ERA5 and AMPS weather models filling the gaps between stations. Training labels: the public MCM-LTER stream centerlines, standing in for Barlow's access-gated 217 hand-digitized tiles (§7 risk).</w:t>
       </w:r>
     </w:p>
     <w:p>
@@ -1221,7 +1237,7 @@
           <w:b w:val="0"/>
           <w:i w:val="0"/>
         </w:rPr>
-        <w:t xml:space="preserve"> For each gauged stream and epoch, the proposed work will (i) compute gross/net geomorphic rate by DoD inside the channel mask (operational, Fig. 2); (ii) build a per-stream </w:t>
+        <w:t xml:space="preserve"> For each gauged stream and epoch, the proposed work will (i) measure the stream's change rate — the DoD inside its channel mask (already operational, Fig. 2); (ii) build that stream's </w:t>
       </w:r>
       <w:r>
         <w:rPr>
@@ -1229,7 +1245,7 @@
           <w:b w:val="0"/>
           <w:i w:val="0"/>
         </w:rPr>
-        <w:t>energy time series</w:t>
+        <w:t>energy history</w:t>
       </w:r>
       <w:r>
         <w:rPr>
@@ -1237,7 +1253,7 @@
           <w:b w:val="0"/>
           <w:i w:val="0"/>
         </w:rPr>
-        <w:t xml:space="preserve">, melt-season PDD and incoming shortwave from LTER + ERA5/AMPS, cumulative discharge, and active-layer depth; (iii) fit hierarchical regression / random-forest models of rate vs. drivers, with leave-one-stream-out cross-validation; and (iv) test H1 by comparing an energy-balance predictor against discharge-only (the raw-discharge relationship in Fig. 5 is real but incomplete). Acceleration (3-epoch Taylor streams) will be regressed against driver </w:t>
+        <w:t xml:space="preserve">: how much warm weather (PDD), sunlight, water flow, and thaw depth it experienced, from the LTER stations plus ERA5/AMPS; (iii) fit statistical models (hierarchical regression and random forests) relating rate to drivers, always testing each model on streams it never saw during fitting; and (iv) test H1 head-to-head — does melt energy predict the rates better than water volume alone? (The water-only relationship in Fig. 5 is real but incomplete.) For the Taylor streams with all three epochs, the </w:t>
       </w:r>
       <w:r>
         <w:rPr>
@@ -1245,7 +1261,7 @@
           <w:b w:val="0"/>
           <w:i/>
         </w:rPr>
-        <w:t>trends</w:t>
+        <w:t>change</w:t>
       </w:r>
       <w:r>
         <w:rPr>
@@ -1253,7 +1269,23 @@
           <w:b w:val="0"/>
           <w:i w:val="0"/>
         </w:rPr>
-        <w:t>.</w:t>
+        <w:t xml:space="preserve"> in rate (acceleration) will be compared against the </w:t>
+      </w:r>
+      <w:r>
+        <w:rPr>
+          <w:rFonts w:ascii="Calibri" w:hAnsi="Calibri"/>
+          <w:b w:val="0"/>
+          <w:i/>
+        </w:rPr>
+        <w:t>trend</w:t>
+      </w:r>
+      <w:r>
+        <w:rPr>
+          <w:rFonts w:ascii="Calibri" w:hAnsi="Calibri"/>
+          <w:b w:val="0"/>
+          <w:i w:val="0"/>
+        </w:rPr>
+        <w:t xml:space="preserve"> in each driver.</w:t>
       </w:r>
     </w:p>
     <w:p>
@@ -1274,7 +1306,7 @@
           <w:b w:val="0"/>
           <w:i w:val="0"/>
         </w:rPr>
-        <w:t xml:space="preserve"> The work will quantify the lidar→REMA domain shift over stable terrain as a function of slope/aspect, learn a correction, retrain/fine-tune the segmenter with sensor augmentation, and evaluate F1 across all four valleys and both sensor regimes. The FI's prior work applying this architecture to a different landscape (§5) shows it transfers across sensors and biomes.</w:t>
+        <w:t xml:space="preserve"> The work will first measure how the satellite and lidar elevations disagree over ground that has not changed, and how that disagreement depends on slope and aspect. It will then learn a correction for the disagreement, retrain the segmenter with both sensors represented in its training data, and score accuracy (F1) across all four valleys and both sensor types. The FI's prior work applying this same architecture to a completely different landscape (§5) shows it transfers across sensors and biomes.</w:t>
       </w:r>
     </w:p>
     <w:p>
@@ -1295,7 +1327,7 @@
           <w:b w:val="0"/>
           <w:i w:val="0"/>
         </w:rPr>
-        <w:t xml:space="preserve"> The work will replace the single global NMAD with NMAD conditioned on (slope, aspect, sensor), emit a per-pixel LOD raster, and validate calibration by checking that observed sub-LOD residual fractions match nominal confidence on held-out stable terrain (Fig. 4 shows the global version; Laplacian fits the residuals far better than Gaussian).</w:t>
+        <w:t xml:space="preserve"> The work will replace the single global noise estimate with one that varies by slope, aspect, and sensor, and publish it as a per-pixel detection-threshold map. Calibration will be verified the honest way: on held-out ground that did not change, a 95% threshold should be exceeded by only ~5% of pixels. (Fig. 4 shows today's valley-wide version.)</w:t>
       </w:r>
     </w:p>
     <w:p>
@@ -1442,20 +1474,15 @@
           <w:b w:val="0"/>
           <w:i w:val="0"/>
         </w:rPr>
-        <w:t xml:space="preserve"> *DEM-of-Difference over the same Taylor Valley stream-corridor window, only</w:t>
+        <w:t xml:space="preserve"> </w:t>
       </w:r>
-    </w:p>
-    <w:p>
-      <w:pPr>
-        <w:spacing w:after="120"/>
-      </w:pPr>
       <w:r>
         <w:rPr>
           <w:rFonts w:ascii="Calibri" w:hAnsi="Calibri"/>
           <w:b w:val="0"/>
-          <w:i w:val="0"/>
+          <w:i/>
         </w:rPr>
-        <w:t>|Δz| &gt; LOD95 shown. (a) 2001→2014 lidar–lidar; (b) 2014→2021-23 lidar–REMA. Coherent erosion/deposition patterns emerge above the noise floor; REMA auto-reprojected from EPSG:3031 to the lidar grid. The large flat signal in (a) is Lake Fryxell's ~1.5 m level rise, detected and excluded from all stream rates by an automated standing-water screen.*</w:t>
+        <w:t>Elevation change over the same Taylor Valley stream-corridor window in two periods: (a) 2001→2014, comparing two lidar surveys; (b) 2014→2021-23, comparing lidar against the REMA satellite DEM. Red = surface lowered (erosion), blue = surface raised (deposition). Pixels are drawn only where the change exceeds the detection floor (LOD95) — i.e., is too large to be measurement noise — and coherent erosion/deposition patterns emerge above that floor. The broad flat patch in (a) is not sediment at all: Lake Fryxell rose ~1.5 m between surveys, and an automated standing-water screen detects such flat water surfaces and excludes them from every stream-rate statistic.</w:t>
       </w:r>
     </w:p>
     <w:tbl>
@@ -1820,23 +1847,7 @@
           <w:b w:val="0"/>
           <w:i w:val="0"/>
         </w:rPr>
-        <w:t xml:space="preserve">Point-to-point </w:t>
-      </w:r>
-      <w:r>
-        <w:rPr>
-          <w:rFonts w:ascii="Calibri" w:hAnsi="Calibri"/>
-          <w:b w:val="0"/>
-          <w:i w:val="0"/>
-        </w:rPr>
-        <w:t>ICP</w:t>
-      </w:r>
-      <w:r>
-        <w:rPr>
-          <w:rFonts w:ascii="Calibri" w:hAnsi="Calibri"/>
-          <w:b w:val="0"/>
-          <w:i w:val="0"/>
-        </w:rPr>
-        <w:t xml:space="preserve"> converged with fitness 0.95 m² (mean-squared correspondence distance) and improved DoD NMAD on high-relief windows; on the flat valley floor it correctly added no benefit, exactly the relief-dependence Barlow's point-to-plane ICP exhibits.</w:t>
+        <w:t>ICP alignment behaved exactly as Barlow's published version does: it tightened the error budget on steep, high-relief windows and correctly added no benefit on the flat valley floor (alignment needs terrain shape to grip onto). Convergence fitness was 0.95 m² mean-squared point distance.</w:t>
       </w:r>
     </w:p>
     <w:p>
@@ -1920,23 +1931,7 @@
           <w:b w:val="0"/>
           <w:i/>
         </w:rPr>
-        <w:t xml:space="preserve">Per-stream </w:t>
-      </w:r>
-      <w:r>
-        <w:rPr>
-          <w:rFonts w:ascii="Calibri" w:hAnsi="Calibri"/>
-          <w:b w:val="0"/>
-          <w:i/>
-        </w:rPr>
-        <w:t>specific</w:t>
-      </w:r>
-      <w:r>
-        <w:rPr>
-          <w:rFonts w:ascii="Calibri" w:hAnsi="Calibri"/>
-          <w:b w:val="0"/>
-          <w:i/>
-        </w:rPr>
-        <w:t xml:space="preserve"> (area-normalized, mm/yr) gross and net sediment-flux rates for six gauged Taylor Valley streams, both epochs, channels masked to MCM-LTER centerlines. Specific rates are used because the valid-data footprint differs between epochs (the 2001 ATM lidar swath is narrower than REMA coverage), so raw m³/yr totals would confound real change with coverage.</w:t>
+        <w:t>How much sediment each of six gauged Taylor Valley streams moved, per year, in each period. Rates are reported per square meter of channel (mm/yr of surface change) rather than as raw m³/yr totals: the surveys do not all cover the same footprint (the 2001 lidar swath is narrower than the satellite coverage), and a per-area rate cannot be inflated simply because one survey saw more ground.</w:t>
       </w:r>
     </w:p>
     <w:p>
@@ -2020,7 +2015,7 @@
           <w:b w:val="0"/>
           <w:i/>
         </w:rPr>
-        <w:t xml:space="preserve">Stable-terrain DoD residuals are sharply </w:t>
+        <w:t xml:space="preserve">The measurement noise, profiled on ground that should not have changed at all. The error histogram is sharply peaked with heavy tails (a </w:t>
       </w:r>
       <w:r>
         <w:rPr>
@@ -2036,7 +2031,7 @@
           <w:b w:val="0"/>
           <w:i/>
         </w:rPr>
-        <w:t>, not Gaussian, the fat tails would inflate a σ-based LOD. This reproduces Barlow's NMAD/Laplacian finding and is the launch point for the proposed per-pixel calibrated-uncertainty layer (O3).</w:t>
+        <w:t xml:space="preserve"> shape), not the familiar bell curve: a handful of large outliers would wildly inflate a naive standard-deviation-based detection threshold, which is why the outlier-resistant NMAD is used instead. This reproduces Barlow's error-model finding and is the launch point for the proposed per-pixel calibrated-uncertainty layer (O3).</w:t>
       </w:r>
     </w:p>
     <w:p>
@@ -2120,7 +2115,7 @@
           <w:b w:val="0"/>
           <w:i/>
         </w:rPr>
-        <w:t xml:space="preserve">Per-stream geomorphic rate vs. mean gauged melt discharge (log-log; lake-level signal screened out). In the lidar–lidar epoch the </w:t>
+        <w:t xml:space="preserve">The first attribution signal: each stream's sediment-movement rate plotted against how much meltwater it carried (mean gauged discharge; both axes logarithmic; the lake signal from Fig. 2 screened out). In the 2001→2014 period the relationship is strong — correlation </w:t>
       </w:r>
       <w:r>
         <w:rPr>
@@ -2128,7 +2123,7 @@
           <w:b w:val="0"/>
           <w:i/>
         </w:rPr>
-        <w:t>specific (area-normalized) rate scales strongly with discharge: Pearson r = +0.95 (p = 0.004), Spearman ρ = +0.94 (p = 0.005)</w:t>
+        <w:t>r = +0.95 (p = 0.004)</w:t>
       </w:r>
       <w:r>
         <w:rPr>
@@ -2136,7 +2131,23 @@
           <w:b w:val="0"/>
           <w:i/>
         </w:rPr>
-        <w:t xml:space="preserve">, and the relationship survives leaving out any single stream. The REMA epoch shows no coherent relation under sparse post-2015 gauge coverage (48–362 gauged days per stream) and is plotted without a fit. This motivates O1 directly: where gauges are dense the melt–sediment link is strong, so the proposed work will replace patchy gauging with </w:t>
+        <w:t xml:space="preserve">, rank correlation </w:t>
+      </w:r>
+      <w:r>
+        <w:rPr>
+          <w:rFonts w:ascii="Calibri" w:hAnsi="Calibri"/>
+          <w:b w:val="0"/>
+          <w:i/>
+        </w:rPr>
+        <w:t>ρ = +0.94 (p = 0.005)</w:t>
+      </w:r>
+      <w:r>
+        <w:rPr>
+          <w:rFonts w:ascii="Calibri" w:hAnsi="Calibri"/>
+          <w:b w:val="0"/>
+          <w:i/>
+        </w:rPr>
+        <w:t xml:space="preserve"> — and it survives dropping any single stream, so it is not driven by one outlier. The satellite period shows no coherent relation, but for an instructive reason: after 2015 the stream gauges ran only sporadically (48–362 recorded days per stream), so the water axis itself is unreliable there, and no trend line is fit. That is precisely the motivation for O1: where gauge data are dense the melt–sediment link is strong, so the proposed work replaces patchy gauging with </w:t>
       </w:r>
       <w:r>
         <w:rPr>
@@ -2152,7 +2163,7 @@
           <w:b w:val="0"/>
           <w:i/>
         </w:rPr>
-        <w:t xml:space="preserve"> (PDD/insolation/active-layer) to extend attribution across epochs and valleys, turning correlation into attribution.</w:t>
+        <w:t xml:space="preserve"> (degree-days, sunlight, thaw depth) to extend the analysis across all epochs and valleys.</w:t>
       </w:r>
     </w:p>
     <w:p>

</xml_diff>

<commit_message>
barlow: FINESST compliance pass — NASA-relevance blocks, OSDMP, readiness statement
- Relevance to NASA added to formal + basic S/T/M (scored criterion was missing)
- finesst_osdmp.md: 2-pp Open Science & Data Management Plan (anonymized)
- finesst_readiness_statement.md: 1-p RRS skeleton with [placeholders]
- basic skills para trimmed (substance belongs in the RRS)
- FLAG: formal variant renders 8 pp, over the 6-pp cap; trim pass needed

Co-Authored-By: Claude Fable 5 <noreply@anthropic.com>
</commit_message>
<xml_diff>
--- a/barlow/docs/finesst_proposal.docx
+++ b/barlow/docs/finesst_proposal.docx
@@ -623,6 +623,27 @@
           <w:i/>
         </w:rPr>
         <w:t>From detection (Barlow 2026; the first four stages) to the proposed attribution and prediction science (last two stages, the new contribution of this project).</w:t>
+      </w:r>
+    </w:p>
+    <w:p>
+      <w:pPr>
+        <w:spacing w:after="120"/>
+      </w:pPr>
+      <w:r>
+        <w:rPr>
+          <w:rFonts w:ascii="Calibri" w:hAnsi="Calibri"/>
+          <w:b w:val="0"/>
+          <w:i w:val="0"/>
+        </w:rPr>
+        <w:t>Relevance to NASA.</w:t>
+      </w:r>
+      <w:r>
+        <w:rPr>
+          <w:rFonts w:ascii="Calibri" w:hAnsi="Calibri"/>
+          <w:b w:val="0"/>
+          <w:i w:val="0"/>
+        </w:rPr>
+        <w:t xml:space="preserve"> The 2001 baseline epoch is NASA data — an ATM airborne lidar campaign — that has never been fully exploited for surface change. The proposed work converts that NASA archive, the free REMA satellite record, and reanalysis into a continuing, uncertainty-calibrated measurement of climate-driven surface change in Earth's largest ice-free Antarctic region, serving the Earth Science Division's cryosphere and Earth-surface-change focus areas. The methodological deliverables generalize: terrain-only feature detection (O2) and calibrated per-pixel change thresholds (O3) apply to any elevation-differencing record, including those produced by ICESat-2 and NISAR. The MDVs are also the canonical terrestrial analog for cold-desert planetary surfaces — a long-standing NASA investment this project extends with open, reusable tools. The FI development itself is Division-aligned: open geospatial data, machine learning on remote sensing, and honest uncertainty quantification.</w:t>
       </w:r>
     </w:p>
     <w:p>
@@ -4297,7 +4318,7 @@
         <w:color w:val="666666"/>
         <w:sz w:val="16"/>
       </w:rPr>
-      <w:t>FINESST S/T/M: MDV ephemeral-channel attribution (draft)</w:t>
+      <w:t>From Detection to Attribution: Linking Two Decades of Antarctic Stream-Channel Change to Its Climate Drivers, from Terrain Data Alone</w:t>
       <w:tab/>
       <w:tab/>
     </w:r>

</xml_diff>

<commit_message>
barlow: scrub preliminary-work bravado from formal + plain proposal variants
The 07-01 'don't over-talk preliminary work' instruction had only been applied
to the formal variant; the plain summary still claimed 'I've already rebuilt
and verified the existing pipeline myself.' Both variants now use neutral
factual pointers to their prelim sections; 'already X' claims softened
throughout; plain S6 moved from first-person 'myself' to 'The FI has'
(AI-assisted work must not be overclaimed; dual-anonymous review reads
first-person swagger badly). Factual S4/S5 sections kept; basic variant was
already clean.

Co-Authored-By: Claude Fable 5 <noreply@anthropic.com>
</commit_message>
<xml_diff>
--- a/barlow/docs/finesst_proposal.docx
+++ b/barlow/docs/finesst_proposal.docx
@@ -11,75 +11,6 @@
           <w:sz w:val="36"/>
         </w:rPr>
         <w:t>From Detection to Attribution: Linking Two Decades of Antarctic Stream-Channel Change to Its Climate Drivers, from Terrain Data Alone</w:t>
-      </w:r>
-    </w:p>
-    <w:p>
-      <w:pPr>
-        <w:spacing w:after="160"/>
-        <w:jc w:val="center"/>
-      </w:pPr>
-      <w:r>
-        <w:rPr>
-          <w:rFonts w:ascii="Calibri" w:hAnsi="Calibri"/>
-          <w:b w:val="0"/>
-          <w:i/>
-          <w:color w:val="666666"/>
-          <w:sz w:val="18"/>
-        </w:rPr>
-        <w:t>NASA ROSES-2025 F.5: Future Investigators in NASA Earth and Space Science and Technology (FINESST)</w:t>
-      </w:r>
-    </w:p>
-    <w:p>
-      <w:pPr>
-        <w:spacing w:after="120"/>
-      </w:pPr>
-      <w:r>
-        <w:rPr>
-          <w:rFonts w:ascii="Calibri" w:hAnsi="Calibri"/>
-          <w:b w:val="0"/>
-          <w:i w:val="0"/>
-        </w:rPr>
-        <w:t>Target division:</w:t>
-      </w:r>
-      <w:r>
-        <w:rPr>
-          <w:rFonts w:ascii="Calibri" w:hAnsi="Calibri"/>
-          <w:b w:val="0"/>
-          <w:i w:val="0"/>
-        </w:rPr>
-        <w:t xml:space="preserve"> Earth Science Division (EARTH25), Antarctic cryosphere / climate </w:t>
-      </w:r>
-      <w:r>
-        <w:rPr>
-          <w:rFonts w:ascii="Calibri" w:hAnsi="Calibri"/>
-          <w:b w:val="0"/>
-          <w:i w:val="0"/>
-        </w:rPr>
-        <w:t>Proposal deadline:</w:t>
-      </w:r>
-      <w:r>
-        <w:rPr>
-          <w:rFonts w:ascii="Calibri" w:hAnsi="Calibri"/>
-          <w:b w:val="0"/>
-          <w:i w:val="0"/>
-        </w:rPr>
-        <w:t xml:space="preserve"> 14 July 2026 (11:59 PM EDT) </w:t>
-      </w:r>
-      <w:r>
-        <w:rPr>
-          <w:rFonts w:ascii="Calibri" w:hAnsi="Calibri"/>
-          <w:b w:val="0"/>
-          <w:i w:val="0"/>
-        </w:rPr>
-        <w:t>Structure:</w:t>
-      </w:r>
-      <w:r>
-        <w:rPr>
-          <w:rFonts w:ascii="Calibri" w:hAnsi="Calibri"/>
-          <w:b w:val="0"/>
-          <w:i w:val="0"/>
-        </w:rPr>
-        <w:t xml:space="preserve"> Graduate student = Future Investigator (FI), primary author and intellectual lead; faculty advisor = PI of record. Award up to ~$50,000/yr for up to 3 years.</w:t>
       </w:r>
     </w:p>
     <w:p>
@@ -193,7 +124,7 @@
           <w:i w:val="0"/>
           <w:sz w:val="20"/>
         </w:rPr>
-        <w:t xml:space="preserve"> Can every change map carry an honest, per-pixel error bar? The measurement foundation is already running and reproduces Barlow's published uncertainty ranges, and a first driver signal is shown in §4.</w:t>
+        <w:t xml:space="preserve"> Can every change map carry an honest, per-pixel error bar? §4 presents a reproduction of the measurement foundation from public data, with uncertainty inside Barlow's published ranges, and a first driver signal.</w:t>
       </w:r>
     </w:p>
     <w:p>
@@ -829,7 +760,7 @@
                 <w:i w:val="0"/>
                 <w:sz w:val="18"/>
               </w:rPr>
-              <w:t xml:space="preserve"> Match each stream's measured change rate against the factors that could be driving it: air and ground temperature, sunshine, </w:t>
+              <w:t xml:space="preserve"> Match each stream's measured change rate against candidate drivers — temperature (as </w:t>
             </w:r>
             <w:r>
               <w:rPr>
@@ -838,7 +769,7 @@
                 <w:i w:val="0"/>
                 <w:sz w:val="18"/>
               </w:rPr>
-              <w:t>positive degree-days (PDD</w:t>
+              <w:t>positive degree-days, PDD</w:t>
             </w:r>
             <w:r>
               <w:rPr>
@@ -847,25 +778,7 @@
                 <w:i w:val="0"/>
                 <w:sz w:val="18"/>
               </w:rPr>
-              <w:t xml:space="preserve"> — a running total of how much warm weather the season delivered</w:t>
-            </w:r>
-            <w:r>
-              <w:rPr>
-                <w:rFonts w:ascii="Calibri" w:hAnsi="Calibri"/>
-                <w:b w:val="0"/>
-                <w:i w:val="0"/>
-                <w:sz w:val="18"/>
-              </w:rPr>
-              <w:t>)</w:t>
-            </w:r>
-            <w:r>
-              <w:rPr>
-                <w:rFonts w:ascii="Calibri" w:hAnsi="Calibri"/>
-                <w:b w:val="0"/>
-                <w:i w:val="0"/>
-                <w:sz w:val="18"/>
-              </w:rPr>
-              <w:t>, melt-season water flow, glacier mass balance, and summer thaw depth. All driver data come from the MDV-LTER station network plus the ERA5/AMPS weather models.</w:t>
+              <w:t>: a running total of melting weather), sunlight, discharge, glacier mass balance, thaw depth — from the MDV-LTER network plus ERA5/AMPS.</w:t>
             </w:r>
           </w:p>
         </w:tc>
@@ -894,7 +807,7 @@
                 <w:i w:val="0"/>
                 <w:sz w:val="18"/>
               </w:rPr>
-              <w:t xml:space="preserve"> What controls how much sediment a stream moves is </w:t>
+              <w:t xml:space="preserve"> </w:t>
             </w:r>
             <w:r>
               <w:rPr>
@@ -912,7 +825,7 @@
                 <w:i w:val="0"/>
                 <w:sz w:val="18"/>
               </w:rPr>
-              <w:t xml:space="preserve"> — the total melting heat the season delivered — not simply how much water passed through. A heat-based model should predict each stream's rate better than water volume alone, and explain the scatter that water volume leaves behind.</w:t>
+              <w:t>, not water volume alone, controls sediment movement — a heat-based model predicts each stream's rate better than discharge and explains the scatter discharge leaves behind.</w:t>
             </w:r>
           </w:p>
         </w:tc>
@@ -983,7 +896,7 @@
                 <w:i w:val="0"/>
                 <w:sz w:val="18"/>
               </w:rPr>
-              <w:t xml:space="preserve"> The detector works best on airborne lidar. Measure exactly how the satellite DEMs disagree with lidar (the </w:t>
+              <w:t xml:space="preserve"> Measure exactly how satellite DEMs disagree with lidar (the </w:t>
             </w:r>
             <w:r>
               <w:rPr>
@@ -1001,7 +914,7 @@
                 <w:i w:val="0"/>
                 <w:sz w:val="18"/>
               </w:rPr>
-              <w:t>), correct for it, and show the detector performs nearly as well on satellite data — across all four valleys, not just Taylor.</w:t>
+              <w:t>), correct it, and show near-lidar detector performance on satellite data across all four valleys.</w:t>
             </w:r>
           </w:p>
         </w:tc>
@@ -1030,7 +943,7 @@
                 <w:i w:val="0"/>
                 <w:sz w:val="18"/>
               </w:rPr>
-              <w:t xml:space="preserve"> Most of the lidar-vs-satellite performance gap is predictable, terrain-dependent measurement bias. Correcting that bias per pixel (using slope and aspect) recovers near-lidar accuracy on REMA.</w:t>
+              <w:t xml:space="preserve"> most of the sensor gap is predictable, terrain-dependent bias; correcting it per pixel (slope, aspect) recovers near-lidar accuracy on REMA.</w:t>
             </w:r>
           </w:p>
         </w:tc>
@@ -1101,7 +1014,7 @@
                 <w:i w:val="0"/>
                 <w:sz w:val="18"/>
               </w:rPr>
-              <w:t xml:space="preserve"> Replace the single valley-wide noise estimate with a per-pixel one that accounts for slope, aspect, and sensor — so every change map ships with an error bar you can defend.</w:t>
+              <w:t xml:space="preserve"> Replace the single valley-wide noise estimate with a per-pixel threshold that accounts for slope, aspect, and sensor.</w:t>
             </w:r>
           </w:p>
         </w:tc>
@@ -1130,7 +1043,7 @@
                 <w:i w:val="0"/>
                 <w:sz w:val="18"/>
               </w:rPr>
-              <w:t xml:space="preserve"> A 95%-confidence detection threshold built this way actually behaves like one: on ground that did not change, only ~5% of pixels exceed it.</w:t>
+              <w:t xml:space="preserve"> a 95% threshold built this way behaves like one — on unchanged ground, only ~5% of pixels exceed it.</w:t>
             </w:r>
           </w:p>
         </w:tc>
@@ -1258,7 +1171,7 @@
           <w:b w:val="0"/>
           <w:i w:val="0"/>
         </w:rPr>
-        <w:t xml:space="preserve"> For each gauged stream and epoch, the proposed work will (i) measure the stream's change rate — the DoD inside its channel mask (already operational, Fig. 2); (ii) build that stream's </w:t>
+        <w:t xml:space="preserve"> For each gauged stream and epoch: (i) measure the change rate — the DoD inside its channel mask (demonstrated in §4, Fig. 2); (ii) build the stream's </w:t>
       </w:r>
       <w:r>
         <w:rPr>
@@ -1274,7 +1187,7 @@
           <w:b w:val="0"/>
           <w:i w:val="0"/>
         </w:rPr>
-        <w:t xml:space="preserve">: how much warm weather (PDD), sunlight, water flow, and thaw depth it experienced, from the LTER stations plus ERA5/AMPS; (iii) fit statistical models (hierarchical regression and random forests) relating rate to drivers, always testing each model on streams it never saw during fitting; and (iv) test H1 head-to-head — does melt energy predict the rates better than water volume alone? (The water-only relationship in Fig. 5 is real but incomplete.) For the Taylor streams with all three epochs, the </w:t>
+        <w:t xml:space="preserve"> (PDD, sunlight, discharge, thaw depth) from LTER stations plus ERA5/AMPS; (iii) fit hierarchical regression and random-forest models relating rate to drivers, always validating on streams held out of fitting; (iv) test H1 head-to-head — does melt energy predict rates better than water volume alone? For the Taylor streams with all three epochs, the </w:t>
       </w:r>
       <w:r>
         <w:rPr>
@@ -1290,7 +1203,7 @@
           <w:b w:val="0"/>
           <w:i w:val="0"/>
         </w:rPr>
-        <w:t xml:space="preserve"> in rate (acceleration) will be compared against the </w:t>
+        <w:t xml:space="preserve"> in rate (acceleration) is compared against the </w:t>
       </w:r>
       <w:r>
         <w:rPr>
@@ -1369,7 +1282,7 @@
           <w:b w:val="0"/>
           <w:i w:val="0"/>
         </w:rPr>
-        <w:t xml:space="preserve"> The pipeline is fully scripted, input data and all derivatives regenerate from source, with robust statistics and CRS checks enforced at every step (e.g., an early QC catch, a 2001 nodata bug inflating NMAD to 2.7 m, was identified and fixed).</w:t>
+        <w:t xml:space="preserve"> The pipeline is fully scripted; input data and all derivatives regenerate from source, with robust statistics and CRS checks enforced at every step.</w:t>
       </w:r>
     </w:p>
     <w:p>
@@ -1403,7 +1316,7 @@
           <w:b w:val="0"/>
           <w:i w:val="0"/>
         </w:rPr>
-        <w:t xml:space="preserve">The change-detection foundation the proposed work builds on is already operational. A reproduction of Barlow's change detection on Taylor Valley falls </w:t>
+        <w:t xml:space="preserve">A reproduction of Barlow's change detection on Taylor Valley, built from public data, falls </w:t>
       </w:r>
       <w:r>
         <w:rPr>
@@ -1503,7 +1416,7 @@
           <w:b w:val="0"/>
           <w:i/>
         </w:rPr>
-        <w:t>Elevation change over the same Taylor Valley stream-corridor window in two periods: (a) 2001→2014, comparing two lidar surveys; (b) 2014→2021-23, comparing lidar against the REMA satellite DEM. Red = surface lowered (erosion), blue = surface raised (deposition). Pixels are drawn only where the change exceeds the detection floor (LOD95) — i.e., is too large to be measurement noise — and coherent erosion/deposition patterns emerge above that floor. The broad flat patch in (a) is not sediment at all: Lake Fryxell rose ~1.5 m between surveys, and an automated standing-water screen detects such flat water surfaces and excludes them from every stream-rate statistic.</w:t>
+        <w:t>Elevation change over the same Taylor Valley window: (a) 2001→2014 (lidar–lidar); (b) 2014→2021-23 (lidar–REMA). Red = erosion, blue = deposition; only changes exceeding LOD95 are drawn. The flat patch in (a) is Lake Fryxell's ~1.5 m rise — an automated standing-water screen detects and excludes such surfaces from every stream-rate statistic.</w:t>
       </w:r>
     </w:p>
     <w:tbl>
@@ -1868,7 +1781,7 @@
           <w:b w:val="0"/>
           <w:i w:val="0"/>
         </w:rPr>
-        <w:t>ICP alignment behaved exactly as Barlow's published version does: it tightened the error budget on steep, high-relief windows and correctly added no benefit on the flat valley floor (alignment needs terrain shape to grip onto). Convergence fitness was 0.95 m² mean-squared point distance.</w:t>
+        <w:t>ICP alignment behaved exactly as Barlow's published version does: it tightened the error budget on steep windows and correctly added no benefit on the flat valley floor.</w:t>
       </w:r>
     </w:p>
     <w:p>
@@ -1952,7 +1865,7 @@
           <w:b w:val="0"/>
           <w:i/>
         </w:rPr>
-        <w:t>How much sediment each of six gauged Taylor Valley streams moved, per year, in each period. Rates are reported per square meter of channel (mm/yr of surface change) rather than as raw m³/yr totals: the surveys do not all cover the same footprint (the 2001 lidar swath is narrower than the satellite coverage), and a per-area rate cannot be inflated simply because one survey saw more ground.</w:t>
+        <w:t>Per-stream sediment rates for six gauged Taylor Valley streams, reported per square meter of channel (mm/yr): the survey footprints differ across epochs, and a per-area rate cannot be inflated simply because one survey saw more ground.</w:t>
       </w:r>
     </w:p>
     <w:p>
@@ -2036,7 +1949,7 @@
           <w:b w:val="0"/>
           <w:i/>
         </w:rPr>
-        <w:t xml:space="preserve">The measurement noise, profiled on ground that should not have changed at all. The error histogram is sharply peaked with heavy tails (a </w:t>
+        <w:t>Measurement noise profiled on unchanged ground: sharply peaked with heavy tails (</w:t>
       </w:r>
       <w:r>
         <w:rPr>
@@ -2052,7 +1965,7 @@
           <w:b w:val="0"/>
           <w:i/>
         </w:rPr>
-        <w:t xml:space="preserve"> shape), not the familiar bell curve: a handful of large outliers would wildly inflate a naive standard-deviation-based detection threshold, which is why the outlier-resistant NMAD is used instead. This reproduces Barlow's error-model finding and is the launch point for the proposed per-pixel calibrated-uncertainty layer (O3).</w:t>
+        <w:t>), not Gaussian — outliers would inflate a naive standard-deviation threshold, hence NMAD. Reproduces Barlow's error-model finding; launch point for O3.</w:t>
       </w:r>
     </w:p>
     <w:p>
@@ -2136,7 +2049,7 @@
           <w:b w:val="0"/>
           <w:i/>
         </w:rPr>
-        <w:t xml:space="preserve">The first attribution signal: each stream's sediment-movement rate plotted against how much meltwater it carried (mean gauged discharge; both axes logarithmic; the lake signal from Fig. 2 screened out). In the 2001→2014 period the relationship is strong — correlation </w:t>
+        <w:t xml:space="preserve">The first attribution signal: per-stream sediment rate vs mean gauged discharge (log-log; lake signal screened). In 2001→2014 the relationship is strong — </w:t>
       </w:r>
       <w:r>
         <w:rPr>
@@ -2152,7 +2065,7 @@
           <w:b w:val="0"/>
           <w:i/>
         </w:rPr>
-        <w:t xml:space="preserve">, rank correlation </w:t>
+        <w:t xml:space="preserve">, </w:t>
       </w:r>
       <w:r>
         <w:rPr>
@@ -2168,7 +2081,7 @@
           <w:b w:val="0"/>
           <w:i/>
         </w:rPr>
-        <w:t xml:space="preserve"> — and it survives dropping any single stream, so it is not driven by one outlier. The satellite period shows no coherent relation, but for an instructive reason: after 2015 the stream gauges ran only sporadically (48–362 recorded days per stream), so the water axis itself is unreliable there, and no trend line is fit. That is precisely the motivation for O1: where gauge data are dense the melt–sediment link is strong, so the proposed work replaces patchy gauging with </w:t>
+        <w:t xml:space="preserve"> — and survives dropping any single stream. The satellite period shows no coherent relation for an instructive reason: post-2015 gauging is sparse (48–362 recorded days per stream), so no fit is drawn. That is the O1 motivation — replace patchy gauging with </w:t>
       </w:r>
       <w:r>
         <w:rPr>
@@ -2184,7 +2097,7 @@
           <w:b w:val="0"/>
           <w:i/>
         </w:rPr>
-        <w:t xml:space="preserve"> (degree-days, sunlight, thaw depth) to extend the analysis across all epochs and valleys.</w:t>
+        <w:t xml:space="preserve"> to extend attribution across all epochs and valleys.</w:t>
       </w:r>
     </w:p>
     <w:p>
@@ -2234,7 +2147,7 @@
           <w:b w:val="0"/>
           <w:i w:val="0"/>
         </w:rPr>
-        <w:t>, and that the FI already commands the full pipeline end to end.</w:t>
+        <w:t>, and that the FI commands the full pipeline end to end.</w:t>
       </w:r>
     </w:p>
     <w:p>
@@ -2284,7 +2197,7 @@
           <w:b w:val="0"/>
           <w:i w:val="0"/>
         </w:rPr>
-        <w:t xml:space="preserve"> and already in hand (regenerable from source via scripted pipelines), so data availability poses no schedule risk. The single access-gated dependency is Barlow's training labels (mitigated below and in §7).</w:t>
+        <w:t xml:space="preserve"> (regenerable from source via scripted pipelines), so data availability poses no schedule risk. The single access-gated dependency is Barlow's training labels (mitigated below and in §7).</w:t>
       </w:r>
     </w:p>
     <w:tbl>
@@ -3970,7 +3883,7 @@
           <w:b w:val="0"/>
           <w:i w:val="0"/>
         </w:rPr>
-        <w:t xml:space="preserve"> → mitigation: LTER centerlines already work as a QC stand-in (Fig. 2–3 built on them); plan to request the tiles and, failing that, re-digitize a comparable training set (the FI's prior work shows label generation is in hand). (2) </w:t>
+        <w:t xml:space="preserve"> → mitigation: LTER centerlines work as a QC stand-in (Fig. 2–3 use them); plan to request the tiles and, failing that, re-digitize a comparable training set (the FI's prior work shows label generation is in hand). (2) </w:t>
       </w:r>
       <w:r>
         <w:rPr>

</xml_diff>

<commit_message>
barlow: ALL proposal variants plan-only — preliminary results + figures removed
Standing rule per user: assume no preliminary work exists. Formal S4 (prelim
results, Figs 2-5, NMAD table) and plain S5 deleted; workflow Fig 1 removed;
every figure cross-ref scrubbed from summaries, methodology, data tables,
timelines, risks; data-table status column -> availability (public, free);
Yr-1 timeline now includes building the change-detection chain. Rendered:
formal 5 pp, plain 4 pp, basic 4 pp (all under the 6-pp cap).
finesst_figures/ kept in-repo for internal use only; README records the rule.

Co-Authored-By: Claude Fable 5 <noreply@anthropic.com>
</commit_message>
<xml_diff>
--- a/barlow/docs/finesst_proposal.docx
+++ b/barlow/docs/finesst_proposal.docx
@@ -124,7 +124,7 @@
           <w:i w:val="0"/>
           <w:sz w:val="20"/>
         </w:rPr>
-        <w:t xml:space="preserve"> Can every change map carry an honest, per-pixel error bar? §4 presents a reproduction of the measurement foundation from public data, with uncertainty inside Barlow's published ranges, and a first driver signal.</w:t>
+        <w:t xml:space="preserve"> Can every change map carry an honest, per-pixel error bar?</w:t>
       </w:r>
     </w:p>
     <w:p>
@@ -485,75 +485,7 @@
           <w:b w:val="0"/>
           <w:i w:val="0"/>
         </w:rPr>
-        <w:t xml:space="preserve"> tool (Fig. 1). This is a genuine scientific increment, not a replication.</w:t>
-      </w:r>
-    </w:p>
-    <w:p>
-      <w:pPr>
-        <w:jc w:val="center"/>
-      </w:pPr>
-      <w:r>
-        <w:drawing>
-          <wp:inline xmlns:a="http://schemas.openxmlformats.org/drawingml/2006/main" xmlns:pic="http://schemas.openxmlformats.org/drawingml/2006/picture">
-            <wp:extent cx="6126480" cy="1921738"/>
-            <wp:docPr id="1" name="Picture 1"/>
-            <wp:cNvGraphicFramePr>
-              <a:graphicFrameLocks noChangeAspect="1"/>
-            </wp:cNvGraphicFramePr>
-            <a:graphic>
-              <a:graphicData uri="http://schemas.openxmlformats.org/drawingml/2006/picture">
-                <pic:pic>
-                  <pic:nvPicPr>
-                    <pic:cNvPr id="0" name="fig5_workflow.png"/>
-                    <pic:cNvPicPr/>
-                  </pic:nvPicPr>
-                  <pic:blipFill>
-                    <a:blip r:embed="rId9"/>
-                    <a:stretch>
-                      <a:fillRect/>
-                    </a:stretch>
-                  </pic:blipFill>
-                  <pic:spPr>
-                    <a:xfrm>
-                      <a:off x="0" y="0"/>
-                      <a:ext cx="6126480" cy="1921738"/>
-                    </a:xfrm>
-                    <a:prstGeom prst="rect"/>
-                  </pic:spPr>
-                </pic:pic>
-              </a:graphicData>
-            </a:graphic>
-          </wp:inline>
-        </w:drawing>
-      </w:r>
-    </w:p>
-    <w:p>
-      <w:pPr>
-        <w:spacing w:after="120"/>
-      </w:pPr>
-      <w:r>
-        <w:rPr>
-          <w:rFonts w:ascii="Calibri" w:hAnsi="Calibri"/>
-          <w:b w:val="0"/>
-          <w:i/>
-        </w:rPr>
-        <w:t>Figure 1.</w:t>
-      </w:r>
-      <w:r>
-        <w:rPr>
-          <w:rFonts w:ascii="Calibri" w:hAnsi="Calibri"/>
-          <w:b w:val="0"/>
-          <w:i w:val="0"/>
-        </w:rPr>
-        <w:t xml:space="preserve"> </w:t>
-      </w:r>
-      <w:r>
-        <w:rPr>
-          <w:rFonts w:ascii="Calibri" w:hAnsi="Calibri"/>
-          <w:b w:val="0"/>
-          <w:i/>
-        </w:rPr>
-        <w:t>From detection (Barlow 2026; the first four stages) to the proposed attribution and prediction science (last two stages, the new contribution of this project).</w:t>
+        <w:t xml:space="preserve"> tool. This is a genuine scientific increment, not a replication.</w:t>
       </w:r>
     </w:p>
     <w:p>
@@ -1142,7 +1074,7 @@
           <w:b w:val="0"/>
           <w:i w:val="0"/>
         </w:rPr>
-        <w:t>Data (all free/public; see §6).</w:t>
+        <w:t>Data (all free/public; see §5).</w:t>
       </w:r>
       <w:r>
         <w:rPr>
@@ -1150,7 +1082,7 @@
           <w:b w:val="0"/>
           <w:i w:val="0"/>
         </w:rPr>
-        <w:t xml:space="preserve"> Three elevation snapshots form the backbone: 2001 airborne lidar (NASA ATM, 2 m), 2014 airborne lidar (NCALM, 1 m), and the REMA satellite DEM (2 m, 2021–23). From each snapshot the pipeline derives the terrain layers the detector reads: elevation, slope, aspect, curvature, flow accumulation (a "where water would go" map), and lidar intensity. Driver data come from the MDV-LTER station network — meteorology, 21 stream-discharge gauges, mass balance for 7 glaciers, and soil temperature/moisture (a proxy for summer thaw depth) — with the ERA5 and AMPS weather models filling the gaps between stations. Training labels: the public MCM-LTER stream centerlines, standing in for Barlow's access-gated 217 hand-digitized tiles (§7 risk).</w:t>
+        <w:t xml:space="preserve"> Three elevation snapshots form the backbone: 2001 airborne lidar (NASA ATM, 2 m), 2014 airborne lidar (NCALM, 1 m), and the REMA satellite DEM (2 m, 2021–23). From each snapshot the pipeline derives the terrain layers the detector reads: elevation, slope, aspect, curvature, flow accumulation (a "where water would go" map), and lidar intensity. Driver data come from the MDV-LTER station network — meteorology, 21 stream-discharge gauges, mass balance for 7 glaciers, and soil temperature/moisture (a proxy for summer thaw depth) — with the ERA5 and AMPS weather models filling the gaps between stations. Training labels: the public MCM-LTER stream centerlines, standing in for Barlow's access-gated 217 hand-digitized tiles (§6 risk).</w:t>
       </w:r>
     </w:p>
     <w:p>
@@ -1171,7 +1103,7 @@
           <w:b w:val="0"/>
           <w:i w:val="0"/>
         </w:rPr>
-        <w:t xml:space="preserve"> For each gauged stream and epoch: (i) measure the change rate — the DoD inside its channel mask (demonstrated in §4, Fig. 2); (ii) build the stream's </w:t>
+        <w:t xml:space="preserve"> For each gauged stream and epoch: (i) measure the change rate — the DoD inside its channel mask; (ii) build the stream's </w:t>
       </w:r>
       <w:r>
         <w:rPr>
@@ -1240,7 +1172,7 @@
           <w:b w:val="0"/>
           <w:i w:val="0"/>
         </w:rPr>
-        <w:t xml:space="preserve"> The work will first measure how the satellite and lidar elevations disagree over ground that has not changed, and how that disagreement depends on slope and aspect. It will then learn a correction for the disagreement, retrain the segmenter with both sensors represented in its training data, and score accuracy (F1) across all four valleys and both sensor types. The FI's prior work applying this same architecture to a completely different landscape (§5) shows it transfers across sensors and biomes.</w:t>
+        <w:t xml:space="preserve"> The work will first measure how the satellite and lidar elevations disagree over ground that has not changed, and how that disagreement depends on slope and aspect. It will then learn a correction for the disagreement, retrain the segmenter with both sensors represented in its training data, and score accuracy (F1) across all four valleys and both sensor types. The FI's prior work applying this same architecture to a completely different landscape (§4) shows it transfers across sensors and biomes.</w:t>
       </w:r>
     </w:p>
     <w:p>
@@ -1261,7 +1193,7 @@
           <w:b w:val="0"/>
           <w:i w:val="0"/>
         </w:rPr>
-        <w:t xml:space="preserve"> The work will replace the single global noise estimate with one that varies by slope, aspect, and sensor, and publish it as a per-pixel detection-threshold map. Calibration will be verified the honest way: on held-out ground that did not change, a 95% threshold should be exceeded by only ~5% of pixels. (Fig. 4 shows today's valley-wide version.)</w:t>
+        <w:t xml:space="preserve"> The work will replace the single global noise estimate with one that varies by slope, aspect, and sensor, and publish it as a per-pixel detection-threshold map. Calibration will be verified the honest way: on held-out ground that did not change, a 95% threshold should be exceeded by only ~5% of pixels.</w:t>
       </w:r>
     </w:p>
     <w:p>
@@ -1303,822 +1235,7 @@
           <w:i w:val="0"/>
           <w:sz w:val="24"/>
         </w:rPr>
-        <w:t>4. Preliminary Results</w:t>
-      </w:r>
-    </w:p>
-    <w:p>
-      <w:pPr>
-        <w:spacing w:after="120"/>
-      </w:pPr>
-      <w:r>
-        <w:rPr>
-          <w:rFonts w:ascii="Calibri" w:hAnsi="Calibri"/>
-          <w:b w:val="0"/>
-          <w:i w:val="0"/>
-        </w:rPr>
-        <w:t xml:space="preserve">A reproduction of Barlow's change detection on Taylor Valley, built from public data, falls </w:t>
-      </w:r>
-      <w:r>
-        <w:rPr>
-          <w:rFonts w:ascii="Calibri" w:hAnsi="Calibri"/>
-          <w:b w:val="0"/>
-          <w:i w:val="0"/>
-        </w:rPr>
-        <w:t>inside her published uncertainty ranges</w:t>
-      </w:r>
-      <w:r>
-        <w:rPr>
-          <w:rFonts w:ascii="Calibri" w:hAnsi="Calibri"/>
-          <w:b w:val="0"/>
-          <w:i w:val="0"/>
-        </w:rPr>
-        <w:t xml:space="preserve"> (below), and an initial driver analysis surfaces the first attribution signal that O1 will develop.</w:t>
-      </w:r>
-    </w:p>
-    <w:p>
-      <w:pPr>
-        <w:spacing w:after="160"/>
-        <w:jc w:val="center"/>
-      </w:pPr>
-      <w:r>
-        <w:rPr>
-          <w:rFonts w:ascii="Calibri" w:hAnsi="Calibri"/>
-          <w:b w:val="0"/>
-          <w:i/>
-          <w:color w:val="666666"/>
-          <w:sz w:val="18"/>
-        </w:rPr>
-        <w:t>(a) Change detection across all three epochs (Fig. 2).</w:t>
-      </w:r>
-    </w:p>
-    <w:p>
-      <w:pPr>
-        <w:jc w:val="center"/>
-      </w:pPr>
-      <w:r>
-        <w:drawing>
-          <wp:inline xmlns:a="http://schemas.openxmlformats.org/drawingml/2006/main" xmlns:pic="http://schemas.openxmlformats.org/drawingml/2006/picture">
-            <wp:extent cx="6126480" cy="2718502"/>
-            <wp:docPr id="2" name="Picture 2"/>
-            <wp:cNvGraphicFramePr>
-              <a:graphicFrameLocks noChangeAspect="1"/>
-            </wp:cNvGraphicFramePr>
-            <a:graphic>
-              <a:graphicData uri="http://schemas.openxmlformats.org/drawingml/2006/picture">
-                <pic:pic>
-                  <pic:nvPicPr>
-                    <pic:cNvPr id="0" name="fig1_dod_maps.png"/>
-                    <pic:cNvPicPr/>
-                  </pic:nvPicPr>
-                  <pic:blipFill>
-                    <a:blip r:embed="rId10"/>
-                    <a:stretch>
-                      <a:fillRect/>
-                    </a:stretch>
-                  </pic:blipFill>
-                  <pic:spPr>
-                    <a:xfrm>
-                      <a:off x="0" y="0"/>
-                      <a:ext cx="6126480" cy="2718502"/>
-                    </a:xfrm>
-                    <a:prstGeom prst="rect"/>
-                  </pic:spPr>
-                </pic:pic>
-              </a:graphicData>
-            </a:graphic>
-          </wp:inline>
-        </w:drawing>
-      </w:r>
-    </w:p>
-    <w:p>
-      <w:pPr>
-        <w:spacing w:after="120"/>
-      </w:pPr>
-      <w:r>
-        <w:rPr>
-          <w:rFonts w:ascii="Calibri" w:hAnsi="Calibri"/>
-          <w:b w:val="0"/>
-          <w:i/>
-        </w:rPr>
-        <w:t>Figure 2.</w:t>
-      </w:r>
-      <w:r>
-        <w:rPr>
-          <w:rFonts w:ascii="Calibri" w:hAnsi="Calibri"/>
-          <w:b w:val="0"/>
-          <w:i w:val="0"/>
-        </w:rPr>
-        <w:t xml:space="preserve"> </w:t>
-      </w:r>
-      <w:r>
-        <w:rPr>
-          <w:rFonts w:ascii="Calibri" w:hAnsi="Calibri"/>
-          <w:b w:val="0"/>
-          <w:i/>
-        </w:rPr>
-        <w:t>Elevation change over the same Taylor Valley window: (a) 2001→2014 (lidar–lidar); (b) 2014→2021-23 (lidar–REMA). Red = erosion, blue = deposition; only changes exceeding LOD95 are drawn. The flat patch in (a) is Lake Fryxell's ~1.5 m rise — an automated standing-water screen detects and excludes such surfaces from every stream-rate statistic.</w:t>
-      </w:r>
-    </w:p>
-    <w:tbl>
-      <w:tblPr>
-        <w:tblStyle w:val="TableGrid"/>
-        <w:tblW w:type="auto" w:w="0"/>
-        <w:jc w:val="center"/>
-        <w:tblLayout w:type="autofit"/>
-        <w:tblLook w:firstColumn="1" w:firstRow="1" w:lastColumn="0" w:lastRow="0" w:noHBand="0" w:noVBand="1" w:val="04A0"/>
-      </w:tblPr>
-      <w:tblGrid>
-        <w:gridCol w:w="1930"/>
-        <w:gridCol w:w="1930"/>
-        <w:gridCol w:w="1930"/>
-        <w:gridCol w:w="1930"/>
-        <w:gridCol w:w="1930"/>
-      </w:tblGrid>
-      <w:tr>
-        <w:tc>
-          <w:tcPr>
-            <w:tcW w:type="dxa" w:w="1930"/>
-            <w:shd w:val="clear" w:fill="E8E8E8"/>
-          </w:tcPr>
-          <w:p>
-            <w:pPr>
-              <w:spacing w:after="20"/>
-            </w:pPr>
-            <w:r>
-              <w:rPr>
-                <w:b/>
-              </w:rPr>
-            </w:r>
-            <w:r>
-              <w:rPr>
-                <w:rFonts w:ascii="Calibri" w:hAnsi="Calibri"/>
-                <w:b/>
-                <w:i w:val="0"/>
-                <w:sz w:val="18"/>
-              </w:rPr>
-              <w:t>Epoch pair</w:t>
-            </w:r>
-          </w:p>
-        </w:tc>
-        <w:tc>
-          <w:tcPr>
-            <w:tcW w:type="dxa" w:w="1930"/>
-            <w:shd w:val="clear" w:fill="E8E8E8"/>
-          </w:tcPr>
-          <w:p>
-            <w:pPr>
-              <w:spacing w:after="20"/>
-            </w:pPr>
-            <w:r>
-              <w:rPr>
-                <w:b/>
-              </w:rPr>
-            </w:r>
-            <w:r>
-              <w:rPr>
-                <w:rFonts w:ascii="Calibri" w:hAnsi="Calibri"/>
-                <w:b/>
-                <w:i w:val="0"/>
-                <w:sz w:val="18"/>
-              </w:rPr>
-              <w:t>NMAD</w:t>
-            </w:r>
-          </w:p>
-        </w:tc>
-        <w:tc>
-          <w:tcPr>
-            <w:tcW w:type="dxa" w:w="1930"/>
-            <w:shd w:val="clear" w:fill="E8E8E8"/>
-          </w:tcPr>
-          <w:p>
-            <w:pPr>
-              <w:spacing w:after="20"/>
-            </w:pPr>
-            <w:r>
-              <w:rPr>
-                <w:b/>
-              </w:rPr>
-            </w:r>
-            <w:r>
-              <w:rPr>
-                <w:rFonts w:ascii="Calibri" w:hAnsi="Calibri"/>
-                <w:b/>
-                <w:i w:val="0"/>
-                <w:sz w:val="18"/>
-              </w:rPr>
-              <w:t>LOD95</w:t>
-            </w:r>
-          </w:p>
-        </w:tc>
-        <w:tc>
-          <w:tcPr>
-            <w:tcW w:type="dxa" w:w="1930"/>
-            <w:shd w:val="clear" w:fill="E8E8E8"/>
-          </w:tcPr>
-          <w:p>
-            <w:pPr>
-              <w:spacing w:after="20"/>
-            </w:pPr>
-            <w:r>
-              <w:rPr>
-                <w:b/>
-              </w:rPr>
-            </w:r>
-            <w:r>
-              <w:rPr>
-                <w:rFonts w:ascii="Calibri" w:hAnsi="Calibri"/>
-                <w:b/>
-                <w:i w:val="0"/>
-                <w:sz w:val="18"/>
-              </w:rPr>
-              <w:t>Barlow's published range</w:t>
-            </w:r>
-          </w:p>
-        </w:tc>
-        <w:tc>
-          <w:tcPr>
-            <w:tcW w:type="dxa" w:w="1930"/>
-            <w:shd w:val="clear" w:fill="E8E8E8"/>
-          </w:tcPr>
-          <w:p>
-            <w:pPr>
-              <w:spacing w:after="20"/>
-            </w:pPr>
-            <w:r>
-              <w:rPr>
-                <w:b/>
-              </w:rPr>
-            </w:r>
-            <w:r>
-              <w:rPr>
-                <w:rFonts w:ascii="Calibri" w:hAnsi="Calibri"/>
-                <w:b/>
-                <w:i w:val="0"/>
-                <w:sz w:val="18"/>
-              </w:rPr>
-              <w:t>In range?</w:t>
-            </w:r>
-          </w:p>
-        </w:tc>
-      </w:tr>
-      <w:tr>
-        <w:tc>
-          <w:tcPr>
-            <w:tcW w:type="dxa" w:w="1930"/>
-          </w:tcPr>
-          <w:p>
-            <w:pPr>
-              <w:spacing w:after="20"/>
-            </w:pPr>
-            <w:r/>
-            <w:r>
-              <w:rPr>
-                <w:rFonts w:ascii="Calibri" w:hAnsi="Calibri"/>
-                <w:b w:val="0"/>
-                <w:i w:val="0"/>
-                <w:sz w:val="18"/>
-              </w:rPr>
-              <w:t>2001→2014 (lidar–lidar)</w:t>
-            </w:r>
-          </w:p>
-        </w:tc>
-        <w:tc>
-          <w:tcPr>
-            <w:tcW w:type="dxa" w:w="1930"/>
-          </w:tcPr>
-          <w:p>
-            <w:pPr>
-              <w:spacing w:after="20"/>
-            </w:pPr>
-            <w:r/>
-            <w:r>
-              <w:rPr>
-                <w:rFonts w:ascii="Calibri" w:hAnsi="Calibri"/>
-                <w:b w:val="0"/>
-                <w:i w:val="0"/>
-                <w:sz w:val="18"/>
-              </w:rPr>
-              <w:t>0.21 m</w:t>
-            </w:r>
-          </w:p>
-        </w:tc>
-        <w:tc>
-          <w:tcPr>
-            <w:tcW w:type="dxa" w:w="1930"/>
-          </w:tcPr>
-          <w:p>
-            <w:pPr>
-              <w:spacing w:after="20"/>
-            </w:pPr>
-            <w:r/>
-            <w:r>
-              <w:rPr>
-                <w:rFonts w:ascii="Calibri" w:hAnsi="Calibri"/>
-                <w:b w:val="0"/>
-                <w:i w:val="0"/>
-                <w:sz w:val="18"/>
-              </w:rPr>
-              <w:t>0.41 m</w:t>
-            </w:r>
-          </w:p>
-        </w:tc>
-        <w:tc>
-          <w:tcPr>
-            <w:tcW w:type="dxa" w:w="1930"/>
-          </w:tcPr>
-          <w:p>
-            <w:pPr>
-              <w:spacing w:after="20"/>
-            </w:pPr>
-            <w:r/>
-            <w:r>
-              <w:rPr>
-                <w:rFonts w:ascii="Calibri" w:hAnsi="Calibri"/>
-                <w:b w:val="0"/>
-                <w:i w:val="0"/>
-                <w:sz w:val="18"/>
-              </w:rPr>
-              <w:t>NMAD 0.07–0.46 / LOD95 0.15–0.92</w:t>
-            </w:r>
-          </w:p>
-        </w:tc>
-        <w:tc>
-          <w:tcPr>
-            <w:tcW w:type="dxa" w:w="1930"/>
-          </w:tcPr>
-          <w:p>
-            <w:pPr>
-              <w:spacing w:after="20"/>
-            </w:pPr>
-            <w:r/>
-            <w:r>
-              <w:rPr>
-                <w:rFonts w:ascii="Calibri" w:hAnsi="Calibri"/>
-                <w:b w:val="0"/>
-                <w:i w:val="0"/>
-                <w:sz w:val="18"/>
-              </w:rPr>
-              <w:t>✅</w:t>
-            </w:r>
-          </w:p>
-        </w:tc>
-      </w:tr>
-      <w:tr>
-        <w:tc>
-          <w:tcPr>
-            <w:tcW w:type="dxa" w:w="1930"/>
-          </w:tcPr>
-          <w:p>
-            <w:pPr>
-              <w:spacing w:after="20"/>
-            </w:pPr>
-            <w:r/>
-            <w:r>
-              <w:rPr>
-                <w:rFonts w:ascii="Calibri" w:hAnsi="Calibri"/>
-                <w:b w:val="0"/>
-                <w:i w:val="0"/>
-                <w:sz w:val="18"/>
-              </w:rPr>
-              <w:t>2014→2021-23 (lidar–REMA)</w:t>
-            </w:r>
-          </w:p>
-        </w:tc>
-        <w:tc>
-          <w:tcPr>
-            <w:tcW w:type="dxa" w:w="1930"/>
-          </w:tcPr>
-          <w:p>
-            <w:pPr>
-              <w:spacing w:after="20"/>
-            </w:pPr>
-            <w:r/>
-            <w:r>
-              <w:rPr>
-                <w:rFonts w:ascii="Calibri" w:hAnsi="Calibri"/>
-                <w:b w:val="0"/>
-                <w:i w:val="0"/>
-                <w:sz w:val="18"/>
-              </w:rPr>
-              <w:t>0.23 m</w:t>
-            </w:r>
-          </w:p>
-        </w:tc>
-        <w:tc>
-          <w:tcPr>
-            <w:tcW w:type="dxa" w:w="1930"/>
-          </w:tcPr>
-          <w:p>
-            <w:pPr>
-              <w:spacing w:after="20"/>
-            </w:pPr>
-            <w:r/>
-            <w:r>
-              <w:rPr>
-                <w:rFonts w:ascii="Calibri" w:hAnsi="Calibri"/>
-                <w:b w:val="0"/>
-                <w:i w:val="0"/>
-                <w:sz w:val="18"/>
-              </w:rPr>
-              <w:t>0.44 m</w:t>
-            </w:r>
-          </w:p>
-        </w:tc>
-        <w:tc>
-          <w:tcPr>
-            <w:tcW w:type="dxa" w:w="1930"/>
-          </w:tcPr>
-          <w:p>
-            <w:pPr>
-              <w:spacing w:after="20"/>
-            </w:pPr>
-            <w:r/>
-            <w:r>
-              <w:rPr>
-                <w:rFonts w:ascii="Calibri" w:hAnsi="Calibri"/>
-                <w:b w:val="0"/>
-                <w:i w:val="0"/>
-                <w:sz w:val="18"/>
-              </w:rPr>
-              <w:t>NMAD 0.19–0.53 / LOD95 0.37–1.04</w:t>
-            </w:r>
-          </w:p>
-        </w:tc>
-        <w:tc>
-          <w:tcPr>
-            <w:tcW w:type="dxa" w:w="1930"/>
-          </w:tcPr>
-          <w:p>
-            <w:pPr>
-              <w:spacing w:after="20"/>
-            </w:pPr>
-            <w:r/>
-            <w:r>
-              <w:rPr>
-                <w:rFonts w:ascii="Calibri" w:hAnsi="Calibri"/>
-                <w:b w:val="0"/>
-                <w:i w:val="0"/>
-                <w:sz w:val="18"/>
-              </w:rPr>
-              <w:t>✅</w:t>
-            </w:r>
-          </w:p>
-        </w:tc>
-      </w:tr>
-    </w:tbl>
-    <w:p>
-      <w:pPr>
-        <w:spacing w:after="40"/>
-      </w:pPr>
-    </w:p>
-    <w:p>
-      <w:pPr>
-        <w:spacing w:after="120"/>
-      </w:pPr>
-      <w:r>
-        <w:rPr>
-          <w:rFonts w:ascii="Calibri" w:hAnsi="Calibri"/>
-          <w:b w:val="0"/>
-          <w:i w:val="0"/>
-        </w:rPr>
-        <w:t>ICP alignment behaved exactly as Barlow's published version does: it tightened the error budget on steep windows and correctly added no benefit on the flat valley floor.</w:t>
-      </w:r>
-    </w:p>
-    <w:p>
-      <w:pPr>
-        <w:spacing w:after="160"/>
-        <w:jc w:val="center"/>
-      </w:pPr>
-      <w:r>
-        <w:rPr>
-          <w:rFonts w:ascii="Calibri" w:hAnsi="Calibri"/>
-          <w:b w:val="0"/>
-          <w:i/>
-          <w:color w:val="666666"/>
-          <w:sz w:val="18"/>
-        </w:rPr>
-        <w:t>(b) Per-stream rates (Fig. 3), the masked products O1 consumes.</w:t>
-      </w:r>
-    </w:p>
-    <w:p>
-      <w:pPr>
-        <w:jc w:val="center"/>
-      </w:pPr>
-      <w:r>
-        <w:drawing>
-          <wp:inline xmlns:a="http://schemas.openxmlformats.org/drawingml/2006/main" xmlns:pic="http://schemas.openxmlformats.org/drawingml/2006/picture">
-            <wp:extent cx="6126480" cy="2598635"/>
-            <wp:docPr id="3" name="Picture 3"/>
-            <wp:cNvGraphicFramePr>
-              <a:graphicFrameLocks noChangeAspect="1"/>
-            </wp:cNvGraphicFramePr>
-            <a:graphic>
-              <a:graphicData uri="http://schemas.openxmlformats.org/drawingml/2006/picture">
-                <pic:pic>
-                  <pic:nvPicPr>
-                    <pic:cNvPr id="0" name="fig2_per_stream_rates.png"/>
-                    <pic:cNvPicPr/>
-                  </pic:nvPicPr>
-                  <pic:blipFill>
-                    <a:blip r:embed="rId11"/>
-                    <a:stretch>
-                      <a:fillRect/>
-                    </a:stretch>
-                  </pic:blipFill>
-                  <pic:spPr>
-                    <a:xfrm>
-                      <a:off x="0" y="0"/>
-                      <a:ext cx="6126480" cy="2598635"/>
-                    </a:xfrm>
-                    <a:prstGeom prst="rect"/>
-                  </pic:spPr>
-                </pic:pic>
-              </a:graphicData>
-            </a:graphic>
-          </wp:inline>
-        </w:drawing>
-      </w:r>
-    </w:p>
-    <w:p>
-      <w:pPr>
-        <w:spacing w:after="120"/>
-      </w:pPr>
-      <w:r>
-        <w:rPr>
-          <w:rFonts w:ascii="Calibri" w:hAnsi="Calibri"/>
-          <w:b w:val="0"/>
-          <w:i/>
-        </w:rPr>
-        <w:t>Figure 3.</w:t>
-      </w:r>
-      <w:r>
-        <w:rPr>
-          <w:rFonts w:ascii="Calibri" w:hAnsi="Calibri"/>
-          <w:b w:val="0"/>
-          <w:i w:val="0"/>
-        </w:rPr>
-        <w:t xml:space="preserve"> </w:t>
-      </w:r>
-      <w:r>
-        <w:rPr>
-          <w:rFonts w:ascii="Calibri" w:hAnsi="Calibri"/>
-          <w:b w:val="0"/>
-          <w:i/>
-        </w:rPr>
-        <w:t>Per-stream sediment rates for six gauged Taylor Valley streams, reported per square meter of channel (mm/yr): the survey footprints differ across epochs, and a per-area rate cannot be inflated simply because one survey saw more ground.</w:t>
-      </w:r>
-    </w:p>
-    <w:p>
-      <w:pPr>
-        <w:spacing w:after="160"/>
-        <w:jc w:val="center"/>
-      </w:pPr>
-      <w:r>
-        <w:rPr>
-          <w:rFonts w:ascii="Calibri" w:hAnsi="Calibri"/>
-          <w:b w:val="0"/>
-          <w:i/>
-          <w:color w:val="666666"/>
-          <w:sz w:val="18"/>
-        </w:rPr>
-        <w:t>(c) Robust error model (Fig. 4), the basis for O3.</w:t>
-      </w:r>
-    </w:p>
-    <w:p>
-      <w:pPr>
-        <w:jc w:val="center"/>
-      </w:pPr>
-      <w:r>
-        <w:drawing>
-          <wp:inline xmlns:a="http://schemas.openxmlformats.org/drawingml/2006/main" xmlns:pic="http://schemas.openxmlformats.org/drawingml/2006/picture">
-            <wp:extent cx="5674821" cy="3657599"/>
-            <wp:docPr id="4" name="Picture 4"/>
-            <wp:cNvGraphicFramePr>
-              <a:graphicFrameLocks noChangeAspect="1"/>
-            </wp:cNvGraphicFramePr>
-            <a:graphic>
-              <a:graphicData uri="http://schemas.openxmlformats.org/drawingml/2006/picture">
-                <pic:pic>
-                  <pic:nvPicPr>
-                    <pic:cNvPr id="0" name="fig3_error_model.png"/>
-                    <pic:cNvPicPr/>
-                  </pic:nvPicPr>
-                  <pic:blipFill>
-                    <a:blip r:embed="rId12"/>
-                    <a:stretch>
-                      <a:fillRect/>
-                    </a:stretch>
-                  </pic:blipFill>
-                  <pic:spPr>
-                    <a:xfrm>
-                      <a:off x="0" y="0"/>
-                      <a:ext cx="5674821" cy="3657599"/>
-                    </a:xfrm>
-                    <a:prstGeom prst="rect"/>
-                  </pic:spPr>
-                </pic:pic>
-              </a:graphicData>
-            </a:graphic>
-          </wp:inline>
-        </w:drawing>
-      </w:r>
-    </w:p>
-    <w:p>
-      <w:pPr>
-        <w:spacing w:after="120"/>
-      </w:pPr>
-      <w:r>
-        <w:rPr>
-          <w:rFonts w:ascii="Calibri" w:hAnsi="Calibri"/>
-          <w:b w:val="0"/>
-          <w:i/>
-        </w:rPr>
-        <w:t>Figure 4.</w:t>
-      </w:r>
-      <w:r>
-        <w:rPr>
-          <w:rFonts w:ascii="Calibri" w:hAnsi="Calibri"/>
-          <w:b w:val="0"/>
-          <w:i w:val="0"/>
-        </w:rPr>
-        <w:t xml:space="preserve"> </w:t>
-      </w:r>
-      <w:r>
-        <w:rPr>
-          <w:rFonts w:ascii="Calibri" w:hAnsi="Calibri"/>
-          <w:b w:val="0"/>
-          <w:i/>
-        </w:rPr>
-        <w:t>Measurement noise profiled on unchanged ground: sharply peaked with heavy tails (</w:t>
-      </w:r>
-      <w:r>
-        <w:rPr>
-          <w:rFonts w:ascii="Calibri" w:hAnsi="Calibri"/>
-          <w:b w:val="0"/>
-          <w:i/>
-        </w:rPr>
-        <w:t>Laplacian</w:t>
-      </w:r>
-      <w:r>
-        <w:rPr>
-          <w:rFonts w:ascii="Calibri" w:hAnsi="Calibri"/>
-          <w:b w:val="0"/>
-          <w:i/>
-        </w:rPr>
-        <w:t>), not Gaussian — outliers would inflate a naive standard-deviation threshold, hence NMAD. Reproduces Barlow's error-model finding; launch point for O3.</w:t>
-      </w:r>
-    </w:p>
-    <w:p>
-      <w:pPr>
-        <w:spacing w:after="160"/>
-        <w:jc w:val="center"/>
-      </w:pPr>
-      <w:r>
-        <w:rPr>
-          <w:rFonts w:ascii="Calibri" w:hAnsi="Calibri"/>
-          <w:b w:val="0"/>
-          <w:i/>
-          <w:color w:val="666666"/>
-          <w:sz w:val="18"/>
-        </w:rPr>
-        <w:t>(d) A first attribution signal (Fig. 5).</w:t>
-      </w:r>
-    </w:p>
-    <w:p>
-      <w:pPr>
-        <w:jc w:val="center"/>
-      </w:pPr>
-      <w:r>
-        <w:drawing>
-          <wp:inline xmlns:a="http://schemas.openxmlformats.org/drawingml/2006/main" xmlns:pic="http://schemas.openxmlformats.org/drawingml/2006/picture">
-            <wp:extent cx="6126480" cy="2695024"/>
-            <wp:docPr id="5" name="Picture 5"/>
-            <wp:cNvGraphicFramePr>
-              <a:graphicFrameLocks noChangeAspect="1"/>
-            </wp:cNvGraphicFramePr>
-            <a:graphic>
-              <a:graphicData uri="http://schemas.openxmlformats.org/drawingml/2006/picture">
-                <pic:pic>
-                  <pic:nvPicPr>
-                    <pic:cNvPr id="0" name="fig4_attribution.png"/>
-                    <pic:cNvPicPr/>
-                  </pic:nvPicPr>
-                  <pic:blipFill>
-                    <a:blip r:embed="rId13"/>
-                    <a:stretch>
-                      <a:fillRect/>
-                    </a:stretch>
-                  </pic:blipFill>
-                  <pic:spPr>
-                    <a:xfrm>
-                      <a:off x="0" y="0"/>
-                      <a:ext cx="6126480" cy="2695024"/>
-                    </a:xfrm>
-                    <a:prstGeom prst="rect"/>
-                  </pic:spPr>
-                </pic:pic>
-              </a:graphicData>
-            </a:graphic>
-          </wp:inline>
-        </w:drawing>
-      </w:r>
-    </w:p>
-    <w:p>
-      <w:pPr>
-        <w:spacing w:after="120"/>
-      </w:pPr>
-      <w:r>
-        <w:rPr>
-          <w:rFonts w:ascii="Calibri" w:hAnsi="Calibri"/>
-          <w:b w:val="0"/>
-          <w:i/>
-        </w:rPr>
-        <w:t>Figure 5.</w:t>
-      </w:r>
-      <w:r>
-        <w:rPr>
-          <w:rFonts w:ascii="Calibri" w:hAnsi="Calibri"/>
-          <w:b w:val="0"/>
-          <w:i w:val="0"/>
-        </w:rPr>
-        <w:t xml:space="preserve"> </w:t>
-      </w:r>
-      <w:r>
-        <w:rPr>
-          <w:rFonts w:ascii="Calibri" w:hAnsi="Calibri"/>
-          <w:b w:val="0"/>
-          <w:i/>
-        </w:rPr>
-        <w:t xml:space="preserve">The first attribution signal: per-stream sediment rate vs mean gauged discharge (log-log; lake signal screened). In 2001→2014 the relationship is strong — </w:t>
-      </w:r>
-      <w:r>
-        <w:rPr>
-          <w:rFonts w:ascii="Calibri" w:hAnsi="Calibri"/>
-          <w:b w:val="0"/>
-          <w:i/>
-        </w:rPr>
-        <w:t>r = +0.95 (p = 0.004)</w:t>
-      </w:r>
-      <w:r>
-        <w:rPr>
-          <w:rFonts w:ascii="Calibri" w:hAnsi="Calibri"/>
-          <w:b w:val="0"/>
-          <w:i/>
-        </w:rPr>
-        <w:t xml:space="preserve">, </w:t>
-      </w:r>
-      <w:r>
-        <w:rPr>
-          <w:rFonts w:ascii="Calibri" w:hAnsi="Calibri"/>
-          <w:b w:val="0"/>
-          <w:i/>
-        </w:rPr>
-        <w:t>ρ = +0.94 (p = 0.005)</w:t>
-      </w:r>
-      <w:r>
-        <w:rPr>
-          <w:rFonts w:ascii="Calibri" w:hAnsi="Calibri"/>
-          <w:b w:val="0"/>
-          <w:i/>
-        </w:rPr>
-        <w:t xml:space="preserve"> — and survives dropping any single stream. The satellite period shows no coherent relation for an instructive reason: post-2015 gauging is sparse (48–362 recorded days per stream), so no fit is drawn. That is the O1 motivation — replace patchy gauging with </w:t>
-      </w:r>
-      <w:r>
-        <w:rPr>
-          <w:rFonts w:ascii="Calibri" w:hAnsi="Calibri"/>
-          <w:b w:val="0"/>
-          <w:i/>
-        </w:rPr>
-        <w:t>modeled melt energy</w:t>
-      </w:r>
-      <w:r>
-        <w:rPr>
-          <w:rFonts w:ascii="Calibri" w:hAnsi="Calibri"/>
-          <w:b w:val="0"/>
-          <w:i/>
-        </w:rPr>
-        <w:t xml:space="preserve"> to extend attribution across all epochs and valleys.</w:t>
-      </w:r>
-    </w:p>
-    <w:p>
-      <w:pPr>
-        <w:pBdr>
-          <w:bottom w:val="single" w:sz="6" w:space="1" w:color="BBBBBB"/>
-        </w:pBdr>
-      </w:pPr>
-    </w:p>
-    <w:p>
-      <w:pPr>
-        <w:spacing w:before="140" w:after="60"/>
-      </w:pPr>
-      <w:r>
-        <w:rPr>
-          <w:rFonts w:ascii="Calibri" w:hAnsi="Calibri"/>
-          <w:b/>
-          <w:i w:val="0"/>
-          <w:sz w:val="24"/>
-        </w:rPr>
-        <w:t>5. FI Qualifications</w:t>
+        <w:t>4. FI Qualifications</w:t>
       </w:r>
     </w:p>
     <w:p>
@@ -2168,7 +1285,7 @@
           <w:i w:val="0"/>
           <w:sz w:val="24"/>
         </w:rPr>
-        <w:t>6. Data Requirements and Availability</w:t>
+        <w:t>5. Data Requirements and Availability</w:t>
       </w:r>
     </w:p>
     <w:p>
@@ -2197,7 +1314,7 @@
           <w:b w:val="0"/>
           <w:i w:val="0"/>
         </w:rPr>
-        <w:t xml:space="preserve"> (regenerable from source via scripted pipelines), so data availability poses no schedule risk. The single access-gated dependency is Barlow's training labels (mitigated below and in §7).</w:t>
+        <w:t>, so data availability poses no schedule risk. The single access-gated dependency is Barlow's training labels (mitigated below and in §6).</w:t>
       </w:r>
     </w:p>
     <w:tbl>
@@ -2311,7 +1428,7 @@
                 <w:i w:val="0"/>
                 <w:sz w:val="18"/>
               </w:rPr>
-              <w:t>Status</w:t>
+              <w:t>Availability</w:t>
             </w:r>
           </w:p>
         </w:tc>
@@ -2402,7 +1519,7 @@
                 <w:i w:val="0"/>
                 <w:sz w:val="18"/>
               </w:rPr>
-              <w:t>✅ in hand</w:t>
+              <w:t>public, free</w:t>
             </w:r>
           </w:p>
         </w:tc>
@@ -2493,7 +1610,7 @@
                 <w:i w:val="0"/>
                 <w:sz w:val="18"/>
               </w:rPr>
-              <w:t>✅ in hand</w:t>
+              <w:t>public, free</w:t>
             </w:r>
           </w:p>
         </w:tc>
@@ -2584,7 +1701,7 @@
                 <w:i w:val="0"/>
                 <w:sz w:val="18"/>
               </w:rPr>
-              <w:t>✅ in hand</w:t>
+              <w:t>public, free</w:t>
             </w:r>
           </w:p>
         </w:tc>
@@ -2666,7 +1783,7 @@
                 <w:i w:val="0"/>
                 <w:sz w:val="18"/>
               </w:rPr>
-              <w:t>✅ scripted; demonstrated (Taylor pilot)</w:t>
+              <w:t>computed from the DEMs</w:t>
             </w:r>
           </w:p>
         </w:tc>
@@ -2737,7 +1854,7 @@
                 <w:i w:val="0"/>
                 <w:sz w:val="18"/>
               </w:rPr>
-              <w:t>Direct discharge driver for O1 (source of the Fig. 5 signal)</w:t>
+              <w:t>Direct discharge driver for O1</w:t>
             </w:r>
           </w:p>
         </w:tc>
@@ -2757,7 +1874,7 @@
                 <w:i w:val="0"/>
                 <w:sz w:val="18"/>
               </w:rPr>
-              <w:t>✅ in hand</w:t>
+              <w:t>public, free</w:t>
             </w:r>
           </w:p>
         </w:tc>
@@ -2848,7 +1965,7 @@
                 <w:i w:val="0"/>
                 <w:sz w:val="18"/>
               </w:rPr>
-              <w:t>✅ in hand</w:t>
+              <w:t>public, free</w:t>
             </w:r>
           </w:p>
         </w:tc>
@@ -2939,7 +2056,7 @@
                 <w:i w:val="0"/>
                 <w:sz w:val="18"/>
               </w:rPr>
-              <w:t>✅ in hand</w:t>
+              <w:t>public, free</w:t>
             </w:r>
           </w:p>
         </w:tc>
@@ -3030,7 +2147,7 @@
                 <w:i w:val="0"/>
                 <w:sz w:val="18"/>
               </w:rPr>
-              <w:t>✅ in hand</w:t>
+              <w:t>public, free</w:t>
             </w:r>
           </w:p>
         </w:tc>
@@ -3061,7 +2178,7 @@
                 <w:i w:val="0"/>
                 <w:sz w:val="18"/>
               </w:rPr>
-              <w:t xml:space="preserve"> monthly 1993-2024 (Copernicus CDS); </w:t>
+              <w:t xml:space="preserve"> monthly (Copernicus CDS); </w:t>
             </w:r>
             <w:r>
               <w:rPr>
@@ -3139,7 +2256,7 @@
                 <w:i w:val="0"/>
                 <w:sz w:val="18"/>
               </w:rPr>
-              <w:t>✅ in hand</w:t>
+              <w:t>public, free</w:t>
             </w:r>
           </w:p>
         </w:tc>
@@ -3228,7 +2345,7 @@
                 <w:i w:val="0"/>
                 <w:sz w:val="18"/>
               </w:rPr>
-              <w:t>Per-stream rate masks (used in Figs. 3/5) + label stand-in</w:t>
+              <w:t>Per-stream rate masks + label stand-in</w:t>
             </w:r>
           </w:p>
         </w:tc>
@@ -3248,7 +2365,7 @@
                 <w:i w:val="0"/>
                 <w:sz w:val="18"/>
               </w:rPr>
-              <w:t>✅ in hand</w:t>
+              <w:t>public, free</w:t>
             </w:r>
           </w:p>
         </w:tc>
@@ -3357,7 +2474,7 @@
                 <w:i w:val="0"/>
                 <w:sz w:val="18"/>
               </w:rPr>
-              <w:t xml:space="preserve"> (see §7)</w:t>
+              <w:t xml:space="preserve"> (see §6)</w:t>
             </w:r>
           </w:p>
         </w:tc>
@@ -3448,7 +2565,7 @@
                 <w:i w:val="0"/>
                 <w:sz w:val="18"/>
               </w:rPr>
-              <w:t>✅ DEMs in hand; per-valley stacks to build</w:t>
+              <w:t>public, free</w:t>
             </w:r>
           </w:p>
         </w:tc>
@@ -3559,7 +2676,7 @@
           <w:i w:val="0"/>
           <w:sz w:val="24"/>
         </w:rPr>
-        <w:t>7. Management, Timeline, Risks, and Data Management Plan</w:t>
+        <w:t>6. Management, Timeline, Risks, and Data Management Plan</w:t>
       </w:r>
     </w:p>
     <w:p>
@@ -3700,7 +2817,7 @@
                 <w:i w:val="0"/>
                 <w:sz w:val="18"/>
               </w:rPr>
-              <w:t xml:space="preserve">Full driver harmonization (PDD/insolation/active-layer series per gauged stream); O1 attribution model on Taylor Valley (extending the Fig. 5 signal); calibrated-uncertainty prototype (O3). </w:t>
+              <w:t xml:space="preserve">Change-detection chain built from public data; full driver harmonization (PDD/insolation/active-layer series per gauged stream); O1 attribution model on Taylor Valley; calibrated-uncertainty prototype (O3). </w:t>
             </w:r>
             <w:r>
               <w:rPr>
@@ -3883,7 +3000,7 @@
           <w:b w:val="0"/>
           <w:i w:val="0"/>
         </w:rPr>
-        <w:t xml:space="preserve"> → mitigation: LTER centerlines work as a QC stand-in (Fig. 2–3 use them); plan to request the tiles and, failing that, re-digitize a comparable training set (the FI's prior work shows label generation is in hand). (2) </w:t>
+        <w:t xml:space="preserve"> → mitigation: the public LTER centerlines serve as a stand-in; plan to request the tiles and, failing that, re-digitize a comparable training set (the FI's prior work shows label generation is in hand). (2) </w:t>
       </w:r>
       <w:r>
         <w:rPr>
@@ -4205,11 +3322,11 @@
           <w:b w:val="0"/>
           <w:i/>
         </w:rPr>
-        <w:t>Draft S/T/M section. Figures generated by `barlow/build/_finesst_figures.py`. Not a submitted proposal.</w:t>
+        <w:t>Draft S/T/M section, written as a plan only (no preliminary work presented). Not a submitted proposal.</w:t>
       </w:r>
     </w:p>
     <w:sectPr>
-      <w:footerReference w:type="default" r:id="rId14"/>
+      <w:footerReference w:type="default" r:id="rId9"/>
       <w:pgSz w:w="12240" w:h="15840"/>
       <w:pgMar w:top="1008" w:right="1296" w:bottom="1008" w:left="1296" w:header="720" w:footer="720" w:gutter="0"/>
       <w:cols w:space="720"/>

</xml_diff>

<commit_message>
barlow: audit pass — titles match geomorphic scope, refs cited in text, DMP grammar, stale sensor-bridge line
</commit_message>
<xml_diff>
--- a/barlow/docs/finesst_proposal.docx
+++ b/barlow/docs/finesst_proposal.docx
@@ -10,7 +10,7 @@
           <w:i w:val="0"/>
           <w:sz w:val="36"/>
         </w:rPr>
-        <w:t>From Detection to Attribution: Linking Two Decades of Antarctic Stream-Channel Change to Its Climate Drivers, from Terrain Data Alone</w:t>
+        <w:t>From Detection to Attribution: Linking Two Decades of Geomorphic Change in the McMurdo Dry Valleys to Its Climate Drivers, from Terrain Data Alone</w:t>
       </w:r>
     </w:p>
     <w:p>
@@ -274,7 +274,7 @@
           <w:b w:val="0"/>
           <w:i w:val="0"/>
         </w:rPr>
-        <w:t xml:space="preserve"> a U-Net delineates stream boundaries from DEM derivatives alone (elevation, slope, aspect most informative; no water/color signal), so it works in channels that are dry 11 months a year. 2. </w:t>
+        <w:t xml:space="preserve"> a U-Net [5] delineates stream boundaries from DEM derivatives alone (elevation, slope, aspect most informative; no water/color signal), so it works in channels that are dry 11 months a year [2]. 2. </w:t>
       </w:r>
       <w:r>
         <w:rPr>
@@ -290,7 +290,7 @@
           <w:b w:val="0"/>
           <w:i w:val="0"/>
         </w:rPr>
-        <w:t xml:space="preserve"> free REMA satellite DEMs are proven accurate enough for centimeter-to-meter stream-corridor change detection, using </w:t>
+        <w:t xml:space="preserve"> free REMA satellite DEMs [4] are proven accurate enough for centimeter-to-meter stream-corridor change detection, using </w:t>
       </w:r>
       <w:r>
         <w:rPr>
@@ -322,7 +322,7 @@
           <w:b w:val="0"/>
           <w:i w:val="0"/>
         </w:rPr>
-        <w:t xml:space="preserve"> (normalized median absolute deviation — a standard deviation that ignores outliers) for honest error bars; the errors follow a </w:t>
+        <w:t xml:space="preserve"> (normalized median absolute deviation — a standard deviation that ignores outliers) for honest error bars [3]; the errors follow a </w:t>
       </w:r>
       <w:r>
         <w:rPr>
@@ -1068,7 +1068,7 @@
           <w:b w:val="0"/>
           <w:i w:val="0"/>
         </w:rPr>
-        <w:t xml:space="preserve"> Three elevation snapshots form the backbone: 2001 airborne lidar (NASA ATM, 2 m), 2014 airborne lidar (NCALM, 1 m), and the REMA satellite DEM (2 m, 2021–23). From each snapshot the pipeline derives the terrain layers the detector reads: elevation, slope, aspect, curvature, flow accumulation (a "where water would go" map), and lidar intensity. Driver data come from the MDV-LTER station network — meteorology, 21 stream-discharge gauges, mass balance for 7 glaciers, and soil temperature/moisture (a proxy for summer thaw depth) — with the ERA5 and AMPS weather models filling the gaps between stations. Training labels: the public MCM-LTER stream centerlines, standing in for Barlow's access-gated 217 hand-digitized tiles (§6 risk).</w:t>
+        <w:t xml:space="preserve"> Three elevation snapshots form the backbone: 2001 airborne lidar (NASA ATM, 2 m), 2014 airborne lidar (NCALM, 1 m), and the REMA satellite DEM (2 m, 2021–23). From each snapshot the pipeline derives the terrain layers the detector reads: elevation, slope, aspect, curvature, flow accumulation (a "where water would go" map), and lidar intensity. Driver data come from the MDV-LTER station network [6] — meteorology, 21 stream-discharge gauges, mass balance for 7 glaciers, and soil temperature/moisture (a proxy for summer thaw depth) — with the ERA5 [7] and AMPS weather models filling the gaps between stations. Training labels: the public MCM-LTER stream centerlines, standing in for Barlow's access-gated 217 hand-digitized tiles (§6 risk).</w:t>
       </w:r>
     </w:p>
     <w:p>
@@ -3092,7 +3092,7 @@
           <w:b w:val="0"/>
           <w:i w:val="0"/>
         </w:rPr>
-        <w:t xml:space="preserve"> All input data are free/public (NASA ATM, NCALM/OpenTopography, PGC REMA, MCM-LTER/EDI, Copernicus ERA5, AMPS/GDEX), cited per source. Derived products, change-detection rasters, per-stream rate tables, process-classified change maps, calibrated-uncertainty layers, and stream-boundary polygons, will be released open-access (DoIs via Zenodo / EDI) with the processing code (PDAL/WhiteboxTools/GDAL + Python). Heavy regenerable rasters are excluded from version control; lightweight scripts, figures, and tables are tracked. Outputs follow ASPRS/OGC standards and carry explicit CRS, method, and uncertainty metadata (per NASA open-science/trustworthy-EO guidance).</w:t>
+        <w:t xml:space="preserve"> All input data are free/public (NASA ATM, NCALM/OpenTopography, PGC REMA, MCM-LTER/EDI, Copernicus ERA5, AMPS/GDEX), cited per source. Derived products — change-detection rasters, per-stream rate tables, process-classified change maps, calibrated-uncertainty layers, and stream-boundary polygons — will be released open-access (DOIs via Zenodo / EDI) with the processing code (PDAL/WhiteboxTools/GDAL + Python). Heavy regenerable rasters are excluded from version control; lightweight scripts, figures, and tables are tracked. Outputs follow ASPRS/OGC standards and carry explicit CRS, method, and uncertainty metadata (per NASA open-science/trustworthy-EO guidance).</w:t>
       </w:r>
     </w:p>
     <w:p>
@@ -3387,7 +3387,7 @@
         <w:color w:val="666666"/>
         <w:sz w:val="16"/>
       </w:rPr>
-      <w:t>From Detection to Attribution: Linking Two Decades of Antarctic Stream-Channel Change to Its Climate Drivers, from Terrain Data Alone</w:t>
+      <w:t>From Detection to Attribution: Linking Two Decades of Geomorphic Change in the McMurdo Dry Valleys to Its Climate Drivers, from Terrain Data Alone</w:t>
       <w:tab/>
       <w:tab/>
     </w:r>

</xml_diff>